<commit_message>
modified pages and added one new file
</commit_message>
<xml_diff>
--- a/PBL synopsis/Useful prompts.docx
+++ b/PBL synopsis/Useful prompts.docx
@@ -4047,12 +4047,21 @@
           <w:lang w:val="en-US"/>
         </w:rPr>
         <w:br/>
+      </w:r>
+      <w:r>
+        <w:rPr>
+          <w:b/>
+          <w:sz w:val="28"/>
+          <w:szCs w:val="32"/>
+          <w:lang w:val="en-US"/>
+        </w:rPr>
         <w:t>Prompt 19 [Modifying design of a page</w:t>
       </w:r>
       <w:proofErr w:type="gramStart"/>
       <w:r>
         <w:rPr>
-          <w:sz w:val="24"/>
+          <w:b/>
+          <w:sz w:val="28"/>
           <w:szCs w:val="32"/>
           <w:lang w:val="en-US"/>
         </w:rPr>
@@ -4067,7 +4076,6 @@
         </w:rPr>
         <w:br/>
       </w:r>
-      <w:bookmarkStart w:id="0" w:name="_GoBack"/>
       <w:r>
         <w:rPr>
           <w:sz w:val="24"/>
@@ -4309,37 +4317,39 @@
           <w:sz w:val="24"/>
           <w:szCs w:val="32"/>
         </w:rPr>
-        <w:t>art 2) - Clean Refined Structure, screen</w:t>
-      </w:r>
-      <w:r>
-        <w:rPr>
-          <w:sz w:val="24"/>
-          <w:szCs w:val="32"/>
-        </w:rPr>
-        <w:t xml:space="preserve"> id:</w:t>
+        <w:t>art 2) - Clean Refined Structure, screen id:</w:t>
       </w:r>
       <w:r>
         <w:t xml:space="preserve"> </w:t>
       </w:r>
+      <w:proofErr w:type="gramStart"/>
       <w:r>
         <w:rPr>
           <w:sz w:val="24"/>
         </w:rPr>
         <w:t>282b38b6f9ff4962ab9b9d89ae1154c4</w:t>
       </w:r>
-      <w:r>
-        <w:rPr>
-          <w:sz w:val="24"/>
-        </w:rPr>
-        <w:br/>
-      </w:r>
-      <w:r>
-        <w:rPr>
-          <w:sz w:val="24"/>
-        </w:rPr>
-        <w:br/>
-      </w:r>
-      <w:bookmarkEnd w:id="0"/>
+      <w:proofErr w:type="gramEnd"/>
+      <w:r>
+        <w:rPr>
+          <w:sz w:val="24"/>
+        </w:rPr>
+        <w:br/>
+      </w:r>
+      <w:r>
+        <w:rPr>
+          <w:sz w:val="24"/>
+        </w:rPr>
+        <w:br/>
+      </w:r>
+      <w:r>
+        <w:rPr>
+          <w:sz w:val="24"/>
+          <w:szCs w:val="32"/>
+          <w:lang w:val="en-US"/>
+        </w:rPr>
+        <w:t>{Include image of the screen}</w:t>
+      </w:r>
     </w:p>
     <w:p>
       <w:pPr>
@@ -4354,7 +4364,7 @@
       <w:pPr>
         <w:rPr>
           <w:b/>
-          <w:sz w:val="24"/>
+          <w:sz w:val="28"/>
           <w:szCs w:val="32"/>
           <w:lang w:val="en-US"/>
         </w:rPr>
@@ -4362,6 +4372,985 @@
       <w:r>
         <w:rPr>
           <w:b/>
+          <w:sz w:val="28"/>
+          <w:szCs w:val="32"/>
+          <w:lang w:val="en-US"/>
+        </w:rPr>
+        <w:t>Prompt 19 [Manipulate changes in specific part of code]</w:t>
+      </w:r>
+    </w:p>
+    <w:p>
+      <w:pPr>
+        <w:rPr>
+          <w:sz w:val="24"/>
+          <w:szCs w:val="32"/>
+          <w:lang w:val="en-US"/>
+        </w:rPr>
+      </w:pPr>
+      <w:r>
+        <w:rPr>
+          <w:sz w:val="24"/>
+          <w:szCs w:val="32"/>
+          <w:lang w:val="en-US"/>
+        </w:rPr>
+        <w:t xml:space="preserve">There are still many problems in file </w:t>
+      </w:r>
+      <w:proofErr w:type="spellStart"/>
+      <w:r>
+        <w:rPr>
+          <w:sz w:val="24"/>
+          <w:szCs w:val="32"/>
+          <w:lang w:val="en-US"/>
+        </w:rPr>
+        <w:t>RegistrationFlow.jsx</w:t>
+      </w:r>
+      <w:proofErr w:type="spellEnd"/>
+      <w:r>
+        <w:rPr>
+          <w:sz w:val="24"/>
+          <w:szCs w:val="32"/>
+          <w:lang w:val="en-US"/>
+        </w:rPr>
+        <w:t>. It lacks in certain functionality and design flaws. I have listed down problems and some recommended changes. Do it accurately without affecting any other elements.</w:t>
+      </w:r>
+    </w:p>
+    <w:p>
+      <w:pPr>
+        <w:rPr>
+          <w:sz w:val="24"/>
+          <w:szCs w:val="32"/>
+          <w:lang w:val="en-US"/>
+        </w:rPr>
+      </w:pPr>
+    </w:p>
+    <w:p>
+      <w:pPr>
+        <w:rPr>
+          <w:sz w:val="24"/>
+          <w:szCs w:val="32"/>
+          <w:lang w:val="en-US"/>
+        </w:rPr>
+      </w:pPr>
+      <w:r>
+        <w:rPr>
+          <w:sz w:val="24"/>
+          <w:szCs w:val="32"/>
+          <w:lang w:val="en-US"/>
+        </w:rPr>
+        <w:t>Problem 1: Resume parsing is not accurate. It seems like it isn’t working properly. Resume parsing must be able to fill even city, state and pin code alo</w:t>
+      </w:r>
+      <w:r>
+        <w:rPr>
+          <w:sz w:val="24"/>
+          <w:szCs w:val="32"/>
+          <w:lang w:val="en-US"/>
+        </w:rPr>
+        <w:t>ng with other fields correctly.</w:t>
+      </w:r>
+    </w:p>
+    <w:p>
+      <w:pPr>
+        <w:rPr>
+          <w:sz w:val="24"/>
+          <w:szCs w:val="32"/>
+          <w:lang w:val="en-US"/>
+        </w:rPr>
+      </w:pPr>
+      <w:r>
+        <w:rPr>
+          <w:sz w:val="24"/>
+          <w:szCs w:val="32"/>
+          <w:lang w:val="en-US"/>
+        </w:rPr>
+        <w:t>I uploaded a document to parse. This is the i</w:t>
+      </w:r>
+      <w:r>
+        <w:rPr>
+          <w:sz w:val="24"/>
+          <w:szCs w:val="32"/>
+          <w:lang w:val="en-US"/>
+        </w:rPr>
+        <w:t>mage of the document’s content:</w:t>
+      </w:r>
+    </w:p>
+    <w:p>
+      <w:pPr>
+        <w:rPr>
+          <w:sz w:val="24"/>
+          <w:szCs w:val="32"/>
+          <w:lang w:val="en-US"/>
+        </w:rPr>
+      </w:pPr>
+      <w:r>
+        <w:rPr>
+          <w:sz w:val="24"/>
+          <w:szCs w:val="32"/>
+          <w:lang w:val="en-US"/>
+        </w:rPr>
+        <w:t>After parsing, it wrongly fills address, city, s</w:t>
+      </w:r>
+      <w:r>
+        <w:rPr>
+          <w:sz w:val="24"/>
+          <w:szCs w:val="32"/>
+          <w:lang w:val="en-US"/>
+        </w:rPr>
+        <w:t>tate and pin code. It parsed as</w:t>
+      </w:r>
+    </w:p>
+    <w:p>
+      <w:pPr>
+        <w:rPr>
+          <w:sz w:val="24"/>
+          <w:szCs w:val="32"/>
+          <w:lang w:val="en-US"/>
+        </w:rPr>
+      </w:pPr>
+      <w:r>
+        <w:rPr>
+          <w:sz w:val="24"/>
+          <w:szCs w:val="32"/>
+          <w:lang w:val="en-US"/>
+        </w:rPr>
+        <w:t>Address: Extracted Address St</w:t>
+      </w:r>
+    </w:p>
+    <w:p>
+      <w:pPr>
+        <w:rPr>
+          <w:sz w:val="24"/>
+          <w:szCs w:val="32"/>
+          <w:lang w:val="en-US"/>
+        </w:rPr>
+      </w:pPr>
+      <w:r>
+        <w:rPr>
+          <w:sz w:val="24"/>
+          <w:szCs w:val="32"/>
+          <w:lang w:val="en-US"/>
+        </w:rPr>
+        <w:t>City: Mumbai</w:t>
+      </w:r>
+    </w:p>
+    <w:p>
+      <w:pPr>
+        <w:rPr>
+          <w:sz w:val="24"/>
+          <w:szCs w:val="32"/>
+          <w:lang w:val="en-US"/>
+        </w:rPr>
+      </w:pPr>
+      <w:r>
+        <w:rPr>
+          <w:sz w:val="24"/>
+          <w:szCs w:val="32"/>
+          <w:lang w:val="en-US"/>
+        </w:rPr>
+        <w:t>State: Maharashtra</w:t>
+      </w:r>
+    </w:p>
+    <w:p>
+      <w:pPr>
+        <w:rPr>
+          <w:sz w:val="24"/>
+          <w:szCs w:val="32"/>
+          <w:lang w:val="en-US"/>
+        </w:rPr>
+      </w:pPr>
+      <w:proofErr w:type="spellStart"/>
+      <w:r>
+        <w:rPr>
+          <w:sz w:val="24"/>
+          <w:szCs w:val="32"/>
+          <w:lang w:val="en-US"/>
+        </w:rPr>
+        <w:t>Pincode</w:t>
+      </w:r>
+      <w:proofErr w:type="spellEnd"/>
+      <w:r>
+        <w:rPr>
+          <w:sz w:val="24"/>
+          <w:szCs w:val="32"/>
+          <w:lang w:val="en-US"/>
+        </w:rPr>
+        <w:t>: 40001</w:t>
+      </w:r>
+    </w:p>
+    <w:p>
+      <w:pPr>
+        <w:rPr>
+          <w:sz w:val="24"/>
+          <w:szCs w:val="32"/>
+          <w:lang w:val="en-US"/>
+        </w:rPr>
+      </w:pPr>
+    </w:p>
+    <w:p>
+      <w:pPr>
+        <w:rPr>
+          <w:sz w:val="24"/>
+          <w:szCs w:val="32"/>
+          <w:lang w:val="en-US"/>
+        </w:rPr>
+      </w:pPr>
+      <w:r>
+        <w:rPr>
+          <w:sz w:val="24"/>
+          <w:szCs w:val="32"/>
+          <w:lang w:val="en-US"/>
+        </w:rPr>
+        <w:t>This is wrong as there is nothing like this mentioned in the document.</w:t>
+      </w:r>
+    </w:p>
+    <w:p>
+      <w:pPr>
+        <w:rPr>
+          <w:sz w:val="24"/>
+          <w:szCs w:val="32"/>
+          <w:lang w:val="en-US"/>
+        </w:rPr>
+      </w:pPr>
+    </w:p>
+    <w:p>
+      <w:pPr>
+        <w:rPr>
+          <w:sz w:val="24"/>
+          <w:szCs w:val="32"/>
+          <w:lang w:val="en-US"/>
+        </w:rPr>
+      </w:pPr>
+      <w:r>
+        <w:rPr>
+          <w:sz w:val="24"/>
+          <w:szCs w:val="32"/>
+          <w:lang w:val="en-US"/>
+        </w:rPr>
+        <w:t>Correct parsing is:</w:t>
+      </w:r>
+    </w:p>
+    <w:p>
+      <w:pPr>
+        <w:rPr>
+          <w:sz w:val="24"/>
+          <w:szCs w:val="32"/>
+          <w:lang w:val="en-US"/>
+        </w:rPr>
+      </w:pPr>
+      <w:r>
+        <w:rPr>
+          <w:sz w:val="24"/>
+          <w:szCs w:val="32"/>
+          <w:lang w:val="en-US"/>
+        </w:rPr>
+        <w:t xml:space="preserve">Address, city, state and </w:t>
+      </w:r>
+      <w:proofErr w:type="spellStart"/>
+      <w:r>
+        <w:rPr>
+          <w:sz w:val="24"/>
+          <w:szCs w:val="32"/>
+          <w:lang w:val="en-US"/>
+        </w:rPr>
+        <w:t>pincode</w:t>
+      </w:r>
+      <w:proofErr w:type="spellEnd"/>
+      <w:r>
+        <w:rPr>
+          <w:sz w:val="24"/>
+          <w:szCs w:val="32"/>
+          <w:lang w:val="en-US"/>
+        </w:rPr>
+        <w:t xml:space="preserve"> is not provided in the document. So it must be filled manually. So</w:t>
+      </w:r>
+      <w:r>
+        <w:rPr>
+          <w:sz w:val="24"/>
+          <w:szCs w:val="32"/>
+          <w:lang w:val="en-US"/>
+        </w:rPr>
+        <w:t xml:space="preserve"> it should be blank by default.</w:t>
+      </w:r>
+    </w:p>
+    <w:p>
+      <w:pPr>
+        <w:rPr>
+          <w:sz w:val="24"/>
+          <w:szCs w:val="32"/>
+          <w:lang w:val="en-US"/>
+        </w:rPr>
+      </w:pPr>
+    </w:p>
+    <w:p>
+      <w:pPr>
+        <w:rPr>
+          <w:sz w:val="24"/>
+          <w:szCs w:val="32"/>
+          <w:lang w:val="en-US"/>
+        </w:rPr>
+      </w:pPr>
+      <w:r>
+        <w:rPr>
+          <w:sz w:val="24"/>
+          <w:szCs w:val="32"/>
+          <w:lang w:val="en-US"/>
+        </w:rPr>
+        <w:t xml:space="preserve">Code part for reference: </w:t>
+      </w:r>
+    </w:p>
+    <w:p>
+      <w:pPr>
+        <w:rPr>
+          <w:sz w:val="24"/>
+          <w:szCs w:val="32"/>
+          <w:lang w:val="en-US"/>
+        </w:rPr>
+      </w:pPr>
+      <w:r>
+        <w:rPr>
+          <w:sz w:val="24"/>
+          <w:szCs w:val="32"/>
+          <w:lang w:val="en-US"/>
+        </w:rPr>
+        <w:t>{</w:t>
+      </w:r>
+      <w:proofErr w:type="gramStart"/>
+      <w:r>
+        <w:rPr>
+          <w:sz w:val="24"/>
+          <w:szCs w:val="32"/>
+          <w:lang w:val="en-US"/>
+        </w:rPr>
+        <w:t>step</w:t>
+      </w:r>
+      <w:proofErr w:type="gramEnd"/>
+      <w:r>
+        <w:rPr>
+          <w:sz w:val="24"/>
+          <w:szCs w:val="32"/>
+          <w:lang w:val="en-US"/>
+        </w:rPr>
+        <w:t xml:space="preserve"> === 1 &amp;&amp; (</w:t>
+      </w:r>
+    </w:p>
+    <w:p>
+      <w:pPr>
+        <w:rPr>
+          <w:sz w:val="24"/>
+          <w:szCs w:val="32"/>
+          <w:lang w:val="en-US"/>
+        </w:rPr>
+      </w:pPr>
+      <w:r>
+        <w:rPr>
+          <w:sz w:val="24"/>
+          <w:szCs w:val="32"/>
+          <w:lang w:val="en-US"/>
+        </w:rPr>
+        <w:t xml:space="preserve">        &lt;main </w:t>
+      </w:r>
+      <w:proofErr w:type="spellStart"/>
+      <w:r>
+        <w:rPr>
+          <w:sz w:val="24"/>
+          <w:szCs w:val="32"/>
+          <w:lang w:val="en-US"/>
+        </w:rPr>
+        <w:t>className</w:t>
+      </w:r>
+      <w:proofErr w:type="spellEnd"/>
+      <w:r>
+        <w:rPr>
+          <w:sz w:val="24"/>
+          <w:szCs w:val="32"/>
+          <w:lang w:val="en-US"/>
+        </w:rPr>
+        <w:t>="flex-grow mx-auto px-6 py-12 w-full max-w-7xl pt-16"&gt;</w:t>
+      </w:r>
+    </w:p>
+    <w:p>
+      <w:pPr>
+        <w:rPr>
+          <w:sz w:val="24"/>
+          <w:szCs w:val="32"/>
+          <w:lang w:val="en-US"/>
+        </w:rPr>
+      </w:pPr>
+      <w:r>
+        <w:rPr>
+          <w:sz w:val="24"/>
+          <w:szCs w:val="32"/>
+          <w:lang w:val="en-US"/>
+        </w:rPr>
+        <w:t xml:space="preserve">   ………………………………………</w:t>
+      </w:r>
+    </w:p>
+    <w:p>
+      <w:pPr>
+        <w:rPr>
+          <w:sz w:val="24"/>
+          <w:szCs w:val="32"/>
+          <w:lang w:val="en-US"/>
+        </w:rPr>
+      </w:pPr>
+      <w:r>
+        <w:rPr>
+          <w:sz w:val="24"/>
+          <w:szCs w:val="32"/>
+          <w:lang w:val="en-US"/>
+        </w:rPr>
+        <w:lastRenderedPageBreak/>
+        <w:t xml:space="preserve">       {/* Form Container */}</w:t>
+      </w:r>
+    </w:p>
+    <w:p>
+      <w:pPr>
+        <w:rPr>
+          <w:sz w:val="24"/>
+          <w:szCs w:val="32"/>
+          <w:lang w:val="en-US"/>
+        </w:rPr>
+      </w:pPr>
+      <w:r>
+        <w:rPr>
+          <w:sz w:val="24"/>
+          <w:szCs w:val="32"/>
+          <w:lang w:val="en-US"/>
+        </w:rPr>
+        <w:t xml:space="preserve">            &lt;div </w:t>
+      </w:r>
+      <w:proofErr w:type="spellStart"/>
+      <w:r>
+        <w:rPr>
+          <w:sz w:val="24"/>
+          <w:szCs w:val="32"/>
+          <w:lang w:val="en-US"/>
+        </w:rPr>
+        <w:t>className</w:t>
+      </w:r>
+      <w:proofErr w:type="spellEnd"/>
+      <w:r>
+        <w:rPr>
+          <w:sz w:val="24"/>
+          <w:szCs w:val="32"/>
+          <w:lang w:val="en-US"/>
+        </w:rPr>
+        <w:t>="</w:t>
+      </w:r>
+      <w:proofErr w:type="spellStart"/>
+      <w:r>
+        <w:rPr>
+          <w:sz w:val="24"/>
+          <w:szCs w:val="32"/>
+          <w:lang w:val="en-US"/>
+        </w:rPr>
+        <w:t>bg</w:t>
+      </w:r>
+      <w:proofErr w:type="spellEnd"/>
+      <w:r>
+        <w:rPr>
+          <w:sz w:val="24"/>
+          <w:szCs w:val="32"/>
+          <w:lang w:val="en-US"/>
+        </w:rPr>
+        <w:t>-white border border-[#e2e2e2] p-8 shadow-</w:t>
+      </w:r>
+      <w:proofErr w:type="spellStart"/>
+      <w:r>
+        <w:rPr>
+          <w:sz w:val="24"/>
+          <w:szCs w:val="32"/>
+          <w:lang w:val="en-US"/>
+        </w:rPr>
+        <w:t>sm</w:t>
+      </w:r>
+      <w:proofErr w:type="spellEnd"/>
+      <w:r>
+        <w:rPr>
+          <w:sz w:val="24"/>
+          <w:szCs w:val="32"/>
+          <w:lang w:val="en-US"/>
+        </w:rPr>
+        <w:t>"&gt;</w:t>
+      </w:r>
+    </w:p>
+    <w:p>
+      <w:pPr>
+        <w:rPr>
+          <w:sz w:val="24"/>
+          <w:szCs w:val="32"/>
+          <w:lang w:val="en-US"/>
+        </w:rPr>
+      </w:pPr>
+      <w:r>
+        <w:rPr>
+          <w:sz w:val="24"/>
+          <w:szCs w:val="32"/>
+          <w:lang w:val="en-US"/>
+        </w:rPr>
+        <w:t xml:space="preserve">              &lt;form </w:t>
+      </w:r>
+      <w:proofErr w:type="spellStart"/>
+      <w:r>
+        <w:rPr>
+          <w:sz w:val="24"/>
+          <w:szCs w:val="32"/>
+          <w:lang w:val="en-US"/>
+        </w:rPr>
+        <w:t>onSubmit</w:t>
+      </w:r>
+      <w:proofErr w:type="spellEnd"/>
+      <w:proofErr w:type="gramStart"/>
+      <w:r>
+        <w:rPr>
+          <w:sz w:val="24"/>
+          <w:szCs w:val="32"/>
+          <w:lang w:val="en-US"/>
+        </w:rPr>
+        <w:t>={</w:t>
+      </w:r>
+      <w:proofErr w:type="gramEnd"/>
+      <w:r>
+        <w:rPr>
+          <w:sz w:val="24"/>
+          <w:szCs w:val="32"/>
+          <w:lang w:val="en-US"/>
+        </w:rPr>
+        <w:t>handleNextStep2}&gt;</w:t>
+      </w:r>
+    </w:p>
+    <w:p>
+      <w:pPr>
+        <w:rPr>
+          <w:sz w:val="24"/>
+          <w:szCs w:val="32"/>
+          <w:lang w:val="en-US"/>
+        </w:rPr>
+      </w:pPr>
+      <w:r>
+        <w:rPr>
+          <w:sz w:val="24"/>
+          <w:szCs w:val="32"/>
+          <w:lang w:val="en-US"/>
+        </w:rPr>
+        <w:t xml:space="preserve">                ……………………………….</w:t>
+      </w:r>
+    </w:p>
+    <w:p>
+      <w:pPr>
+        <w:rPr>
+          <w:sz w:val="24"/>
+          <w:szCs w:val="32"/>
+          <w:lang w:val="en-US"/>
+        </w:rPr>
+      </w:pPr>
+      <w:r>
+        <w:rPr>
+          <w:sz w:val="24"/>
+          <w:szCs w:val="32"/>
+          <w:lang w:val="en-US"/>
+        </w:rPr>
+        <w:t xml:space="preserve">              &lt;/form&gt;</w:t>
+      </w:r>
+    </w:p>
+    <w:p>
+      <w:pPr>
+        <w:rPr>
+          <w:sz w:val="24"/>
+          <w:szCs w:val="32"/>
+          <w:lang w:val="en-US"/>
+        </w:rPr>
+      </w:pPr>
+      <w:r>
+        <w:rPr>
+          <w:sz w:val="24"/>
+          <w:szCs w:val="32"/>
+          <w:lang w:val="en-US"/>
+        </w:rPr>
+        <w:t xml:space="preserve">            &lt;/div&gt;</w:t>
+      </w:r>
+    </w:p>
+    <w:p>
+      <w:pPr>
+        <w:rPr>
+          <w:sz w:val="24"/>
+          <w:szCs w:val="32"/>
+          <w:lang w:val="en-US"/>
+        </w:rPr>
+      </w:pPr>
+      <w:r>
+        <w:rPr>
+          <w:sz w:val="24"/>
+          <w:szCs w:val="32"/>
+          <w:lang w:val="en-US"/>
+        </w:rPr>
+        <w:t xml:space="preserve">        &lt;/main&gt;</w:t>
+      </w:r>
+    </w:p>
+    <w:p>
+      <w:pPr>
+        <w:rPr>
+          <w:sz w:val="24"/>
+          <w:szCs w:val="32"/>
+          <w:lang w:val="en-US"/>
+        </w:rPr>
+      </w:pPr>
+      <w:r>
+        <w:rPr>
+          <w:sz w:val="24"/>
+          <w:szCs w:val="32"/>
+          <w:lang w:val="en-US"/>
+        </w:rPr>
+        <w:t xml:space="preserve">      )}</w:t>
+      </w:r>
+    </w:p>
+    <w:p>
+      <w:pPr>
+        <w:rPr>
+          <w:sz w:val="24"/>
+          <w:szCs w:val="32"/>
+          <w:lang w:val="en-US"/>
+        </w:rPr>
+      </w:pPr>
+    </w:p>
+    <w:p>
+      <w:pPr>
+        <w:rPr>
+          <w:sz w:val="24"/>
+          <w:szCs w:val="32"/>
+          <w:lang w:val="en-US"/>
+        </w:rPr>
+      </w:pPr>
+    </w:p>
+    <w:p>
+      <w:pPr>
+        <w:rPr>
+          <w:sz w:val="24"/>
+          <w:szCs w:val="32"/>
+          <w:lang w:val="en-US"/>
+        </w:rPr>
+      </w:pPr>
+      <w:r>
+        <w:rPr>
+          <w:sz w:val="24"/>
+          <w:szCs w:val="32"/>
+          <w:lang w:val="en-US"/>
+        </w:rPr>
+        <w:t>Problem 2: The text styling for heading and sub text doesn’t match for personal information and Education and Internship form heading.</w:t>
+      </w:r>
+    </w:p>
+    <w:p>
+      <w:pPr>
+        <w:rPr>
+          <w:sz w:val="24"/>
+          <w:szCs w:val="32"/>
+          <w:lang w:val="en-US"/>
+        </w:rPr>
+      </w:pPr>
+    </w:p>
+    <w:p>
+      <w:pPr>
+        <w:rPr>
+          <w:sz w:val="24"/>
+          <w:szCs w:val="32"/>
+          <w:lang w:val="en-US"/>
+        </w:rPr>
+      </w:pPr>
+      <w:r>
+        <w:rPr>
+          <w:sz w:val="24"/>
+          <w:szCs w:val="32"/>
+          <w:lang w:val="en-US"/>
+        </w:rPr>
+        <w:t>I want the code part 2 to apply the same styles and color of text as code part 1.</w:t>
+      </w:r>
+    </w:p>
+    <w:p>
+      <w:pPr>
+        <w:rPr>
+          <w:sz w:val="24"/>
+          <w:szCs w:val="32"/>
+          <w:lang w:val="en-US"/>
+        </w:rPr>
+      </w:pPr>
+    </w:p>
+    <w:p>
+      <w:pPr>
+        <w:rPr>
+          <w:sz w:val="24"/>
+          <w:szCs w:val="32"/>
+          <w:lang w:val="en-US"/>
+        </w:rPr>
+      </w:pPr>
+      <w:r>
+        <w:rPr>
+          <w:sz w:val="24"/>
+          <w:szCs w:val="32"/>
+          <w:lang w:val="en-US"/>
+        </w:rPr>
+        <w:t>Code part 1:</w:t>
+      </w:r>
+    </w:p>
+    <w:p>
+      <w:pPr>
+        <w:rPr>
+          <w:sz w:val="24"/>
+          <w:szCs w:val="32"/>
+          <w:lang w:val="en-US"/>
+        </w:rPr>
+      </w:pPr>
+      <w:r>
+        <w:rPr>
+          <w:sz w:val="24"/>
+          <w:szCs w:val="32"/>
+          <w:lang w:val="en-US"/>
+        </w:rPr>
+        <w:t>&lt;div class="mb-12 flex flex-col items-center text-center"&gt;&lt;p class="text-</w:t>
+      </w:r>
+      <w:proofErr w:type="spellStart"/>
+      <w:r>
+        <w:rPr>
+          <w:sz w:val="24"/>
+          <w:szCs w:val="32"/>
+          <w:lang w:val="en-US"/>
+        </w:rPr>
+        <w:t>xs</w:t>
+      </w:r>
+      <w:proofErr w:type="spellEnd"/>
+      <w:r>
+        <w:rPr>
+          <w:sz w:val="24"/>
+          <w:szCs w:val="32"/>
+          <w:lang w:val="en-US"/>
+        </w:rPr>
+        <w:t xml:space="preserve"> font-mono font-bold tracking-widest text-[#0052FF] uppercase mb-4"&gt;STEP 01&lt;/p&gt;&lt;h1 class="text-4xl font-bold text-gray-900 mb-8"&gt;Personal Information&lt;/h1&gt;&lt;div class="flex gap-2 w-full justify-center"&gt;&lt;div class="h-1 w-24 </w:t>
+      </w:r>
+      <w:proofErr w:type="spellStart"/>
+      <w:r>
+        <w:rPr>
+          <w:sz w:val="24"/>
+          <w:szCs w:val="32"/>
+          <w:lang w:val="en-US"/>
+        </w:rPr>
+        <w:t>bg</w:t>
+      </w:r>
+      <w:proofErr w:type="spellEnd"/>
+      <w:r>
+        <w:rPr>
+          <w:sz w:val="24"/>
+          <w:szCs w:val="32"/>
+          <w:lang w:val="en-US"/>
+        </w:rPr>
+        <w:t xml:space="preserve">-[#e2e2e2] rounded-full overflow-hidden"&gt;&lt;div class="h-full w-full </w:t>
+      </w:r>
+      <w:proofErr w:type="spellStart"/>
+      <w:r>
+        <w:rPr>
+          <w:sz w:val="24"/>
+          <w:szCs w:val="32"/>
+          <w:lang w:val="en-US"/>
+        </w:rPr>
+        <w:t>bg</w:t>
+      </w:r>
+      <w:proofErr w:type="spellEnd"/>
+      <w:r>
+        <w:rPr>
+          <w:sz w:val="24"/>
+          <w:szCs w:val="32"/>
+          <w:lang w:val="en-US"/>
+        </w:rPr>
+        <w:t xml:space="preserve">-[#0052ff]"&gt;&lt;/div&gt;&lt;/div&gt;&lt;div class="h-1 w-24 </w:t>
+      </w:r>
+      <w:proofErr w:type="spellStart"/>
+      <w:r>
+        <w:rPr>
+          <w:sz w:val="24"/>
+          <w:szCs w:val="32"/>
+          <w:lang w:val="en-US"/>
+        </w:rPr>
+        <w:t>bg</w:t>
+      </w:r>
+      <w:proofErr w:type="spellEnd"/>
+      <w:r>
+        <w:rPr>
+          <w:sz w:val="24"/>
+          <w:szCs w:val="32"/>
+          <w:lang w:val="en-US"/>
+        </w:rPr>
+        <w:t>-[#e2e2e2] rounded-full"&gt;&lt;/div&gt;&lt;/div&gt;&lt;/div&gt;</w:t>
+      </w:r>
+    </w:p>
+    <w:p>
+      <w:pPr>
+        <w:rPr>
+          <w:sz w:val="24"/>
+          <w:szCs w:val="32"/>
+          <w:lang w:val="en-US"/>
+        </w:rPr>
+      </w:pPr>
+    </w:p>
+    <w:p>
+      <w:pPr>
+        <w:rPr>
+          <w:sz w:val="24"/>
+          <w:szCs w:val="32"/>
+          <w:lang w:val="en-US"/>
+        </w:rPr>
+      </w:pPr>
+      <w:r>
+        <w:rPr>
+          <w:sz w:val="24"/>
+          <w:szCs w:val="32"/>
+          <w:lang w:val="en-US"/>
+        </w:rPr>
+        <w:t>Code part 2:</w:t>
+      </w:r>
+    </w:p>
+    <w:p>
+      <w:pPr>
+        <w:rPr>
+          <w:sz w:val="24"/>
+          <w:szCs w:val="32"/>
+          <w:lang w:val="en-US"/>
+        </w:rPr>
+      </w:pPr>
+      <w:r>
+        <w:rPr>
+          <w:sz w:val="24"/>
+          <w:szCs w:val="32"/>
+          <w:lang w:val="en-US"/>
+        </w:rPr>
+        <w:t xml:space="preserve">&lt;div class="text-center mb-12"&gt;&lt;span class="font-label-caps text-[#003ec7] mb-4 inline-block tracking-widest uppercase"&gt;STEP 02&lt;/span&gt;&lt;h1 class="font-sans text-[28px] </w:t>
+      </w:r>
+      <w:proofErr w:type="spellStart"/>
+      <w:r>
+        <w:rPr>
+          <w:sz w:val="24"/>
+          <w:szCs w:val="32"/>
+          <w:lang w:val="en-US"/>
+        </w:rPr>
+        <w:t>md:text</w:t>
+      </w:r>
+      <w:proofErr w:type="spellEnd"/>
+      <w:r>
+        <w:rPr>
+          <w:sz w:val="24"/>
+          <w:szCs w:val="32"/>
+          <w:lang w:val="en-US"/>
+        </w:rPr>
+        <w:t xml:space="preserve">-[32px] font-medium text-[#1a1c1c] tracking-tight leading-tight"&gt;Education &amp;amp; Internships&lt;/h1&gt;&lt;div class="flex justify-center gap-2 mt-8"&gt;&lt;div class="h-1 w-24 </w:t>
+      </w:r>
+      <w:proofErr w:type="spellStart"/>
+      <w:r>
+        <w:rPr>
+          <w:sz w:val="24"/>
+          <w:szCs w:val="32"/>
+          <w:lang w:val="en-US"/>
+        </w:rPr>
+        <w:t>bg</w:t>
+      </w:r>
+      <w:proofErr w:type="spellEnd"/>
+      <w:r>
+        <w:rPr>
+          <w:sz w:val="24"/>
+          <w:szCs w:val="32"/>
+          <w:lang w:val="en-US"/>
+        </w:rPr>
+        <w:t xml:space="preserve">-[#e2e2e2] rounded-full"&gt;&lt;/div&gt;&lt;div class="h-1 w-24 </w:t>
+      </w:r>
+      <w:proofErr w:type="spellStart"/>
+      <w:r>
+        <w:rPr>
+          <w:sz w:val="24"/>
+          <w:szCs w:val="32"/>
+          <w:lang w:val="en-US"/>
+        </w:rPr>
+        <w:t>bg</w:t>
+      </w:r>
+      <w:proofErr w:type="spellEnd"/>
+      <w:r>
+        <w:rPr>
+          <w:sz w:val="24"/>
+          <w:szCs w:val="32"/>
+          <w:lang w:val="en-US"/>
+        </w:rPr>
+        <w:t xml:space="preserve">-[#e2e2e2] rounded-full overflow-hidden"&gt;&lt;div class="h-full w-full </w:t>
+      </w:r>
+      <w:proofErr w:type="spellStart"/>
+      <w:r>
+        <w:rPr>
+          <w:sz w:val="24"/>
+          <w:szCs w:val="32"/>
+          <w:lang w:val="en-US"/>
+        </w:rPr>
+        <w:t>bg</w:t>
+      </w:r>
+      <w:proofErr w:type="spellEnd"/>
+      <w:r>
+        <w:rPr>
+          <w:sz w:val="24"/>
+          <w:szCs w:val="32"/>
+          <w:lang w:val="en-US"/>
+        </w:rPr>
+        <w:t>-[#003ec7]"&gt;&lt;/div&gt;&lt;/div&gt;&lt;/div&gt;&lt;/div&gt;</w:t>
+      </w:r>
+    </w:p>
+    <w:p>
+      <w:pPr>
+        <w:rPr>
+          <w:sz w:val="24"/>
+          <w:szCs w:val="32"/>
+          <w:lang w:val="en-US"/>
+        </w:rPr>
+      </w:pPr>
+    </w:p>
+    <w:p>
+      <w:pPr>
+        <w:rPr>
+          <w:sz w:val="24"/>
+          <w:szCs w:val="32"/>
+          <w:lang w:val="en-US"/>
+        </w:rPr>
+      </w:pPr>
+    </w:p>
+    <w:p>
+      <w:pPr>
+        <w:rPr>
+          <w:sz w:val="24"/>
+          <w:szCs w:val="32"/>
+          <w:lang w:val="en-US"/>
+        </w:rPr>
+      </w:pPr>
+    </w:p>
+    <w:p>
+      <w:pPr>
+        <w:rPr>
+          <w:sz w:val="24"/>
+          <w:szCs w:val="32"/>
+          <w:lang w:val="en-US"/>
+        </w:rPr>
+      </w:pPr>
+    </w:p>
+    <w:p>
+      <w:pPr>
+        <w:rPr>
+          <w:sz w:val="24"/>
+          <w:szCs w:val="32"/>
+          <w:lang w:val="en-US"/>
+        </w:rPr>
+      </w:pPr>
+    </w:p>
+    <w:p>
+      <w:pPr>
+        <w:rPr>
+          <w:b/>
+          <w:sz w:val="24"/>
+          <w:szCs w:val="32"/>
+          <w:lang w:val="en-US"/>
+        </w:rPr>
+      </w:pPr>
+      <w:r>
+        <w:rPr>
+          <w:b/>
           <w:sz w:val="24"/>
           <w:szCs w:val="32"/>
           <w:lang w:val="en-US"/>
@@ -5051,7 +6040,111 @@
           <w:szCs w:val="32"/>
           <w:lang w:val="en-US"/>
         </w:rPr>
+        <w:t>SkillBridge</w:t>
+      </w:r>
+      <w:proofErr w:type="spellEnd"/>
+      <w:r>
+        <w:rPr>
+          <w:sz w:val="24"/>
+          <w:szCs w:val="32"/>
+          <w:lang w:val="en-US"/>
+        </w:rPr>
+        <w:t xml:space="preserve"> - Assessment Setup (Validation States)</w:t>
+      </w:r>
+      <w:r>
+        <w:rPr>
+          <w:sz w:val="24"/>
+          <w:szCs w:val="32"/>
+          <w:lang w:val="en-US"/>
+        </w:rPr>
+        <w:t xml:space="preserve">, id: </w:t>
+      </w:r>
+      <w:r>
+        <w:rPr>
+          <w:sz w:val="24"/>
+          <w:szCs w:val="32"/>
+          <w:lang w:val="en-US"/>
+        </w:rPr>
+        <w:t>8e3ba3d18c4f4582ad5ba1e0760ca4a6</w:t>
+      </w:r>
+    </w:p>
+    <w:p>
+      <w:pPr>
+        <w:pStyle w:val="ListParagraph"/>
+        <w:rPr>
+          <w:sz w:val="24"/>
+          <w:szCs w:val="32"/>
+          <w:lang w:val="en-US"/>
+        </w:rPr>
+      </w:pPr>
+      <w:r>
+        <w:rPr>
+          <w:sz w:val="24"/>
+          <w:szCs w:val="32"/>
+          <w:lang w:val="en-US"/>
+        </w:rPr>
+        <w:br/>
+      </w:r>
+      <w:proofErr w:type="spellStart"/>
+      <w:r>
+        <w:rPr>
+          <w:sz w:val="24"/>
+          <w:szCs w:val="32"/>
+          <w:lang w:val="en-US"/>
+        </w:rPr>
+        <w:t>SkillBridge</w:t>
+      </w:r>
+      <w:proofErr w:type="spellEnd"/>
+      <w:r>
+        <w:rPr>
+          <w:sz w:val="24"/>
+          <w:szCs w:val="32"/>
+          <w:lang w:val="en-US"/>
+        </w:rPr>
+        <w:t xml:space="preserve"> - Assessment Setup (No Role Found)</w:t>
+      </w:r>
+      <w:r>
+        <w:rPr>
+          <w:sz w:val="24"/>
+          <w:szCs w:val="32"/>
+          <w:lang w:val="en-US"/>
+        </w:rPr>
+        <w:t xml:space="preserve">, id: </w:t>
+      </w:r>
+      <w:r>
+        <w:rPr>
+          <w:sz w:val="24"/>
+          <w:szCs w:val="32"/>
+          <w:lang w:val="en-US"/>
+        </w:rPr>
+        <w:t>4e7f2112b0924611a8a650437edf25f6</w:t>
+      </w:r>
+    </w:p>
+    <w:p>
+      <w:pPr>
+        <w:pStyle w:val="ListParagraph"/>
+        <w:rPr>
+          <w:sz w:val="24"/>
+          <w:szCs w:val="32"/>
+          <w:lang w:val="en-US"/>
+        </w:rPr>
+      </w:pPr>
+      <w:r>
+        <w:rPr>
+          <w:sz w:val="24"/>
+          <w:szCs w:val="32"/>
+          <w:lang w:val="en-US"/>
+        </w:rPr>
         <w:lastRenderedPageBreak/>
+        <w:br/>
+      </w:r>
+      <w:proofErr w:type="spellStart"/>
+      <w:r>
+        <w:rPr>
+          <w:sz w:val="24"/>
+          <w:szCs w:val="32"/>
+          <w:lang w:val="en-US"/>
+        </w:rPr>
         <w:t>SkillBridge</w:t>
       </w:r>
       <w:proofErr w:type="spellEnd"/>
@@ -5061,7 +6154,231 @@
           <w:szCs w:val="32"/>
           <w:lang w:val="en-US"/>
         </w:rPr>
-        <w:t xml:space="preserve"> - Assessment Setup (Validation States)</w:t>
+        <w:t xml:space="preserve"> - Assessment Loading (Typography Sync Refined)</w:t>
+      </w:r>
+      <w:r>
+        <w:rPr>
+          <w:sz w:val="24"/>
+          <w:szCs w:val="32"/>
+          <w:lang w:val="en-US"/>
+        </w:rPr>
+        <w:t>, id:</w:t>
+      </w:r>
+      <w:r>
+        <w:t xml:space="preserve"> </w:t>
+      </w:r>
+      <w:r>
+        <w:rPr>
+          <w:sz w:val="24"/>
+          <w:szCs w:val="32"/>
+          <w:lang w:val="en-US"/>
+        </w:rPr>
+        <w:t>a9cfef9f72f343529404d014d2355925</w:t>
+      </w:r>
+    </w:p>
+    <w:p>
+      <w:pPr>
+        <w:pStyle w:val="ListParagraph"/>
+        <w:rPr>
+          <w:sz w:val="24"/>
+          <w:szCs w:val="32"/>
+          <w:lang w:val="en-US"/>
+        </w:rPr>
+      </w:pPr>
+      <w:r>
+        <w:rPr>
+          <w:sz w:val="24"/>
+          <w:szCs w:val="32"/>
+          <w:lang w:val="en-US"/>
+        </w:rPr>
+        <w:br/>
+      </w:r>
+      <w:proofErr w:type="spellStart"/>
+      <w:r>
+        <w:rPr>
+          <w:sz w:val="24"/>
+          <w:szCs w:val="32"/>
+          <w:lang w:val="en-US"/>
+        </w:rPr>
+        <w:t>SkillBridge</w:t>
+      </w:r>
+      <w:proofErr w:type="spellEnd"/>
+      <w:r>
+        <w:rPr>
+          <w:sz w:val="24"/>
+          <w:szCs w:val="32"/>
+          <w:lang w:val="en-US"/>
+        </w:rPr>
+        <w:t xml:space="preserve"> - Assessment (Part 2) - Repositioned CTA</w:t>
+      </w:r>
+      <w:r>
+        <w:rPr>
+          <w:sz w:val="24"/>
+          <w:szCs w:val="32"/>
+          <w:lang w:val="en-US"/>
+        </w:rPr>
+        <w:t>, id:</w:t>
+      </w:r>
+      <w:r>
+        <w:t xml:space="preserve"> </w:t>
+      </w:r>
+      <w:r>
+        <w:rPr>
+          <w:sz w:val="24"/>
+          <w:szCs w:val="32"/>
+          <w:lang w:val="en-US"/>
+        </w:rPr>
+        <w:t>d0f9c15dad7648ae84f45a67c458ded0</w:t>
+      </w:r>
+    </w:p>
+    <w:p>
+      <w:pPr>
+        <w:pStyle w:val="ListParagraph"/>
+        <w:rPr>
+          <w:sz w:val="24"/>
+          <w:szCs w:val="32"/>
+          <w:lang w:val="en-US"/>
+        </w:rPr>
+      </w:pPr>
+    </w:p>
+    <w:p>
+      <w:pPr>
+        <w:pStyle w:val="ListParagraph"/>
+        <w:rPr>
+          <w:sz w:val="24"/>
+          <w:szCs w:val="32"/>
+          <w:lang w:val="en-US"/>
+        </w:rPr>
+      </w:pPr>
+      <w:proofErr w:type="spellStart"/>
+      <w:r>
+        <w:rPr>
+          <w:sz w:val="24"/>
+          <w:szCs w:val="32"/>
+          <w:lang w:val="en-US"/>
+        </w:rPr>
+        <w:t>SkillBridge</w:t>
+      </w:r>
+      <w:proofErr w:type="spellEnd"/>
+      <w:r>
+        <w:rPr>
+          <w:sz w:val="24"/>
+          <w:szCs w:val="32"/>
+          <w:lang w:val="en-US"/>
+        </w:rPr>
+        <w:t xml:space="preserve"> - Quiz Assessment</w:t>
+      </w:r>
+      <w:r>
+        <w:rPr>
+          <w:sz w:val="24"/>
+          <w:szCs w:val="32"/>
+          <w:lang w:val="en-US"/>
+        </w:rPr>
+        <w:t>, id:</w:t>
+      </w:r>
+      <w:r>
+        <w:t xml:space="preserve"> </w:t>
+      </w:r>
+      <w:r>
+        <w:rPr>
+          <w:sz w:val="24"/>
+          <w:szCs w:val="32"/>
+          <w:lang w:val="en-US"/>
+        </w:rPr>
+        <w:t>338dc0d531574e629bf814ec0caa8794</w:t>
+      </w:r>
+    </w:p>
+    <w:p>
+      <w:pPr>
+        <w:pStyle w:val="ListParagraph"/>
+        <w:rPr>
+          <w:sz w:val="24"/>
+          <w:szCs w:val="32"/>
+          <w:lang w:val="en-US"/>
+        </w:rPr>
+      </w:pPr>
+    </w:p>
+    <w:p>
+      <w:pPr>
+        <w:pStyle w:val="ListParagraph"/>
+        <w:rPr>
+          <w:sz w:val="24"/>
+          <w:szCs w:val="32"/>
+          <w:lang w:val="en-US"/>
+        </w:rPr>
+      </w:pPr>
+      <w:proofErr w:type="spellStart"/>
+      <w:r>
+        <w:rPr>
+          <w:sz w:val="24"/>
+          <w:szCs w:val="32"/>
+          <w:lang w:val="en-US"/>
+        </w:rPr>
+        <w:t>SkillBridge</w:t>
+      </w:r>
+      <w:proofErr w:type="spellEnd"/>
+      <w:r>
+        <w:rPr>
+          <w:sz w:val="24"/>
+          <w:szCs w:val="32"/>
+          <w:lang w:val="en-US"/>
+        </w:rPr>
+        <w:t xml:space="preserve"> - Active Quiz Assessment</w:t>
+      </w:r>
+      <w:r>
+        <w:rPr>
+          <w:sz w:val="24"/>
+          <w:szCs w:val="32"/>
+          <w:lang w:val="en-US"/>
+        </w:rPr>
+        <w:t>, id:</w:t>
+      </w:r>
+      <w:r>
+        <w:t xml:space="preserve"> </w:t>
+      </w:r>
+      <w:r>
+        <w:rPr>
+          <w:sz w:val="24"/>
+          <w:szCs w:val="32"/>
+          <w:lang w:val="en-US"/>
+        </w:rPr>
+        <w:t>0bb049a729b3448a84dab37bb7512375</w:t>
+      </w:r>
+    </w:p>
+    <w:p>
+      <w:pPr>
+        <w:pStyle w:val="ListParagraph"/>
+        <w:rPr>
+          <w:sz w:val="24"/>
+          <w:szCs w:val="32"/>
+          <w:lang w:val="en-US"/>
+        </w:rPr>
+      </w:pPr>
+      <w:r>
+        <w:rPr>
+          <w:sz w:val="24"/>
+          <w:szCs w:val="32"/>
+          <w:lang w:val="en-US"/>
+        </w:rPr>
+        <w:br/>
+      </w:r>
+      <w:proofErr w:type="spellStart"/>
+      <w:r>
+        <w:rPr>
+          <w:sz w:val="24"/>
+          <w:szCs w:val="32"/>
+          <w:lang w:val="en-US"/>
+        </w:rPr>
+        <w:t>SkillBridge</w:t>
+      </w:r>
+      <w:proofErr w:type="spellEnd"/>
+      <w:r>
+        <w:rPr>
+          <w:sz w:val="24"/>
+          <w:szCs w:val="32"/>
+          <w:lang w:val="en-US"/>
+        </w:rPr>
+        <w:t xml:space="preserve"> - Final Quiz Question &amp; Submission</w:t>
       </w:r>
       <w:r>
         <w:rPr>
@@ -5077,7 +6394,7 @@
           <w:szCs w:val="32"/>
           <w:lang w:val="en-US"/>
         </w:rPr>
-        <w:t>8e3ba3d18c4f4582ad5ba1e0760ca4a6</w:t>
+        <w:t>15935d86c67d40dfbaadf446818262b9</w:t>
       </w:r>
     </w:p>
     <w:p>
@@ -5089,14 +6406,16 @@
           <w:lang w:val="en-US"/>
         </w:rPr>
       </w:pPr>
-      <w:r>
-        <w:rPr>
-          <w:sz w:val="24"/>
-          <w:szCs w:val="32"/>
-          <w:lang w:val="en-US"/>
-        </w:rPr>
-        <w:br/>
-      </w:r>
+    </w:p>
+    <w:p>
+      <w:pPr>
+        <w:pStyle w:val="ListParagraph"/>
+        <w:rPr>
+          <w:sz w:val="24"/>
+          <w:szCs w:val="32"/>
+          <w:lang w:val="en-US"/>
+        </w:rPr>
+      </w:pPr>
       <w:proofErr w:type="spellStart"/>
       <w:r>
         <w:rPr>
@@ -5113,23 +6432,26 @@
           <w:szCs w:val="32"/>
           <w:lang w:val="en-US"/>
         </w:rPr>
-        <w:t xml:space="preserve"> - Assessment Setup (No Role Found)</w:t>
-      </w:r>
-      <w:r>
-        <w:rPr>
-          <w:sz w:val="24"/>
-          <w:szCs w:val="32"/>
-          <w:lang w:val="en-US"/>
-        </w:rPr>
-        <w:t xml:space="preserve">, id: </w:t>
-      </w:r>
-      <w:r>
-        <w:rPr>
-          <w:sz w:val="24"/>
-          <w:szCs w:val="32"/>
-          <w:lang w:val="en-US"/>
-        </w:rPr>
-        <w:t>4e7f2112b0924611a8a650437edf25f6</w:t>
+        <w:t xml:space="preserve"> - Assessment Submission Success</w:t>
+      </w:r>
+      <w:r>
+        <w:rPr>
+          <w:sz w:val="24"/>
+          <w:szCs w:val="32"/>
+          <w:lang w:val="en-US"/>
+        </w:rPr>
+        <w:t>, id:</w:t>
+      </w:r>
+      <w:r>
+        <w:t xml:space="preserve"> </w:t>
+      </w:r>
+      <w:r>
+        <w:rPr>
+          <w:sz w:val="24"/>
+          <w:szCs w:val="32"/>
+          <w:lang w:val="en-US"/>
+        </w:rPr>
+        <w:t>635b433a310a44ec819388b9f57dfce1</w:t>
       </w:r>
     </w:p>
     <w:p>
@@ -5141,14 +6463,16 @@
           <w:lang w:val="en-US"/>
         </w:rPr>
       </w:pPr>
-      <w:r>
-        <w:rPr>
-          <w:sz w:val="24"/>
-          <w:szCs w:val="32"/>
-          <w:lang w:val="en-US"/>
-        </w:rPr>
-        <w:br/>
-      </w:r>
+    </w:p>
+    <w:p>
+      <w:pPr>
+        <w:pStyle w:val="ListParagraph"/>
+        <w:rPr>
+          <w:sz w:val="24"/>
+          <w:szCs w:val="32"/>
+          <w:lang w:val="en-US"/>
+        </w:rPr>
+      </w:pPr>
       <w:proofErr w:type="spellStart"/>
       <w:r>
         <w:rPr>
@@ -5165,7 +6489,23 @@
           <w:szCs w:val="32"/>
           <w:lang w:val="en-US"/>
         </w:rPr>
-        <w:t xml:space="preserve"> - Assessment Loading (Typography Sync Refined)</w:t>
+        <w:t xml:space="preserve"> </w:t>
+      </w:r>
+      <w:r>
+        <w:rPr>
+          <w:sz w:val="24"/>
+          <w:szCs w:val="32"/>
+          <w:lang w:val="en-US"/>
+        </w:rPr>
+        <w:t>–</w:t>
+      </w:r>
+      <w:r>
+        <w:rPr>
+          <w:sz w:val="24"/>
+          <w:szCs w:val="32"/>
+          <w:lang w:val="en-US"/>
+        </w:rPr>
+        <w:t xml:space="preserve"> Dashboard</w:t>
       </w:r>
       <w:r>
         <w:rPr>
@@ -5184,7 +6524,7 @@
           <w:szCs w:val="32"/>
           <w:lang w:val="en-US"/>
         </w:rPr>
-        <w:t>a9cfef9f72f343529404d014d2355925</w:t>
+        <w:t>c94cafdb10e34f85a950283a750db4ff</w:t>
       </w:r>
     </w:p>
     <w:p>
@@ -5220,7 +6560,7 @@
           <w:szCs w:val="32"/>
           <w:lang w:val="en-US"/>
         </w:rPr>
-        <w:t xml:space="preserve"> - Assessment (Part 2) - Repositioned CTA</w:t>
+        <w:t xml:space="preserve"> - Skill Gap Analysis (Part 1)</w:t>
       </w:r>
       <w:r>
         <w:rPr>
@@ -5239,7 +6579,7 @@
           <w:szCs w:val="32"/>
           <w:lang w:val="en-US"/>
         </w:rPr>
-        <w:t>d0f9c15dad7648ae84f45a67c458ded0</w:t>
+        <w:t>b4de7cc88a8f41c088c11bd9b5450945</w:t>
       </w:r>
     </w:p>
     <w:p>
@@ -5266,7 +6606,6 @@
         <w:rPr>
           <w:sz w:val="24"/>
           <w:szCs w:val="32"/>
-          <w:lang w:val="en-US"/>
         </w:rPr>
         <w:t>SkillBridge</w:t>
       </w:r>
@@ -5275,15 +6614,13 @@
         <w:rPr>
           <w:sz w:val="24"/>
           <w:szCs w:val="32"/>
-          <w:lang w:val="en-US"/>
-        </w:rPr>
-        <w:t xml:space="preserve"> - Quiz Assessment</w:t>
-      </w:r>
-      <w:r>
-        <w:rPr>
-          <w:sz w:val="24"/>
-          <w:szCs w:val="32"/>
-          <w:lang w:val="en-US"/>
+        </w:rPr>
+        <w:t xml:space="preserve"> - Skill Gap Analysis (Part 2) - Aligned &amp; Navigable</w:t>
+      </w:r>
+      <w:r>
+        <w:rPr>
+          <w:sz w:val="24"/>
+          <w:szCs w:val="32"/>
         </w:rPr>
         <w:t>, id:</w:t>
       </w:r>
@@ -5294,9 +6631,8 @@
         <w:rPr>
           <w:sz w:val="24"/>
           <w:szCs w:val="32"/>
-          <w:lang w:val="en-US"/>
-        </w:rPr>
-        <w:t>338dc0d531574e629bf814ec0caa8794</w:t>
+        </w:rPr>
+        <w:t>e7abc6d598774c7aadff6419b6084b8c</w:t>
       </w:r>
     </w:p>
     <w:p>
@@ -5318,353 +6654,6 @@
           <w:lang w:val="en-US"/>
         </w:rPr>
       </w:pPr>
-      <w:proofErr w:type="spellStart"/>
-      <w:r>
-        <w:rPr>
-          <w:sz w:val="24"/>
-          <w:szCs w:val="32"/>
-          <w:lang w:val="en-US"/>
-        </w:rPr>
-        <w:t>SkillBridge</w:t>
-      </w:r>
-      <w:proofErr w:type="spellEnd"/>
-      <w:r>
-        <w:rPr>
-          <w:sz w:val="24"/>
-          <w:szCs w:val="32"/>
-          <w:lang w:val="en-US"/>
-        </w:rPr>
-        <w:t xml:space="preserve"> - Active Quiz Assessment</w:t>
-      </w:r>
-      <w:r>
-        <w:rPr>
-          <w:sz w:val="24"/>
-          <w:szCs w:val="32"/>
-          <w:lang w:val="en-US"/>
-        </w:rPr>
-        <w:t>, id:</w:t>
-      </w:r>
-      <w:r>
-        <w:t xml:space="preserve"> </w:t>
-      </w:r>
-      <w:r>
-        <w:rPr>
-          <w:sz w:val="24"/>
-          <w:szCs w:val="32"/>
-          <w:lang w:val="en-US"/>
-        </w:rPr>
-        <w:t>0bb049a729b3448a84dab37bb7512375</w:t>
-      </w:r>
-    </w:p>
-    <w:p>
-      <w:pPr>
-        <w:pStyle w:val="ListParagraph"/>
-        <w:rPr>
-          <w:sz w:val="24"/>
-          <w:szCs w:val="32"/>
-          <w:lang w:val="en-US"/>
-        </w:rPr>
-      </w:pPr>
-      <w:r>
-        <w:rPr>
-          <w:sz w:val="24"/>
-          <w:szCs w:val="32"/>
-          <w:lang w:val="en-US"/>
-        </w:rPr>
-        <w:br/>
-      </w:r>
-      <w:proofErr w:type="spellStart"/>
-      <w:r>
-        <w:rPr>
-          <w:sz w:val="24"/>
-          <w:szCs w:val="32"/>
-          <w:lang w:val="en-US"/>
-        </w:rPr>
-        <w:t>SkillBridge</w:t>
-      </w:r>
-      <w:proofErr w:type="spellEnd"/>
-      <w:r>
-        <w:rPr>
-          <w:sz w:val="24"/>
-          <w:szCs w:val="32"/>
-          <w:lang w:val="en-US"/>
-        </w:rPr>
-        <w:t xml:space="preserve"> - Final Quiz Question &amp; Submission</w:t>
-      </w:r>
-      <w:r>
-        <w:rPr>
-          <w:sz w:val="24"/>
-          <w:szCs w:val="32"/>
-          <w:lang w:val="en-US"/>
-        </w:rPr>
-        <w:t xml:space="preserve">, id: </w:t>
-      </w:r>
-      <w:r>
-        <w:rPr>
-          <w:sz w:val="24"/>
-          <w:szCs w:val="32"/>
-          <w:lang w:val="en-US"/>
-        </w:rPr>
-        <w:t>15935d86c67d40dfbaadf446818262b9</w:t>
-      </w:r>
-    </w:p>
-    <w:p>
-      <w:pPr>
-        <w:pStyle w:val="ListParagraph"/>
-        <w:rPr>
-          <w:sz w:val="24"/>
-          <w:szCs w:val="32"/>
-          <w:lang w:val="en-US"/>
-        </w:rPr>
-      </w:pPr>
-    </w:p>
-    <w:p>
-      <w:pPr>
-        <w:pStyle w:val="ListParagraph"/>
-        <w:rPr>
-          <w:sz w:val="24"/>
-          <w:szCs w:val="32"/>
-          <w:lang w:val="en-US"/>
-        </w:rPr>
-      </w:pPr>
-      <w:proofErr w:type="spellStart"/>
-      <w:r>
-        <w:rPr>
-          <w:sz w:val="24"/>
-          <w:szCs w:val="32"/>
-          <w:lang w:val="en-US"/>
-        </w:rPr>
-        <w:t>SkillBridge</w:t>
-      </w:r>
-      <w:proofErr w:type="spellEnd"/>
-      <w:r>
-        <w:rPr>
-          <w:sz w:val="24"/>
-          <w:szCs w:val="32"/>
-          <w:lang w:val="en-US"/>
-        </w:rPr>
-        <w:t xml:space="preserve"> - Assessment Submission Success</w:t>
-      </w:r>
-      <w:r>
-        <w:rPr>
-          <w:sz w:val="24"/>
-          <w:szCs w:val="32"/>
-          <w:lang w:val="en-US"/>
-        </w:rPr>
-        <w:t>, id:</w:t>
-      </w:r>
-      <w:r>
-        <w:t xml:space="preserve"> </w:t>
-      </w:r>
-      <w:r>
-        <w:rPr>
-          <w:sz w:val="24"/>
-          <w:szCs w:val="32"/>
-          <w:lang w:val="en-US"/>
-        </w:rPr>
-        <w:t>635b433a310a44ec819388b9f57dfce1</w:t>
-      </w:r>
-    </w:p>
-    <w:p>
-      <w:pPr>
-        <w:pStyle w:val="ListParagraph"/>
-        <w:rPr>
-          <w:sz w:val="24"/>
-          <w:szCs w:val="32"/>
-          <w:lang w:val="en-US"/>
-        </w:rPr>
-      </w:pPr>
-    </w:p>
-    <w:p>
-      <w:pPr>
-        <w:pStyle w:val="ListParagraph"/>
-        <w:rPr>
-          <w:sz w:val="24"/>
-          <w:szCs w:val="32"/>
-          <w:lang w:val="en-US"/>
-        </w:rPr>
-      </w:pPr>
-      <w:proofErr w:type="spellStart"/>
-      <w:r>
-        <w:rPr>
-          <w:sz w:val="24"/>
-          <w:szCs w:val="32"/>
-          <w:lang w:val="en-US"/>
-        </w:rPr>
-        <w:t>SkillBridge</w:t>
-      </w:r>
-      <w:proofErr w:type="spellEnd"/>
-      <w:r>
-        <w:rPr>
-          <w:sz w:val="24"/>
-          <w:szCs w:val="32"/>
-          <w:lang w:val="en-US"/>
-        </w:rPr>
-        <w:t xml:space="preserve"> </w:t>
-      </w:r>
-      <w:r>
-        <w:rPr>
-          <w:sz w:val="24"/>
-          <w:szCs w:val="32"/>
-          <w:lang w:val="en-US"/>
-        </w:rPr>
-        <w:t>–</w:t>
-      </w:r>
-      <w:r>
-        <w:rPr>
-          <w:sz w:val="24"/>
-          <w:szCs w:val="32"/>
-          <w:lang w:val="en-US"/>
-        </w:rPr>
-        <w:t xml:space="preserve"> Dashboard</w:t>
-      </w:r>
-      <w:r>
-        <w:rPr>
-          <w:sz w:val="24"/>
-          <w:szCs w:val="32"/>
-          <w:lang w:val="en-US"/>
-        </w:rPr>
-        <w:t>, id:</w:t>
-      </w:r>
-      <w:r>
-        <w:t xml:space="preserve"> </w:t>
-      </w:r>
-      <w:r>
-        <w:rPr>
-          <w:sz w:val="24"/>
-          <w:szCs w:val="32"/>
-          <w:lang w:val="en-US"/>
-        </w:rPr>
-        <w:t>c94cafdb10e34f85a950283a750db4ff</w:t>
-      </w:r>
-    </w:p>
-    <w:p>
-      <w:pPr>
-        <w:pStyle w:val="ListParagraph"/>
-        <w:rPr>
-          <w:sz w:val="24"/>
-          <w:szCs w:val="32"/>
-          <w:lang w:val="en-US"/>
-        </w:rPr>
-      </w:pPr>
-      <w:r>
-        <w:rPr>
-          <w:sz w:val="24"/>
-          <w:szCs w:val="32"/>
-          <w:lang w:val="en-US"/>
-        </w:rPr>
-        <w:br/>
-      </w:r>
-      <w:proofErr w:type="spellStart"/>
-      <w:r>
-        <w:rPr>
-          <w:sz w:val="24"/>
-          <w:szCs w:val="32"/>
-          <w:lang w:val="en-US"/>
-        </w:rPr>
-        <w:t>SkillBridge</w:t>
-      </w:r>
-      <w:proofErr w:type="spellEnd"/>
-      <w:r>
-        <w:rPr>
-          <w:sz w:val="24"/>
-          <w:szCs w:val="32"/>
-          <w:lang w:val="en-US"/>
-        </w:rPr>
-        <w:t xml:space="preserve"> - Skill Gap Analysis (Part 1)</w:t>
-      </w:r>
-      <w:r>
-        <w:rPr>
-          <w:sz w:val="24"/>
-          <w:szCs w:val="32"/>
-          <w:lang w:val="en-US"/>
-        </w:rPr>
-        <w:t>, id:</w:t>
-      </w:r>
-      <w:r>
-        <w:t xml:space="preserve"> </w:t>
-      </w:r>
-      <w:r>
-        <w:rPr>
-          <w:sz w:val="24"/>
-          <w:szCs w:val="32"/>
-          <w:lang w:val="en-US"/>
-        </w:rPr>
-        <w:t>b4de7cc88a8f41c088c11bd9b5450945</w:t>
-      </w:r>
-    </w:p>
-    <w:p>
-      <w:pPr>
-        <w:pStyle w:val="ListParagraph"/>
-        <w:rPr>
-          <w:sz w:val="24"/>
-          <w:szCs w:val="32"/>
-          <w:lang w:val="en-US"/>
-        </w:rPr>
-      </w:pPr>
-    </w:p>
-    <w:p>
-      <w:pPr>
-        <w:pStyle w:val="ListParagraph"/>
-        <w:rPr>
-          <w:sz w:val="24"/>
-          <w:szCs w:val="32"/>
-          <w:lang w:val="en-US"/>
-        </w:rPr>
-      </w:pPr>
-      <w:proofErr w:type="spellStart"/>
-      <w:r>
-        <w:rPr>
-          <w:sz w:val="24"/>
-          <w:szCs w:val="32"/>
-        </w:rPr>
-        <w:t>SkillBridge</w:t>
-      </w:r>
-      <w:proofErr w:type="spellEnd"/>
-      <w:r>
-        <w:rPr>
-          <w:sz w:val="24"/>
-          <w:szCs w:val="32"/>
-        </w:rPr>
-        <w:t xml:space="preserve"> - Skill Gap Analysis (Part 2) - Aligned &amp; Navigable</w:t>
-      </w:r>
-      <w:r>
-        <w:rPr>
-          <w:sz w:val="24"/>
-          <w:szCs w:val="32"/>
-        </w:rPr>
-        <w:t>, id:</w:t>
-      </w:r>
-      <w:r>
-        <w:t xml:space="preserve"> </w:t>
-      </w:r>
-      <w:r>
-        <w:rPr>
-          <w:sz w:val="24"/>
-          <w:szCs w:val="32"/>
-        </w:rPr>
-        <w:t>e7abc6d598774c7aadff6419b6084b8c</w:t>
-      </w:r>
-    </w:p>
-    <w:p>
-      <w:pPr>
-        <w:pStyle w:val="ListParagraph"/>
-        <w:rPr>
-          <w:sz w:val="24"/>
-          <w:szCs w:val="32"/>
-          <w:lang w:val="en-US"/>
-        </w:rPr>
-      </w:pPr>
-    </w:p>
-    <w:p>
-      <w:pPr>
-        <w:pStyle w:val="ListParagraph"/>
-        <w:rPr>
-          <w:sz w:val="24"/>
-          <w:szCs w:val="32"/>
-          <w:lang w:val="en-US"/>
-        </w:rPr>
-      </w:pPr>
     </w:p>
     <w:p>
       <w:pPr>
@@ -5681,65 +6670,2680 @@
       </w:r>
       <w:r>
         <w:t>7928833044385601972</w:t>
-      </w:r>
-    </w:p>
-    <w:p/>
-    <w:p>
-      <w:r>
-        <w:t xml:space="preserve">In </w:t>
-      </w:r>
-      <w:proofErr w:type="spellStart"/>
-      <w:r>
-        <w:t>RegistrationFlow.jsx</w:t>
-      </w:r>
-      <w:proofErr w:type="spellEnd"/>
-      <w:r>
-        <w:t>, implement the latest designs for registration and for its validation</w:t>
-      </w:r>
-    </w:p>
-    <w:p/>
-    <w:p>
-      <w:r>
-        <w:t xml:space="preserve">Viewed </w:t>
-      </w:r>
-      <w:proofErr w:type="spellStart"/>
-      <w:r>
-        <w:t>list_screens.json</w:t>
-      </w:r>
-      <w:proofErr w:type="spellEnd"/>
-    </w:p>
-    <w:p>
-      <w:r>
-        <w:t xml:space="preserve">Used MCP tool: </w:t>
-      </w:r>
-      <w:proofErr w:type="spellStart"/>
-      <w:r>
-        <w:t>StitchMCP</w:t>
-      </w:r>
-      <w:proofErr w:type="spellEnd"/>
-      <w:r>
-        <w:t>/</w:t>
-      </w:r>
-      <w:proofErr w:type="spellStart"/>
-      <w:r>
-        <w:t>list_screens</w:t>
-      </w:r>
-      <w:proofErr w:type="spellEnd"/>
-    </w:p>
-    <w:p>
-      <w:r>
-        <w:t>Viewed output.txt</w:t>
-      </w:r>
-    </w:p>
-    <w:p/>
-    <w:p>
-      <w:r>
-        <w:lastRenderedPageBreak/>
-        <w:t>Here is the list of screens along with their IDs and titles from the requested Stitch project (ID `7928833044385601972`):</w:t>
       </w:r>
     </w:p>
     <w:p/>
     <w:p/>
+    <w:p/>
+    <w:p/>
+    <w:p/>
+    <w:p/>
+    <w:p/>
+    <w:p/>
+    <w:p/>
+    <w:p/>
+    <w:p>
+      <w:pPr>
+        <w:rPr>
+          <w:sz w:val="24"/>
+        </w:rPr>
+      </w:pPr>
+      <w:r>
+        <w:rPr>
+          <w:b/>
+          <w:sz w:val="48"/>
+          <w:szCs w:val="48"/>
+        </w:rPr>
+        <w:lastRenderedPageBreak/>
+        <w:t>Prompt to be executed</w:t>
+      </w:r>
+      <w:proofErr w:type="gramStart"/>
+      <w:r>
+        <w:rPr>
+          <w:b/>
+          <w:sz w:val="48"/>
+          <w:szCs w:val="48"/>
+        </w:rPr>
+        <w:t>:</w:t>
+      </w:r>
+      <w:proofErr w:type="gramEnd"/>
+      <w:r>
+        <w:br/>
+      </w:r>
+      <w:r>
+        <w:rPr>
+          <w:sz w:val="24"/>
+          <w:szCs w:val="24"/>
+        </w:rPr>
+        <w:br/>
+      </w:r>
+      <w:r>
+        <w:rPr>
+          <w:sz w:val="24"/>
+          <w:szCs w:val="24"/>
+        </w:rPr>
+        <w:br/>
+        <w:t xml:space="preserve">Prompt 20[ </w:t>
+      </w:r>
+      <w:r>
+        <w:rPr>
+          <w:sz w:val="24"/>
+          <w:szCs w:val="24"/>
+        </w:rPr>
+        <w:t>Database changes, Placeholder changes and Degree list embedded]</w:t>
+      </w:r>
+      <w:r>
+        <w:rPr>
+          <w:sz w:val="24"/>
+          <w:szCs w:val="24"/>
+        </w:rPr>
+        <w:br/>
+      </w:r>
+      <w:r>
+        <w:rPr>
+          <w:sz w:val="24"/>
+          <w:szCs w:val="24"/>
+        </w:rPr>
+        <w:t xml:space="preserve">There </w:t>
+      </w:r>
+      <w:r>
+        <w:rPr>
+          <w:sz w:val="24"/>
+          <w:szCs w:val="24"/>
+        </w:rPr>
+        <w:t xml:space="preserve">is still </w:t>
+      </w:r>
+      <w:r>
+        <w:rPr>
+          <w:sz w:val="24"/>
+          <w:szCs w:val="24"/>
+        </w:rPr>
+        <w:t xml:space="preserve">many issues </w:t>
+      </w:r>
+      <w:r>
+        <w:rPr>
+          <w:sz w:val="24"/>
+          <w:szCs w:val="24"/>
+        </w:rPr>
+        <w:t xml:space="preserve">in functionalities </w:t>
+      </w:r>
+      <w:r>
+        <w:rPr>
+          <w:sz w:val="24"/>
+          <w:szCs w:val="24"/>
+        </w:rPr>
+        <w:t xml:space="preserve">of </w:t>
+      </w:r>
+      <w:proofErr w:type="spellStart"/>
+      <w:r>
+        <w:rPr>
+          <w:sz w:val="24"/>
+          <w:szCs w:val="24"/>
+        </w:rPr>
+        <w:t>RegistrationFlow.jsx</w:t>
+      </w:r>
+      <w:proofErr w:type="spellEnd"/>
+      <w:r>
+        <w:rPr>
+          <w:sz w:val="24"/>
+          <w:szCs w:val="24"/>
+        </w:rPr>
+        <w:t xml:space="preserve"> file.</w:t>
+      </w:r>
+      <w:r>
+        <w:rPr>
+          <w:sz w:val="24"/>
+          <w:szCs w:val="24"/>
+        </w:rPr>
+        <w:t xml:space="preserve"> I have listed down the problems</w:t>
+      </w:r>
+      <w:proofErr w:type="gramStart"/>
+      <w:r>
+        <w:rPr>
+          <w:sz w:val="24"/>
+          <w:szCs w:val="24"/>
+        </w:rPr>
+        <w:t>:</w:t>
+      </w:r>
+      <w:proofErr w:type="gramEnd"/>
+      <w:r>
+        <w:rPr>
+          <w:sz w:val="24"/>
+        </w:rPr>
+        <w:br/>
+      </w:r>
+      <w:r>
+        <w:rPr>
+          <w:sz w:val="24"/>
+        </w:rPr>
+        <w:br/>
+      </w:r>
+      <w:r>
+        <w:rPr>
+          <w:sz w:val="24"/>
+        </w:rPr>
+        <w:t>Problem</w:t>
+      </w:r>
+      <w:r>
+        <w:rPr>
+          <w:sz w:val="24"/>
+        </w:rPr>
+        <w:t xml:space="preserve"> 1</w:t>
+      </w:r>
+      <w:r>
+        <w:rPr>
+          <w:sz w:val="24"/>
+        </w:rPr>
+        <w:t>: The databa</w:t>
+      </w:r>
+      <w:r>
+        <w:rPr>
+          <w:sz w:val="24"/>
+        </w:rPr>
+        <w:t xml:space="preserve">se only </w:t>
+      </w:r>
+      <w:r>
+        <w:rPr>
+          <w:sz w:val="24"/>
+        </w:rPr>
+        <w:t xml:space="preserve">stores </w:t>
+      </w:r>
+      <w:r>
+        <w:rPr>
+          <w:sz w:val="24"/>
+        </w:rPr>
+        <w:t>few information</w:t>
+      </w:r>
+      <w:r>
+        <w:rPr>
+          <w:sz w:val="24"/>
+        </w:rPr>
+        <w:t xml:space="preserve"> such as:</w:t>
+      </w:r>
+    </w:p>
+    <w:p>
+      <w:pPr>
+        <w:rPr>
+          <w:sz w:val="24"/>
+        </w:rPr>
+      </w:pPr>
+      <w:proofErr w:type="spellStart"/>
+      <w:proofErr w:type="gramStart"/>
+      <w:r>
+        <w:rPr>
+          <w:sz w:val="24"/>
+        </w:rPr>
+        <w:t>firstName</w:t>
+      </w:r>
+      <w:proofErr w:type="spellEnd"/>
+      <w:proofErr w:type="gramEnd"/>
+    </w:p>
+    <w:p>
+      <w:pPr>
+        <w:rPr>
+          <w:sz w:val="24"/>
+        </w:rPr>
+      </w:pPr>
+      <w:proofErr w:type="spellStart"/>
+      <w:proofErr w:type="gramStart"/>
+      <w:r>
+        <w:rPr>
+          <w:sz w:val="24"/>
+        </w:rPr>
+        <w:t>lastName</w:t>
+      </w:r>
+      <w:proofErr w:type="spellEnd"/>
+      <w:proofErr w:type="gramEnd"/>
+    </w:p>
+    <w:p>
+      <w:pPr>
+        <w:rPr>
+          <w:sz w:val="24"/>
+        </w:rPr>
+      </w:pPr>
+      <w:proofErr w:type="gramStart"/>
+      <w:r>
+        <w:rPr>
+          <w:sz w:val="24"/>
+        </w:rPr>
+        <w:t>email</w:t>
+      </w:r>
+      <w:proofErr w:type="gramEnd"/>
+    </w:p>
+    <w:p>
+      <w:pPr>
+        <w:rPr>
+          <w:sz w:val="24"/>
+        </w:rPr>
+      </w:pPr>
+      <w:proofErr w:type="gramStart"/>
+      <w:r>
+        <w:rPr>
+          <w:sz w:val="24"/>
+        </w:rPr>
+        <w:t>phone</w:t>
+      </w:r>
+      <w:proofErr w:type="gramEnd"/>
+    </w:p>
+    <w:p>
+      <w:pPr>
+        <w:rPr>
+          <w:sz w:val="24"/>
+        </w:rPr>
+      </w:pPr>
+      <w:proofErr w:type="gramStart"/>
+      <w:r>
+        <w:rPr>
+          <w:sz w:val="24"/>
+        </w:rPr>
+        <w:t>and</w:t>
+      </w:r>
+      <w:proofErr w:type="gramEnd"/>
+      <w:r>
+        <w:rPr>
+          <w:sz w:val="24"/>
+        </w:rPr>
+        <w:t xml:space="preserve"> so on.</w:t>
+      </w:r>
+      <w:r>
+        <w:rPr>
+          <w:sz w:val="24"/>
+        </w:rPr>
+        <w:br/>
+      </w:r>
+    </w:p>
+    <w:p>
+      <w:pPr>
+        <w:rPr>
+          <w:sz w:val="24"/>
+        </w:rPr>
+      </w:pPr>
+      <w:r>
+        <w:rPr>
+          <w:sz w:val="24"/>
+        </w:rPr>
+        <w:t xml:space="preserve">But I want the all the user information from personal information and Education and Internship to be stored in the database. </w:t>
+      </w:r>
+      <w:r>
+        <w:rPr>
+          <w:sz w:val="24"/>
+        </w:rPr>
+        <w:t xml:space="preserve">So </w:t>
+      </w:r>
+      <w:proofErr w:type="gramStart"/>
+      <w:r>
+        <w:rPr>
+          <w:sz w:val="24"/>
+        </w:rPr>
+        <w:t>Include</w:t>
+      </w:r>
+      <w:proofErr w:type="gramEnd"/>
+      <w:r>
+        <w:rPr>
+          <w:sz w:val="24"/>
+        </w:rPr>
+        <w:t xml:space="preserve"> all the fields in the database.</w:t>
+      </w:r>
+      <w:r>
+        <w:rPr>
+          <w:sz w:val="24"/>
+        </w:rPr>
+        <w:br/>
+      </w:r>
+      <w:r>
+        <w:rPr>
+          <w:sz w:val="24"/>
+        </w:rPr>
+        <w:br/>
+        <w:t>Code Reference:</w:t>
+      </w:r>
+      <w:r>
+        <w:rPr>
+          <w:sz w:val="24"/>
+        </w:rPr>
+        <w:br/>
+      </w:r>
+      <w:r>
+        <w:rPr>
+          <w:sz w:val="24"/>
+        </w:rPr>
+        <w:t xml:space="preserve">  {step === 1 &amp;&amp; (</w:t>
+      </w:r>
+    </w:p>
+    <w:p>
+      <w:pPr>
+        <w:rPr>
+          <w:sz w:val="24"/>
+        </w:rPr>
+      </w:pPr>
+      <w:r>
+        <w:rPr>
+          <w:sz w:val="24"/>
+        </w:rPr>
+        <w:t xml:space="preserve">        &lt;main </w:t>
+      </w:r>
+      <w:proofErr w:type="spellStart"/>
+      <w:r>
+        <w:rPr>
+          <w:sz w:val="24"/>
+        </w:rPr>
+        <w:t>className</w:t>
+      </w:r>
+      <w:proofErr w:type="spellEnd"/>
+      <w:r>
+        <w:rPr>
+          <w:sz w:val="24"/>
+        </w:rPr>
+        <w:t>="flex-grow mx-auto px-6 py-12 w-full max-w-7xl pt-16"&gt;</w:t>
+      </w:r>
+      <w:r>
+        <w:rPr>
+          <w:sz w:val="24"/>
+        </w:rPr>
+        <w:br/>
+        <w:t>…………………………………………………………………………</w:t>
+      </w:r>
+    </w:p>
+    <w:p>
+      <w:pPr>
+        <w:rPr>
+          <w:sz w:val="24"/>
+        </w:rPr>
+      </w:pPr>
+      <w:r>
+        <w:rPr>
+          <w:sz w:val="24"/>
+        </w:rPr>
+        <w:t xml:space="preserve">        &lt;/main&gt;</w:t>
+      </w:r>
+    </w:p>
+    <w:p>
+      <w:pPr>
+        <w:rPr>
+          <w:sz w:val="24"/>
+        </w:rPr>
+      </w:pPr>
+      <w:r>
+        <w:rPr>
+          <w:sz w:val="24"/>
+        </w:rPr>
+        <w:t xml:space="preserve">      </w:t>
+      </w:r>
+      <w:proofErr w:type="gramStart"/>
+      <w:r>
+        <w:rPr>
+          <w:sz w:val="24"/>
+        </w:rPr>
+        <w:t>)}</w:t>
+      </w:r>
+      <w:proofErr w:type="gramEnd"/>
+      <w:r>
+        <w:rPr>
+          <w:sz w:val="24"/>
+        </w:rPr>
+        <w:br/>
+      </w:r>
+      <w:r>
+        <w:rPr>
+          <w:sz w:val="24"/>
+        </w:rPr>
+        <w:br/>
+      </w:r>
+      <w:r>
+        <w:rPr>
+          <w:sz w:val="24"/>
+        </w:rPr>
+        <w:br/>
+      </w:r>
+      <w:r>
+        <w:rPr>
+          <w:sz w:val="24"/>
+        </w:rPr>
+        <w:br/>
+      </w:r>
+      <w:r>
+        <w:rPr>
+          <w:sz w:val="24"/>
+        </w:rPr>
+        <w:br/>
+      </w:r>
+      <w:r>
+        <w:rPr>
+          <w:sz w:val="24"/>
+        </w:rPr>
+        <w:t>{step === 2 &amp;&amp; (</w:t>
+      </w:r>
+    </w:p>
+    <w:p>
+      <w:pPr>
+        <w:rPr>
+          <w:sz w:val="24"/>
+        </w:rPr>
+      </w:pPr>
+      <w:r>
+        <w:rPr>
+          <w:sz w:val="24"/>
+        </w:rPr>
+        <w:t xml:space="preserve">        &lt;main </w:t>
+      </w:r>
+      <w:proofErr w:type="spellStart"/>
+      <w:r>
+        <w:rPr>
+          <w:sz w:val="24"/>
+        </w:rPr>
+        <w:t>className</w:t>
+      </w:r>
+      <w:proofErr w:type="spellEnd"/>
+      <w:r>
+        <w:rPr>
+          <w:sz w:val="24"/>
+        </w:rPr>
+        <w:t>="flex-grow py-12 px-4 md</w:t>
+      </w:r>
+      <w:proofErr w:type="gramStart"/>
+      <w:r>
+        <w:rPr>
+          <w:sz w:val="24"/>
+        </w:rPr>
+        <w:t>:px</w:t>
+      </w:r>
+      <w:proofErr w:type="gramEnd"/>
+      <w:r>
+        <w:rPr>
+          <w:sz w:val="24"/>
+        </w:rPr>
+        <w:t>-10 pt-16"&gt;</w:t>
+      </w:r>
+      <w:r>
+        <w:rPr>
+          <w:sz w:val="24"/>
+        </w:rPr>
+        <w:br/>
+        <w:t xml:space="preserve"> ………………………………………………</w:t>
+      </w:r>
+    </w:p>
+    <w:p>
+      <w:pPr>
+        <w:rPr>
+          <w:sz w:val="24"/>
+        </w:rPr>
+      </w:pPr>
+      <w:r>
+        <w:rPr>
+          <w:sz w:val="24"/>
+        </w:rPr>
+        <w:t xml:space="preserve"> </w:t>
+      </w:r>
+      <w:r>
+        <w:rPr>
+          <w:sz w:val="24"/>
+        </w:rPr>
+        <w:t xml:space="preserve">        &lt;/main&gt;</w:t>
+      </w:r>
+    </w:p>
+    <w:p>
+      <w:pPr>
+        <w:rPr>
+          <w:sz w:val="24"/>
+        </w:rPr>
+      </w:pPr>
+      <w:r>
+        <w:rPr>
+          <w:sz w:val="24"/>
+        </w:rPr>
+        <w:t xml:space="preserve">      </w:t>
+      </w:r>
+      <w:proofErr w:type="gramStart"/>
+      <w:r>
+        <w:rPr>
+          <w:sz w:val="24"/>
+        </w:rPr>
+        <w:t>)}</w:t>
+      </w:r>
+      <w:proofErr w:type="gramEnd"/>
+      <w:r>
+        <w:rPr>
+          <w:sz w:val="24"/>
+        </w:rPr>
+        <w:br/>
+      </w:r>
+      <w:r>
+        <w:rPr>
+          <w:sz w:val="24"/>
+        </w:rPr>
+        <w:br/>
+      </w:r>
+      <w:r>
+        <w:rPr>
+          <w:sz w:val="24"/>
+        </w:rPr>
+        <w:br/>
+      </w:r>
+      <w:r>
+        <w:rPr>
+          <w:sz w:val="24"/>
+        </w:rPr>
+        <w:br/>
+        <w:t>Problem 2: When filling the form in Personal Information, I noticed that some fields have placeholders with some random numbers.</w:t>
+      </w:r>
+    </w:p>
+    <w:p>
+      <w:pPr>
+        <w:rPr>
+          <w:sz w:val="24"/>
+        </w:rPr>
+      </w:pPr>
+      <w:r>
+        <w:rPr>
+          <w:sz w:val="24"/>
+        </w:rPr>
+        <w:lastRenderedPageBreak/>
+        <w:t xml:space="preserve">Changes Required: Replace place holder values with some meaningful strings in place of current value. </w:t>
+      </w:r>
+      <w:r>
+        <w:rPr>
+          <w:sz w:val="24"/>
+        </w:rPr>
+        <w:br/>
+        <w:t>Use something like.</w:t>
+      </w:r>
+      <w:r>
+        <w:rPr>
+          <w:sz w:val="24"/>
+        </w:rPr>
+        <w:br/>
+        <w:t>For phone numbers use “XXXXXXXXXX”</w:t>
+      </w:r>
+      <w:r>
+        <w:rPr>
+          <w:sz w:val="24"/>
+        </w:rPr>
+        <w:br/>
+        <w:t xml:space="preserve">For </w:t>
+      </w:r>
+      <w:proofErr w:type="spellStart"/>
+      <w:r>
+        <w:rPr>
+          <w:sz w:val="24"/>
+        </w:rPr>
+        <w:t>Pincode</w:t>
+      </w:r>
+      <w:proofErr w:type="spellEnd"/>
+      <w:r>
+        <w:rPr>
+          <w:sz w:val="24"/>
+        </w:rPr>
+        <w:t xml:space="preserve"> use “Enter </w:t>
+      </w:r>
+      <w:proofErr w:type="spellStart"/>
+      <w:r>
+        <w:rPr>
+          <w:sz w:val="24"/>
+        </w:rPr>
+        <w:t>Pincode</w:t>
+      </w:r>
+      <w:proofErr w:type="spellEnd"/>
+      <w:r>
+        <w:rPr>
+          <w:sz w:val="24"/>
+        </w:rPr>
+        <w:t>”</w:t>
+      </w:r>
+    </w:p>
+    <w:p>
+      <w:pPr>
+        <w:rPr>
+          <w:sz w:val="24"/>
+        </w:rPr>
+      </w:pPr>
+    </w:p>
+    <w:p>
+      <w:pPr>
+        <w:rPr>
+          <w:sz w:val="24"/>
+        </w:rPr>
+      </w:pPr>
+    </w:p>
+    <w:p>
+      <w:pPr>
+        <w:rPr>
+          <w:sz w:val="24"/>
+        </w:rPr>
+      </w:pPr>
+      <w:r>
+        <w:rPr>
+          <w:sz w:val="24"/>
+        </w:rPr>
+        <w:t>P</w:t>
+      </w:r>
+      <w:r>
+        <w:rPr>
+          <w:sz w:val="24"/>
+        </w:rPr>
+        <w:t xml:space="preserve">roblem 3: </w:t>
+      </w:r>
+      <w:r>
+        <w:rPr>
+          <w:sz w:val="24"/>
+        </w:rPr>
+        <w:t>Resume Parsing is give more priority than the data inputted through create account section of the page.</w:t>
+      </w:r>
+      <w:r>
+        <w:rPr>
+          <w:sz w:val="24"/>
+        </w:rPr>
+        <w:br/>
+      </w:r>
+      <w:r>
+        <w:rPr>
+          <w:sz w:val="24"/>
+        </w:rPr>
+        <w:br/>
+        <w:t xml:space="preserve">Changes Required: </w:t>
+      </w:r>
+      <w:r>
+        <w:rPr>
+          <w:sz w:val="24"/>
+        </w:rPr>
+        <w:t xml:space="preserve">Before parsing from resume, the data </w:t>
+      </w:r>
+      <w:r>
+        <w:rPr>
+          <w:sz w:val="24"/>
+        </w:rPr>
+        <w:t xml:space="preserve">the user </w:t>
+      </w:r>
+      <w:r>
+        <w:rPr>
+          <w:sz w:val="24"/>
+        </w:rPr>
+        <w:t xml:space="preserve">entered in the create account section of the page must be automatically filled in the respective form elements in the Personal information section. </w:t>
+      </w:r>
+      <w:r>
+        <w:rPr>
+          <w:sz w:val="24"/>
+        </w:rPr>
+        <w:t>User can manually edit the field even though the field is automatically filled.</w:t>
+      </w:r>
+      <w:r>
+        <w:rPr>
+          <w:sz w:val="24"/>
+        </w:rPr>
+        <w:br/>
+      </w:r>
+      <w:r>
+        <w:rPr>
+          <w:sz w:val="24"/>
+        </w:rPr>
+        <w:t>In other words, the data he</w:t>
+      </w:r>
+      <w:r>
+        <w:rPr>
+          <w:sz w:val="24"/>
+        </w:rPr>
+        <w:t>/she</w:t>
+      </w:r>
+      <w:r>
+        <w:rPr>
+          <w:sz w:val="24"/>
+        </w:rPr>
+        <w:t xml:space="preserve"> entered </w:t>
+      </w:r>
+      <w:r>
+        <w:rPr>
+          <w:sz w:val="24"/>
+        </w:rPr>
+        <w:t>in the create account section</w:t>
+      </w:r>
+      <w:r>
+        <w:rPr>
+          <w:sz w:val="24"/>
+        </w:rPr>
+        <w:t xml:space="preserve"> of the page must be given more priority then what is parsed from resume </w:t>
+      </w:r>
+      <w:r>
+        <w:rPr>
+          <w:sz w:val="24"/>
+        </w:rPr>
+        <w:t>(</w:t>
+      </w:r>
+      <w:r>
+        <w:rPr>
+          <w:sz w:val="24"/>
+        </w:rPr>
+        <w:t>which is up</w:t>
+      </w:r>
+      <w:r>
+        <w:rPr>
+          <w:sz w:val="24"/>
+        </w:rPr>
+        <w:t xml:space="preserve">loaded) and must automatically be filled in the form in </w:t>
+      </w:r>
+      <w:r>
+        <w:rPr>
+          <w:sz w:val="24"/>
+        </w:rPr>
+        <w:t xml:space="preserve">Personal information </w:t>
+      </w:r>
+      <w:r>
+        <w:rPr>
+          <w:sz w:val="24"/>
+        </w:rPr>
+        <w:t xml:space="preserve">section. </w:t>
+      </w:r>
+      <w:r>
+        <w:rPr>
+          <w:sz w:val="24"/>
+        </w:rPr>
+        <w:br/>
+        <w:t xml:space="preserve">For all other details asked in the user form in the personal information section of the </w:t>
+      </w:r>
+      <w:proofErr w:type="spellStart"/>
+      <w:r>
+        <w:rPr>
+          <w:sz w:val="24"/>
+          <w:szCs w:val="24"/>
+        </w:rPr>
+        <w:t>RegistrationFlow.jsx</w:t>
+      </w:r>
+      <w:proofErr w:type="spellEnd"/>
+      <w:r>
+        <w:rPr>
+          <w:sz w:val="24"/>
+          <w:szCs w:val="24"/>
+        </w:rPr>
+        <w:t>,</w:t>
+      </w:r>
+      <w:r>
+        <w:rPr>
+          <w:sz w:val="24"/>
+          <w:szCs w:val="24"/>
+        </w:rPr>
+        <w:t xml:space="preserve"> </w:t>
+      </w:r>
+      <w:r>
+        <w:rPr>
+          <w:sz w:val="24"/>
+        </w:rPr>
+        <w:t>can be filled automatically through parsed data from resume or be manually filled by user.</w:t>
+      </w:r>
+      <w:r>
+        <w:rPr>
+          <w:sz w:val="24"/>
+        </w:rPr>
+        <w:t xml:space="preserve"> </w:t>
+      </w:r>
+    </w:p>
+    <w:p>
+      <w:pPr>
+        <w:rPr>
+          <w:sz w:val="24"/>
+        </w:rPr>
+      </w:pPr>
+    </w:p>
+    <w:p>
+      <w:pPr>
+        <w:rPr>
+          <w:sz w:val="24"/>
+        </w:rPr>
+      </w:pPr>
+      <w:r>
+        <w:rPr>
+          <w:sz w:val="24"/>
+        </w:rPr>
+        <w:t>Code Reference</w:t>
+      </w:r>
+      <w:proofErr w:type="gramStart"/>
+      <w:r>
+        <w:rPr>
+          <w:sz w:val="24"/>
+        </w:rPr>
+        <w:t>:</w:t>
+      </w:r>
+      <w:proofErr w:type="gramEnd"/>
+      <w:r>
+        <w:rPr>
+          <w:sz w:val="24"/>
+        </w:rPr>
+        <w:br/>
+      </w:r>
+      <w:r>
+        <w:rPr>
+          <w:sz w:val="24"/>
+        </w:rPr>
+        <w:br/>
+        <w:t>Create Account section:</w:t>
+      </w:r>
+      <w:r>
+        <w:rPr>
+          <w:sz w:val="24"/>
+        </w:rPr>
+        <w:br/>
+      </w:r>
+      <w:r>
+        <w:rPr>
+          <w:sz w:val="24"/>
+        </w:rPr>
+        <w:t>{step === 0 &amp;&amp; (</w:t>
+      </w:r>
+    </w:p>
+    <w:p>
+      <w:pPr>
+        <w:rPr>
+          <w:sz w:val="24"/>
+        </w:rPr>
+      </w:pPr>
+      <w:r>
+        <w:rPr>
+          <w:sz w:val="24"/>
+        </w:rPr>
+        <w:t xml:space="preserve">        &lt;main </w:t>
+      </w:r>
+      <w:proofErr w:type="spellStart"/>
+      <w:r>
+        <w:rPr>
+          <w:sz w:val="24"/>
+        </w:rPr>
+        <w:t>className</w:t>
+      </w:r>
+      <w:proofErr w:type="spellEnd"/>
+      <w:r>
+        <w:rPr>
+          <w:sz w:val="24"/>
+        </w:rPr>
+        <w:t xml:space="preserve">="flex-grow flex flex-col </w:t>
+      </w:r>
+      <w:proofErr w:type="spellStart"/>
+      <w:r>
+        <w:rPr>
+          <w:sz w:val="24"/>
+        </w:rPr>
+        <w:t>md</w:t>
+      </w:r>
+      <w:proofErr w:type="gramStart"/>
+      <w:r>
+        <w:rPr>
+          <w:sz w:val="24"/>
+        </w:rPr>
+        <w:t>:flex</w:t>
+      </w:r>
+      <w:proofErr w:type="gramEnd"/>
+      <w:r>
+        <w:rPr>
+          <w:sz w:val="24"/>
+        </w:rPr>
+        <w:t>-row</w:t>
+      </w:r>
+      <w:proofErr w:type="spellEnd"/>
+      <w:r>
+        <w:rPr>
+          <w:sz w:val="24"/>
+        </w:rPr>
+        <w:t xml:space="preserve"> max-w-7xl mx-auto w-full pt-8"&gt;</w:t>
+      </w:r>
+    </w:p>
+    <w:p>
+      <w:pPr>
+        <w:rPr>
+          <w:sz w:val="24"/>
+        </w:rPr>
+      </w:pPr>
+      <w:r>
+        <w:rPr>
+          <w:sz w:val="24"/>
+        </w:rPr>
+        <w:t>…………………………….</w:t>
+      </w:r>
+      <w:r>
+        <w:rPr>
+          <w:sz w:val="24"/>
+        </w:rPr>
+        <w:t xml:space="preserve">        </w:t>
+      </w:r>
+      <w:r>
+        <w:rPr>
+          <w:sz w:val="24"/>
+        </w:rPr>
+        <w:br/>
+      </w:r>
+      <w:r>
+        <w:rPr>
+          <w:sz w:val="24"/>
+        </w:rPr>
+        <w:t>&lt;/main&gt;</w:t>
+      </w:r>
+    </w:p>
+    <w:p>
+      <w:pPr>
+        <w:rPr>
+          <w:sz w:val="24"/>
+        </w:rPr>
+      </w:pPr>
+      <w:r>
+        <w:rPr>
+          <w:sz w:val="24"/>
+        </w:rPr>
+        <w:t xml:space="preserve">      )}</w:t>
+      </w:r>
+    </w:p>
+    <w:p>
+      <w:pPr>
+        <w:rPr>
+          <w:sz w:val="24"/>
+        </w:rPr>
+      </w:pPr>
+      <w:r>
+        <w:rPr>
+          <w:sz w:val="24"/>
+        </w:rPr>
+        <w:br/>
+        <w:t>Personal Information Section:</w:t>
+      </w:r>
+      <w:r>
+        <w:rPr>
+          <w:sz w:val="24"/>
+        </w:rPr>
+        <w:br/>
+      </w:r>
+      <w:r>
+        <w:rPr>
+          <w:sz w:val="24"/>
+        </w:rPr>
+        <w:br/>
+      </w:r>
+      <w:r>
+        <w:rPr>
+          <w:sz w:val="24"/>
+        </w:rPr>
+        <w:t xml:space="preserve">  {step === 1 &amp;&amp; (</w:t>
+      </w:r>
+    </w:p>
+    <w:p>
+      <w:pPr>
+        <w:rPr>
+          <w:sz w:val="24"/>
+        </w:rPr>
+      </w:pPr>
+      <w:r>
+        <w:rPr>
+          <w:sz w:val="24"/>
+        </w:rPr>
+        <w:t xml:space="preserve">        &lt;main </w:t>
+      </w:r>
+      <w:proofErr w:type="spellStart"/>
+      <w:r>
+        <w:rPr>
+          <w:sz w:val="24"/>
+        </w:rPr>
+        <w:t>className</w:t>
+      </w:r>
+      <w:proofErr w:type="spellEnd"/>
+      <w:r>
+        <w:rPr>
+          <w:sz w:val="24"/>
+        </w:rPr>
+        <w:t>="flex-grow mx-auto px-6 py-12 w-full max-w-7xl pt-16"&gt;</w:t>
+      </w:r>
+      <w:r>
+        <w:rPr>
+          <w:sz w:val="24"/>
+        </w:rPr>
+        <w:br/>
+        <w:t>…………………………………………………………………………</w:t>
+      </w:r>
+    </w:p>
+    <w:p>
+      <w:pPr>
+        <w:rPr>
+          <w:sz w:val="24"/>
+        </w:rPr>
+      </w:pPr>
+      <w:r>
+        <w:rPr>
+          <w:sz w:val="24"/>
+        </w:rPr>
+        <w:t xml:space="preserve">        &lt;/main&gt;</w:t>
+      </w:r>
+    </w:p>
+    <w:p>
+      <w:pPr>
+        <w:rPr>
+          <w:sz w:val="24"/>
+        </w:rPr>
+      </w:pPr>
+      <w:r>
+        <w:rPr>
+          <w:sz w:val="24"/>
+        </w:rPr>
+        <w:t xml:space="preserve">      )}</w:t>
+      </w:r>
+      <w:r>
+        <w:rPr>
+          <w:sz w:val="24"/>
+        </w:rPr>
+        <w:br/>
+      </w:r>
+    </w:p>
+    <w:p>
+      <w:pPr>
+        <w:rPr>
+          <w:sz w:val="24"/>
+        </w:rPr>
+      </w:pPr>
+      <w:r>
+        <w:rPr>
+          <w:sz w:val="24"/>
+        </w:rPr>
+        <w:lastRenderedPageBreak/>
+        <w:br/>
+      </w:r>
+      <w:r>
+        <w:rPr>
+          <w:sz w:val="24"/>
+        </w:rPr>
+        <w:t xml:space="preserve">Problem 4: In the </w:t>
+      </w:r>
+      <w:r>
+        <w:rPr>
+          <w:sz w:val="24"/>
+        </w:rPr>
+        <w:t>Education &amp; Internships</w:t>
+      </w:r>
+      <w:r>
+        <w:rPr>
+          <w:sz w:val="24"/>
+        </w:rPr>
+        <w:t xml:space="preserve"> part of the code, the input field types need </w:t>
+      </w:r>
+      <w:proofErr w:type="spellStart"/>
+      <w:r>
+        <w:rPr>
+          <w:sz w:val="24"/>
+        </w:rPr>
+        <w:t>tobe</w:t>
+      </w:r>
+      <w:proofErr w:type="spellEnd"/>
+      <w:r>
+        <w:rPr>
+          <w:sz w:val="24"/>
+        </w:rPr>
+        <w:t xml:space="preserve"> changed.</w:t>
+      </w:r>
+      <w:r>
+        <w:rPr>
+          <w:sz w:val="24"/>
+        </w:rPr>
+        <w:br/>
+      </w:r>
+      <w:r>
+        <w:rPr>
+          <w:sz w:val="24"/>
+        </w:rPr>
+        <w:br/>
+        <w:t>Changes Required: Under undergraduate degree for Degree / major, use drop down list with predefined list of degrees.</w:t>
+      </w:r>
+      <w:r>
+        <w:rPr>
+          <w:sz w:val="24"/>
+        </w:rPr>
+        <w:br/>
+        <w:t>It should include only bachelor degrees and it should be related to engineering, commerce or IT. It can also include any specialization degree as well. Minimum 6-7 list of degrees would be good.</w:t>
+      </w:r>
+      <w:r>
+        <w:rPr>
+          <w:sz w:val="24"/>
+        </w:rPr>
+        <w:br/>
+      </w:r>
+      <w:r>
+        <w:rPr>
+          <w:sz w:val="24"/>
+        </w:rPr>
+        <w:br/>
+        <w:t xml:space="preserve">For example: BCA, BBA, </w:t>
+      </w:r>
+      <w:proofErr w:type="spellStart"/>
+      <w:r>
+        <w:rPr>
+          <w:sz w:val="24"/>
+        </w:rPr>
+        <w:t>Btech</w:t>
+      </w:r>
+      <w:proofErr w:type="spellEnd"/>
+      <w:r>
+        <w:rPr>
+          <w:sz w:val="24"/>
+        </w:rPr>
+        <w:t xml:space="preserve">, BSc, </w:t>
+      </w:r>
+      <w:proofErr w:type="spellStart"/>
+      <w:r>
+        <w:rPr>
+          <w:sz w:val="24"/>
+        </w:rPr>
+        <w:t>Bcom</w:t>
+      </w:r>
+      <w:proofErr w:type="spellEnd"/>
+      <w:r>
+        <w:rPr>
+          <w:sz w:val="24"/>
+        </w:rPr>
+        <w:t xml:space="preserve"> etc.</w:t>
+      </w:r>
+      <w:r>
+        <w:rPr>
+          <w:sz w:val="24"/>
+        </w:rPr>
+        <w:br/>
+      </w:r>
+      <w:r>
+        <w:rPr>
+          <w:sz w:val="24"/>
+        </w:rPr>
+        <w:br/>
+      </w:r>
+      <w:r>
+        <w:rPr>
+          <w:sz w:val="24"/>
+        </w:rPr>
+        <w:br/>
+      </w:r>
+      <w:r>
+        <w:rPr>
+          <w:sz w:val="24"/>
+        </w:rPr>
+        <w:t xml:space="preserve">Under </w:t>
+      </w:r>
+      <w:r>
+        <w:rPr>
+          <w:sz w:val="24"/>
+        </w:rPr>
+        <w:t xml:space="preserve">postgraduate degree also, </w:t>
+      </w:r>
+      <w:r>
+        <w:rPr>
+          <w:sz w:val="24"/>
+        </w:rPr>
+        <w:t>for Degree / major, use drop down list with predefined list of degrees.</w:t>
+      </w:r>
+      <w:r>
+        <w:rPr>
+          <w:sz w:val="24"/>
+        </w:rPr>
+        <w:br/>
+        <w:t xml:space="preserve">It should include only </w:t>
+      </w:r>
+      <w:proofErr w:type="gramStart"/>
+      <w:r>
+        <w:rPr>
+          <w:sz w:val="24"/>
+        </w:rPr>
+        <w:t>masters</w:t>
+      </w:r>
+      <w:proofErr w:type="gramEnd"/>
+      <w:r>
+        <w:rPr>
+          <w:sz w:val="24"/>
+        </w:rPr>
+        <w:t xml:space="preserve"> </w:t>
+      </w:r>
+      <w:r>
+        <w:rPr>
+          <w:sz w:val="24"/>
+        </w:rPr>
+        <w:t>degrees</w:t>
+      </w:r>
+      <w:r>
+        <w:rPr>
+          <w:sz w:val="24"/>
+        </w:rPr>
+        <w:t xml:space="preserve"> that are </w:t>
+      </w:r>
+      <w:r>
+        <w:rPr>
+          <w:sz w:val="24"/>
+        </w:rPr>
+        <w:t>related to engineering, commerce or IT</w:t>
+      </w:r>
+      <w:r>
+        <w:rPr>
+          <w:sz w:val="24"/>
+        </w:rPr>
+        <w:t>.</w:t>
+      </w:r>
+      <w:r>
+        <w:rPr>
+          <w:sz w:val="24"/>
+        </w:rPr>
+        <w:br/>
+      </w:r>
+      <w:r>
+        <w:rPr>
+          <w:sz w:val="24"/>
+        </w:rPr>
+        <w:br/>
+        <w:t xml:space="preserve">For example: MCA, </w:t>
+      </w:r>
+      <w:proofErr w:type="spellStart"/>
+      <w:r>
+        <w:rPr>
+          <w:sz w:val="24"/>
+        </w:rPr>
+        <w:t>Mtech</w:t>
+      </w:r>
+      <w:proofErr w:type="spellEnd"/>
+      <w:r>
+        <w:rPr>
+          <w:sz w:val="24"/>
+        </w:rPr>
+        <w:t>, MBA etc…</w:t>
+      </w:r>
+    </w:p>
+    <w:p>
+      <w:pPr>
+        <w:rPr>
+          <w:sz w:val="24"/>
+        </w:rPr>
+      </w:pPr>
+    </w:p>
+    <w:p>
+      <w:pPr>
+        <w:rPr>
+          <w:sz w:val="24"/>
+        </w:rPr>
+      </w:pPr>
+    </w:p>
+    <w:p>
+      <w:pPr>
+        <w:rPr>
+          <w:sz w:val="24"/>
+        </w:rPr>
+      </w:pPr>
+    </w:p>
+    <w:p>
+      <w:pPr>
+        <w:rPr>
+          <w:sz w:val="24"/>
+        </w:rPr>
+      </w:pPr>
+    </w:p>
+    <w:p>
+      <w:pPr>
+        <w:rPr>
+          <w:sz w:val="24"/>
+        </w:rPr>
+      </w:pPr>
+    </w:p>
+    <w:p>
+      <w:pPr>
+        <w:rPr>
+          <w:sz w:val="24"/>
+        </w:rPr>
+      </w:pPr>
+    </w:p>
+    <w:p>
+      <w:pPr>
+        <w:rPr>
+          <w:sz w:val="24"/>
+        </w:rPr>
+      </w:pPr>
+    </w:p>
+    <w:p>
+      <w:pPr>
+        <w:rPr>
+          <w:sz w:val="24"/>
+        </w:rPr>
+      </w:pPr>
+    </w:p>
+    <w:p>
+      <w:pPr>
+        <w:rPr>
+          <w:sz w:val="24"/>
+        </w:rPr>
+      </w:pPr>
+    </w:p>
+    <w:p>
+      <w:pPr>
+        <w:rPr>
+          <w:sz w:val="24"/>
+        </w:rPr>
+      </w:pPr>
+    </w:p>
+    <w:p>
+      <w:pPr>
+        <w:rPr>
+          <w:sz w:val="24"/>
+        </w:rPr>
+      </w:pPr>
+    </w:p>
+    <w:p>
+      <w:pPr>
+        <w:rPr>
+          <w:sz w:val="24"/>
+        </w:rPr>
+      </w:pPr>
+    </w:p>
+    <w:p>
+      <w:pPr>
+        <w:rPr>
+          <w:sz w:val="24"/>
+        </w:rPr>
+      </w:pPr>
+    </w:p>
+    <w:p>
+      <w:pPr>
+        <w:rPr>
+          <w:sz w:val="24"/>
+        </w:rPr>
+      </w:pPr>
+    </w:p>
+    <w:p>
+      <w:pPr>
+        <w:rPr>
+          <w:sz w:val="24"/>
+        </w:rPr>
+      </w:pPr>
+    </w:p>
+    <w:p>
+      <w:pPr>
+        <w:rPr>
+          <w:sz w:val="24"/>
+        </w:rPr>
+      </w:pPr>
+    </w:p>
+    <w:p>
+      <w:pPr>
+        <w:rPr>
+          <w:sz w:val="24"/>
+        </w:rPr>
+      </w:pPr>
+    </w:p>
+    <w:p>
+      <w:pPr>
+        <w:rPr>
+          <w:sz w:val="24"/>
+        </w:rPr>
+      </w:pPr>
+    </w:p>
+    <w:p>
+      <w:pPr>
+        <w:rPr>
+          <w:b/>
+          <w:sz w:val="28"/>
+        </w:rPr>
+      </w:pPr>
+      <w:r>
+        <w:rPr>
+          <w:b/>
+          <w:sz w:val="28"/>
+        </w:rPr>
+        <w:t xml:space="preserve">Prompt 21 [Controlling data storage for newly create account] </w:t>
+      </w:r>
+    </w:p>
+    <w:p>
+      <w:pPr>
+        <w:rPr>
+          <w:sz w:val="24"/>
+        </w:rPr>
+      </w:pPr>
+      <w:proofErr w:type="gramStart"/>
+      <w:r>
+        <w:rPr>
+          <w:sz w:val="24"/>
+        </w:rPr>
+        <w:t>what</w:t>
+      </w:r>
+      <w:proofErr w:type="gramEnd"/>
+      <w:r>
+        <w:rPr>
+          <w:sz w:val="24"/>
+        </w:rPr>
+        <w:t xml:space="preserve"> if the user reloads the page accidently or clicks on any other link that gets him/her redirected back to registration or create account part of the page.</w:t>
+      </w:r>
+      <w:r>
+        <w:rPr>
+          <w:sz w:val="24"/>
+        </w:rPr>
+        <w:br/>
+      </w:r>
+      <w:r>
+        <w:rPr>
+          <w:sz w:val="24"/>
+        </w:rPr>
+        <w:br/>
+        <w:t>That means the user is not officially registered yet and has to fill in the details.</w:t>
+      </w:r>
+      <w:r>
+        <w:rPr>
+          <w:sz w:val="24"/>
+        </w:rPr>
+        <w:br/>
+      </w:r>
+      <w:r>
+        <w:rPr>
+          <w:sz w:val="24"/>
+        </w:rPr>
+        <w:br/>
+        <w:t xml:space="preserve">Changes Required: When user clicks on create account, the data must be temporarily stored in the database. If the user refreshes or clicks on any other links that gets him redirected to a different page, the data must be erased from the database. The user data must be permanently stored only after filling all the form details in the </w:t>
+      </w:r>
+      <w:proofErr w:type="spellStart"/>
+      <w:r>
+        <w:rPr>
+          <w:sz w:val="24"/>
+          <w:szCs w:val="24"/>
+        </w:rPr>
+        <w:t>RegistrationFlow.jsx</w:t>
+      </w:r>
+      <w:proofErr w:type="spellEnd"/>
+      <w:r>
+        <w:rPr>
+          <w:sz w:val="24"/>
+          <w:szCs w:val="24"/>
+        </w:rPr>
+        <w:t>.</w:t>
+      </w:r>
+      <w:r>
+        <w:rPr>
+          <w:sz w:val="24"/>
+        </w:rPr>
+        <w:br/>
+      </w:r>
+      <w:proofErr w:type="gramStart"/>
+      <w:r>
+        <w:rPr>
+          <w:sz w:val="24"/>
+        </w:rPr>
+        <w:t>and</w:t>
+      </w:r>
+      <w:proofErr w:type="gramEnd"/>
+      <w:r>
+        <w:rPr>
+          <w:sz w:val="24"/>
+        </w:rPr>
+        <w:t xml:space="preserve"> completing the email verification process.</w:t>
+      </w:r>
+    </w:p>
+    <w:p>
+      <w:pPr>
+        <w:rPr>
+          <w:sz w:val="24"/>
+        </w:rPr>
+      </w:pPr>
+    </w:p>
+    <w:p>
+      <w:pPr>
+        <w:rPr>
+          <w:sz w:val="24"/>
+        </w:rPr>
+      </w:pPr>
+      <w:r>
+        <w:rPr>
+          <w:sz w:val="24"/>
+        </w:rPr>
+        <w:br/>
+      </w:r>
+      <w:r>
+        <w:rPr>
+          <w:sz w:val="24"/>
+        </w:rPr>
+        <w:t xml:space="preserve">Code part for reference: </w:t>
+      </w:r>
+      <w:r>
+        <w:rPr>
+          <w:sz w:val="24"/>
+        </w:rPr>
+        <w:br/>
+      </w:r>
+      <w:r>
+        <w:rPr>
+          <w:sz w:val="24"/>
+        </w:rPr>
+        <w:t>{step === 0 &amp;&amp; (</w:t>
+      </w:r>
+    </w:p>
+    <w:p>
+      <w:pPr>
+        <w:rPr>
+          <w:sz w:val="24"/>
+        </w:rPr>
+      </w:pPr>
+      <w:r>
+        <w:rPr>
+          <w:sz w:val="24"/>
+        </w:rPr>
+        <w:t xml:space="preserve">        &lt;main </w:t>
+      </w:r>
+      <w:proofErr w:type="spellStart"/>
+      <w:r>
+        <w:rPr>
+          <w:sz w:val="24"/>
+        </w:rPr>
+        <w:t>className</w:t>
+      </w:r>
+      <w:proofErr w:type="spellEnd"/>
+      <w:r>
+        <w:rPr>
+          <w:sz w:val="24"/>
+        </w:rPr>
+        <w:t xml:space="preserve">="flex-grow flex flex-col </w:t>
+      </w:r>
+      <w:proofErr w:type="spellStart"/>
+      <w:r>
+        <w:rPr>
+          <w:sz w:val="24"/>
+        </w:rPr>
+        <w:t>md</w:t>
+      </w:r>
+      <w:proofErr w:type="gramStart"/>
+      <w:r>
+        <w:rPr>
+          <w:sz w:val="24"/>
+        </w:rPr>
+        <w:t>:flex</w:t>
+      </w:r>
+      <w:proofErr w:type="gramEnd"/>
+      <w:r>
+        <w:rPr>
+          <w:sz w:val="24"/>
+        </w:rPr>
+        <w:t>-row</w:t>
+      </w:r>
+      <w:proofErr w:type="spellEnd"/>
+      <w:r>
+        <w:rPr>
+          <w:sz w:val="24"/>
+        </w:rPr>
+        <w:t xml:space="preserve"> max-w-7xl mx-auto w-full pt-8"&gt;</w:t>
+      </w:r>
+    </w:p>
+    <w:p>
+      <w:pPr>
+        <w:rPr>
+          <w:sz w:val="24"/>
+        </w:rPr>
+      </w:pPr>
+      <w:r>
+        <w:rPr>
+          <w:sz w:val="24"/>
+        </w:rPr>
+        <w:t>…………………………….</w:t>
+      </w:r>
+      <w:r>
+        <w:rPr>
+          <w:sz w:val="24"/>
+        </w:rPr>
+        <w:t xml:space="preserve">        </w:t>
+      </w:r>
+      <w:r>
+        <w:rPr>
+          <w:sz w:val="24"/>
+        </w:rPr>
+        <w:br/>
+      </w:r>
+      <w:r>
+        <w:rPr>
+          <w:sz w:val="24"/>
+        </w:rPr>
+        <w:t>&lt;/main&gt;</w:t>
+      </w:r>
+    </w:p>
+    <w:p>
+      <w:pPr>
+        <w:rPr>
+          <w:sz w:val="24"/>
+        </w:rPr>
+      </w:pPr>
+      <w:r>
+        <w:rPr>
+          <w:sz w:val="24"/>
+        </w:rPr>
+        <w:t xml:space="preserve">      )}</w:t>
+      </w:r>
+    </w:p>
+    <w:p>
+      <w:pPr>
+        <w:rPr>
+          <w:sz w:val="24"/>
+        </w:rPr>
+      </w:pPr>
+      <w:r>
+        <w:rPr>
+          <w:sz w:val="24"/>
+        </w:rPr>
+        <w:br/>
+      </w:r>
+      <w:r>
+        <w:rPr>
+          <w:sz w:val="24"/>
+        </w:rPr>
+        <w:br/>
+      </w:r>
+      <w:r>
+        <w:rPr>
+          <w:sz w:val="24"/>
+        </w:rPr>
+        <w:t xml:space="preserve">  {</w:t>
+      </w:r>
+      <w:proofErr w:type="gramStart"/>
+      <w:r>
+        <w:rPr>
+          <w:sz w:val="24"/>
+        </w:rPr>
+        <w:t>step</w:t>
+      </w:r>
+      <w:proofErr w:type="gramEnd"/>
+      <w:r>
+        <w:rPr>
+          <w:sz w:val="24"/>
+        </w:rPr>
+        <w:t xml:space="preserve"> === 1 &amp;&amp; (</w:t>
+      </w:r>
+    </w:p>
+    <w:p>
+      <w:pPr>
+        <w:rPr>
+          <w:sz w:val="24"/>
+        </w:rPr>
+      </w:pPr>
+      <w:r>
+        <w:rPr>
+          <w:sz w:val="24"/>
+        </w:rPr>
+        <w:t xml:space="preserve">        &lt;main </w:t>
+      </w:r>
+      <w:proofErr w:type="spellStart"/>
+      <w:r>
+        <w:rPr>
+          <w:sz w:val="24"/>
+        </w:rPr>
+        <w:t>className</w:t>
+      </w:r>
+      <w:proofErr w:type="spellEnd"/>
+      <w:r>
+        <w:rPr>
+          <w:sz w:val="24"/>
+        </w:rPr>
+        <w:t>="flex-grow mx-auto px-6 py-12 w-full max-w-7xl pt-16"&gt;</w:t>
+      </w:r>
+      <w:r>
+        <w:rPr>
+          <w:sz w:val="24"/>
+        </w:rPr>
+        <w:br/>
+        <w:t>…………………………………………………………………………</w:t>
+      </w:r>
+    </w:p>
+    <w:p>
+      <w:pPr>
+        <w:rPr>
+          <w:sz w:val="24"/>
+        </w:rPr>
+      </w:pPr>
+      <w:r>
+        <w:rPr>
+          <w:sz w:val="24"/>
+        </w:rPr>
+        <w:t xml:space="preserve">        &lt;/main&gt;</w:t>
+      </w:r>
+    </w:p>
+    <w:p>
+      <w:pPr>
+        <w:rPr>
+          <w:sz w:val="24"/>
+        </w:rPr>
+      </w:pPr>
+      <w:r>
+        <w:rPr>
+          <w:sz w:val="24"/>
+        </w:rPr>
+        <w:t xml:space="preserve">      </w:t>
+      </w:r>
+      <w:proofErr w:type="gramStart"/>
+      <w:r>
+        <w:rPr>
+          <w:sz w:val="24"/>
+        </w:rPr>
+        <w:t>)}</w:t>
+      </w:r>
+      <w:proofErr w:type="gramEnd"/>
+      <w:r>
+        <w:rPr>
+          <w:sz w:val="24"/>
+        </w:rPr>
+        <w:br/>
+      </w:r>
+      <w:r>
+        <w:rPr>
+          <w:sz w:val="24"/>
+        </w:rPr>
+        <w:br/>
+      </w:r>
+      <w:r>
+        <w:rPr>
+          <w:sz w:val="24"/>
+        </w:rPr>
+        <w:br/>
+      </w:r>
+      <w:r>
+        <w:rPr>
+          <w:sz w:val="24"/>
+        </w:rPr>
+        <w:br/>
+      </w:r>
+      <w:r>
+        <w:rPr>
+          <w:sz w:val="24"/>
+        </w:rPr>
+        <w:br/>
+      </w:r>
+      <w:r>
+        <w:rPr>
+          <w:sz w:val="24"/>
+        </w:rPr>
+        <w:t>{step === 2 &amp;&amp; (</w:t>
+      </w:r>
+    </w:p>
+    <w:p>
+      <w:pPr>
+        <w:rPr>
+          <w:sz w:val="24"/>
+        </w:rPr>
+      </w:pPr>
+      <w:r>
+        <w:rPr>
+          <w:sz w:val="24"/>
+        </w:rPr>
+        <w:t xml:space="preserve">        &lt;main </w:t>
+      </w:r>
+      <w:proofErr w:type="spellStart"/>
+      <w:r>
+        <w:rPr>
+          <w:sz w:val="24"/>
+        </w:rPr>
+        <w:t>className</w:t>
+      </w:r>
+      <w:proofErr w:type="spellEnd"/>
+      <w:r>
+        <w:rPr>
+          <w:sz w:val="24"/>
+        </w:rPr>
+        <w:t>="flex-grow py-12 px-4 md</w:t>
+      </w:r>
+      <w:proofErr w:type="gramStart"/>
+      <w:r>
+        <w:rPr>
+          <w:sz w:val="24"/>
+        </w:rPr>
+        <w:t>:px</w:t>
+      </w:r>
+      <w:proofErr w:type="gramEnd"/>
+      <w:r>
+        <w:rPr>
+          <w:sz w:val="24"/>
+        </w:rPr>
+        <w:t>-10 pt-16"&gt;</w:t>
+      </w:r>
+      <w:r>
+        <w:rPr>
+          <w:sz w:val="24"/>
+        </w:rPr>
+        <w:br/>
+        <w:t xml:space="preserve"> ………………………………………………</w:t>
+      </w:r>
+    </w:p>
+    <w:p>
+      <w:pPr>
+        <w:rPr>
+          <w:sz w:val="24"/>
+        </w:rPr>
+      </w:pPr>
+      <w:r>
+        <w:rPr>
+          <w:sz w:val="24"/>
+        </w:rPr>
+        <w:t xml:space="preserve"> </w:t>
+      </w:r>
+      <w:r>
+        <w:rPr>
+          <w:sz w:val="24"/>
+        </w:rPr>
+        <w:t xml:space="preserve">        &lt;/main&gt;</w:t>
+      </w:r>
+    </w:p>
+    <w:p>
+      <w:pPr>
+        <w:rPr>
+          <w:sz w:val="24"/>
+        </w:rPr>
+      </w:pPr>
+      <w:r>
+        <w:rPr>
+          <w:sz w:val="24"/>
+        </w:rPr>
+        <w:lastRenderedPageBreak/>
+        <w:t xml:space="preserve">      </w:t>
+      </w:r>
+      <w:proofErr w:type="gramStart"/>
+      <w:r>
+        <w:rPr>
+          <w:sz w:val="24"/>
+        </w:rPr>
+        <w:t>)}</w:t>
+      </w:r>
+      <w:proofErr w:type="gramEnd"/>
+      <w:r>
+        <w:rPr>
+          <w:sz w:val="24"/>
+        </w:rPr>
+        <w:br/>
+      </w:r>
+      <w:r>
+        <w:rPr>
+          <w:sz w:val="24"/>
+        </w:rPr>
+        <w:br/>
+      </w:r>
+      <w:r>
+        <w:rPr>
+          <w:sz w:val="24"/>
+        </w:rPr>
+        <w:br/>
+      </w:r>
+      <w:r>
+        <w:rPr>
+          <w:sz w:val="24"/>
+        </w:rPr>
+        <w:t>{step === 3 &amp;&amp; (</w:t>
+      </w:r>
+    </w:p>
+    <w:p>
+      <w:pPr>
+        <w:rPr>
+          <w:sz w:val="24"/>
+        </w:rPr>
+      </w:pPr>
+      <w:r>
+        <w:rPr>
+          <w:sz w:val="24"/>
+        </w:rPr>
+        <w:t xml:space="preserve">        &lt;main </w:t>
+      </w:r>
+      <w:proofErr w:type="spellStart"/>
+      <w:r>
+        <w:rPr>
+          <w:sz w:val="24"/>
+        </w:rPr>
+        <w:t>className</w:t>
+      </w:r>
+      <w:proofErr w:type="spellEnd"/>
+      <w:r>
+        <w:rPr>
+          <w:sz w:val="24"/>
+        </w:rPr>
+        <w:t>="flex-grow pt-32 pb-20 flex items-</w:t>
+      </w:r>
+      <w:proofErr w:type="spellStart"/>
+      <w:r>
+        <w:rPr>
+          <w:sz w:val="24"/>
+        </w:rPr>
+        <w:t>center</w:t>
+      </w:r>
+      <w:proofErr w:type="spellEnd"/>
+      <w:r>
+        <w:rPr>
+          <w:sz w:val="24"/>
+        </w:rPr>
+        <w:t xml:space="preserve"> justify-</w:t>
+      </w:r>
+      <w:proofErr w:type="spellStart"/>
+      <w:r>
+        <w:rPr>
+          <w:sz w:val="24"/>
+        </w:rPr>
+        <w:t>center</w:t>
+      </w:r>
+      <w:proofErr w:type="spellEnd"/>
+      <w:r>
+        <w:rPr>
+          <w:sz w:val="24"/>
+        </w:rPr>
+        <w:t xml:space="preserve"> px-4"&gt;</w:t>
+      </w:r>
+    </w:p>
+    <w:p>
+      <w:pPr>
+        <w:rPr>
+          <w:sz w:val="24"/>
+        </w:rPr>
+      </w:pPr>
+      <w:r>
+        <w:rPr>
+          <w:sz w:val="24"/>
+        </w:rPr>
+        <w:t xml:space="preserve">  </w:t>
+      </w:r>
+      <w:r>
+        <w:rPr>
+          <w:sz w:val="24"/>
+        </w:rPr>
+        <w:t>………………………………………..</w:t>
+      </w:r>
+    </w:p>
+    <w:p>
+      <w:pPr>
+        <w:rPr>
+          <w:sz w:val="24"/>
+        </w:rPr>
+      </w:pPr>
+      <w:r>
+        <w:rPr>
+          <w:sz w:val="24"/>
+        </w:rPr>
+        <w:t xml:space="preserve">        &lt;/main&gt;</w:t>
+      </w:r>
+    </w:p>
+    <w:p>
+      <w:pPr>
+        <w:rPr>
+          <w:sz w:val="24"/>
+        </w:rPr>
+      </w:pPr>
+      <w:r>
+        <w:rPr>
+          <w:sz w:val="24"/>
+        </w:rPr>
+        <w:t xml:space="preserve">      )}</w:t>
+      </w:r>
+      <w:r>
+        <w:rPr>
+          <w:sz w:val="24"/>
+        </w:rPr>
+        <w:br/>
+      </w:r>
+    </w:p>
+    <w:p>
+      <w:pPr>
+        <w:rPr>
+          <w:sz w:val="24"/>
+        </w:rPr>
+      </w:pPr>
+      <w:r>
+        <w:rPr>
+          <w:sz w:val="24"/>
+        </w:rPr>
+        <w:br/>
+      </w:r>
+      <w:r>
+        <w:rPr>
+          <w:sz w:val="24"/>
+        </w:rPr>
+        <w:t>Prompt 22 [Email OTP solution</w:t>
+      </w:r>
+      <w:proofErr w:type="gramStart"/>
+      <w:r>
+        <w:rPr>
+          <w:sz w:val="24"/>
+        </w:rPr>
+        <w:t>]</w:t>
+      </w:r>
+      <w:proofErr w:type="gramEnd"/>
+      <w:r>
+        <w:rPr>
+          <w:sz w:val="24"/>
+        </w:rPr>
+        <w:br/>
+      </w:r>
+      <w:r>
+        <w:rPr>
+          <w:sz w:val="24"/>
+        </w:rPr>
+        <w:br/>
+        <w:t xml:space="preserve">Problem: The email OTP is not being sent to user’s email. No code </w:t>
+      </w:r>
+      <w:proofErr w:type="gramStart"/>
+      <w:r>
+        <w:rPr>
+          <w:sz w:val="24"/>
+        </w:rPr>
+        <w:t>Is</w:t>
+      </w:r>
+      <w:proofErr w:type="gramEnd"/>
+      <w:r>
+        <w:rPr>
+          <w:sz w:val="24"/>
+        </w:rPr>
+        <w:t xml:space="preserve"> received in their mail.</w:t>
+      </w:r>
+      <w:r>
+        <w:rPr>
+          <w:sz w:val="24"/>
+        </w:rPr>
+        <w:br/>
+      </w:r>
+      <w:r>
+        <w:rPr>
+          <w:sz w:val="24"/>
+        </w:rPr>
+        <w:br/>
+        <w:t>Changes required: Make the Email OTP work properly and send code to the user’s email.</w:t>
+      </w:r>
+      <w:r>
+        <w:rPr>
+          <w:sz w:val="24"/>
+        </w:rPr>
+        <w:br/>
+      </w:r>
+      <w:r>
+        <w:rPr>
+          <w:sz w:val="24"/>
+        </w:rPr>
+        <w:br/>
+        <w:t>Code reference:</w:t>
+      </w:r>
+    </w:p>
+    <w:p>
+      <w:pPr>
+        <w:rPr>
+          <w:sz w:val="24"/>
+        </w:rPr>
+      </w:pPr>
+      <w:r>
+        <w:rPr>
+          <w:sz w:val="24"/>
+        </w:rPr>
+        <w:t>{</w:t>
+      </w:r>
+      <w:proofErr w:type="gramStart"/>
+      <w:r>
+        <w:rPr>
+          <w:sz w:val="24"/>
+        </w:rPr>
+        <w:t>step</w:t>
+      </w:r>
+      <w:proofErr w:type="gramEnd"/>
+      <w:r>
+        <w:rPr>
+          <w:sz w:val="24"/>
+        </w:rPr>
+        <w:t xml:space="preserve"> === 3 &amp;&amp; (</w:t>
+      </w:r>
+    </w:p>
+    <w:p>
+      <w:pPr>
+        <w:rPr>
+          <w:sz w:val="24"/>
+        </w:rPr>
+      </w:pPr>
+      <w:r>
+        <w:rPr>
+          <w:sz w:val="24"/>
+        </w:rPr>
+        <w:t xml:space="preserve">        &lt;main </w:t>
+      </w:r>
+      <w:proofErr w:type="spellStart"/>
+      <w:r>
+        <w:rPr>
+          <w:sz w:val="24"/>
+        </w:rPr>
+        <w:t>className</w:t>
+      </w:r>
+      <w:proofErr w:type="spellEnd"/>
+      <w:r>
+        <w:rPr>
+          <w:sz w:val="24"/>
+        </w:rPr>
+        <w:t>="flex-grow pt-32 pb-20 flex items-</w:t>
+      </w:r>
+      <w:proofErr w:type="spellStart"/>
+      <w:r>
+        <w:rPr>
+          <w:sz w:val="24"/>
+        </w:rPr>
+        <w:t>center</w:t>
+      </w:r>
+      <w:proofErr w:type="spellEnd"/>
+      <w:r>
+        <w:rPr>
+          <w:sz w:val="24"/>
+        </w:rPr>
+        <w:t xml:space="preserve"> justify-</w:t>
+      </w:r>
+      <w:proofErr w:type="spellStart"/>
+      <w:r>
+        <w:rPr>
+          <w:sz w:val="24"/>
+        </w:rPr>
+        <w:t>center</w:t>
+      </w:r>
+      <w:proofErr w:type="spellEnd"/>
+      <w:r>
+        <w:rPr>
+          <w:sz w:val="24"/>
+        </w:rPr>
+        <w:t xml:space="preserve"> px-4"&gt;</w:t>
+      </w:r>
+    </w:p>
+    <w:p>
+      <w:pPr>
+        <w:rPr>
+          <w:sz w:val="24"/>
+        </w:rPr>
+      </w:pPr>
+      <w:r>
+        <w:rPr>
+          <w:sz w:val="24"/>
+        </w:rPr>
+        <w:t xml:space="preserve">  </w:t>
+      </w:r>
+      <w:r>
+        <w:rPr>
+          <w:sz w:val="24"/>
+        </w:rPr>
+        <w:t>………………………………………..</w:t>
+      </w:r>
+    </w:p>
+    <w:p>
+      <w:pPr>
+        <w:rPr>
+          <w:sz w:val="24"/>
+        </w:rPr>
+      </w:pPr>
+      <w:r>
+        <w:rPr>
+          <w:sz w:val="24"/>
+        </w:rPr>
+        <w:t xml:space="preserve">        &lt;/main&gt;</w:t>
+      </w:r>
+    </w:p>
+    <w:p>
+      <w:pPr>
+        <w:rPr>
+          <w:b/>
+          <w:sz w:val="32"/>
+        </w:rPr>
+      </w:pPr>
+      <w:r>
+        <w:rPr>
+          <w:sz w:val="24"/>
+        </w:rPr>
+        <w:t xml:space="preserve">      </w:t>
+      </w:r>
+      <w:proofErr w:type="gramStart"/>
+      <w:r>
+        <w:rPr>
+          <w:sz w:val="24"/>
+        </w:rPr>
+        <w:t>)}</w:t>
+      </w:r>
+      <w:proofErr w:type="gramEnd"/>
+      <w:r>
+        <w:rPr>
+          <w:sz w:val="24"/>
+        </w:rPr>
+        <w:br/>
+      </w:r>
+      <w:r>
+        <w:rPr>
+          <w:sz w:val="24"/>
+        </w:rPr>
+        <w:br/>
+      </w:r>
+      <w:r>
+        <w:rPr>
+          <w:sz w:val="24"/>
+        </w:rPr>
+        <w:br/>
+      </w:r>
+      <w:r>
+        <w:rPr>
+          <w:b/>
+          <w:sz w:val="32"/>
+        </w:rPr>
+        <w:t>FORM FILLING DATA</w:t>
+      </w:r>
+    </w:p>
+    <w:p>
+      <w:pPr>
+        <w:rPr>
+          <w:b/>
+          <w:sz w:val="28"/>
+        </w:rPr>
+      </w:pPr>
+      <w:r>
+        <w:rPr>
+          <w:b/>
+          <w:sz w:val="28"/>
+        </w:rPr>
+        <w:t>Personal Information</w:t>
+      </w:r>
+    </w:p>
+    <w:p>
+      <w:pPr>
+        <w:rPr>
+          <w:sz w:val="28"/>
+        </w:rPr>
+      </w:pPr>
+      <w:r>
+        <w:rPr>
+          <w:sz w:val="28"/>
+        </w:rPr>
+        <w:t>Abhishek</w:t>
+      </w:r>
+      <w:r>
+        <w:rPr>
+          <w:sz w:val="28"/>
+        </w:rPr>
+        <w:br/>
+        <w:t>Kumar</w:t>
+      </w:r>
+      <w:r>
+        <w:rPr>
+          <w:sz w:val="28"/>
+        </w:rPr>
+        <w:br/>
+      </w:r>
+      <w:hyperlink r:id="rId9" w:history="1">
+        <w:r>
+          <w:rPr>
+            <w:rStyle w:val="Hyperlink"/>
+            <w:sz w:val="28"/>
+          </w:rPr>
+          <w:t>abhishek123@gmail.com</w:t>
+        </w:r>
+      </w:hyperlink>
+    </w:p>
+    <w:p>
+      <w:pPr>
+        <w:rPr>
+          <w:sz w:val="28"/>
+        </w:rPr>
+      </w:pPr>
+      <w:r>
+        <w:rPr>
+          <w:sz w:val="28"/>
+        </w:rPr>
+        <w:t>9981567829</w:t>
+      </w:r>
+    </w:p>
+    <w:p>
+      <w:pPr>
+        <w:rPr>
+          <w:sz w:val="28"/>
+        </w:rPr>
+      </w:pPr>
+      <w:r>
+        <w:rPr>
+          <w:sz w:val="28"/>
+        </w:rPr>
+        <w:t xml:space="preserve">No 23, Ronald villa, </w:t>
+      </w:r>
+      <w:proofErr w:type="spellStart"/>
+      <w:r>
+        <w:rPr>
+          <w:sz w:val="28"/>
+        </w:rPr>
+        <w:t>jakkur</w:t>
+      </w:r>
+      <w:proofErr w:type="spellEnd"/>
+      <w:r>
+        <w:rPr>
+          <w:sz w:val="28"/>
+        </w:rPr>
+        <w:br/>
+      </w:r>
+    </w:p>
+    <w:p>
+      <w:pPr>
+        <w:rPr>
+          <w:sz w:val="28"/>
+        </w:rPr>
+      </w:pPr>
+    </w:p>
+    <w:p>
+      <w:pPr>
+        <w:rPr>
+          <w:b/>
+          <w:sz w:val="28"/>
+        </w:rPr>
+      </w:pPr>
+      <w:r>
+        <w:rPr>
+          <w:b/>
+          <w:sz w:val="28"/>
+        </w:rPr>
+        <w:t>School</w:t>
+      </w:r>
+    </w:p>
+    <w:p>
+      <w:pPr>
+        <w:rPr>
+          <w:sz w:val="28"/>
+        </w:rPr>
+      </w:pPr>
+      <w:proofErr w:type="spellStart"/>
+      <w:r>
+        <w:rPr>
+          <w:sz w:val="28"/>
+        </w:rPr>
+        <w:lastRenderedPageBreak/>
+        <w:t>Kendriya</w:t>
+      </w:r>
+      <w:proofErr w:type="spellEnd"/>
+      <w:r>
+        <w:rPr>
+          <w:sz w:val="28"/>
+        </w:rPr>
+        <w:t xml:space="preserve"> </w:t>
+      </w:r>
+      <w:proofErr w:type="spellStart"/>
+      <w:r>
+        <w:rPr>
+          <w:sz w:val="28"/>
+        </w:rPr>
+        <w:t>Vidyalaya</w:t>
+      </w:r>
+      <w:proofErr w:type="spellEnd"/>
+      <w:r>
+        <w:rPr>
+          <w:sz w:val="28"/>
+        </w:rPr>
+        <w:t xml:space="preserve"> </w:t>
+      </w:r>
+    </w:p>
+    <w:p>
+      <w:pPr>
+        <w:rPr>
+          <w:sz w:val="28"/>
+        </w:rPr>
+      </w:pPr>
+      <w:r>
+        <w:rPr>
+          <w:sz w:val="28"/>
+        </w:rPr>
+        <w:t>2019</w:t>
+      </w:r>
+    </w:p>
+    <w:p>
+      <w:pPr>
+        <w:rPr>
+          <w:sz w:val="28"/>
+        </w:rPr>
+      </w:pPr>
+      <w:r>
+        <w:rPr>
+          <w:sz w:val="28"/>
+        </w:rPr>
+        <w:t>78</w:t>
+      </w:r>
+    </w:p>
+    <w:p>
+      <w:pPr>
+        <w:rPr>
+          <w:sz w:val="28"/>
+        </w:rPr>
+      </w:pPr>
+    </w:p>
+    <w:p>
+      <w:pPr>
+        <w:rPr>
+          <w:b/>
+          <w:sz w:val="28"/>
+        </w:rPr>
+      </w:pPr>
+      <w:r>
+        <w:rPr>
+          <w:b/>
+          <w:sz w:val="28"/>
+        </w:rPr>
+        <w:t>Undergraduate Degree</w:t>
+      </w:r>
+    </w:p>
+    <w:p>
+      <w:pPr>
+        <w:rPr>
+          <w:sz w:val="28"/>
+        </w:rPr>
+      </w:pPr>
+      <w:r>
+        <w:rPr>
+          <w:sz w:val="28"/>
+        </w:rPr>
+        <w:t>BCA</w:t>
+      </w:r>
+    </w:p>
+    <w:p>
+      <w:pPr>
+        <w:rPr>
+          <w:sz w:val="28"/>
+        </w:rPr>
+      </w:pPr>
+      <w:r>
+        <w:rPr>
+          <w:sz w:val="28"/>
+        </w:rPr>
+        <w:t>Presidency</w:t>
+      </w:r>
+    </w:p>
+    <w:p>
+      <w:pPr>
+        <w:rPr>
+          <w:sz w:val="28"/>
+        </w:rPr>
+      </w:pPr>
+    </w:p>
+    <w:p>
+      <w:pPr>
+        <w:rPr>
+          <w:sz w:val="28"/>
+        </w:rPr>
+      </w:pPr>
+      <w:r>
+        <w:rPr>
+          <w:sz w:val="28"/>
+        </w:rPr>
+        <w:t xml:space="preserve">App password: </w:t>
+      </w:r>
+      <w:proofErr w:type="spellStart"/>
+      <w:r>
+        <w:rPr>
+          <w:sz w:val="28"/>
+        </w:rPr>
+        <w:t>gyvc</w:t>
+      </w:r>
+      <w:proofErr w:type="spellEnd"/>
+      <w:r>
+        <w:rPr>
+          <w:sz w:val="28"/>
+        </w:rPr>
+        <w:t xml:space="preserve"> </w:t>
+      </w:r>
+      <w:proofErr w:type="spellStart"/>
+      <w:r>
+        <w:rPr>
+          <w:sz w:val="28"/>
+        </w:rPr>
+        <w:t>iuhi</w:t>
+      </w:r>
+      <w:proofErr w:type="spellEnd"/>
+      <w:r>
+        <w:rPr>
+          <w:sz w:val="28"/>
+        </w:rPr>
+        <w:t xml:space="preserve"> </w:t>
+      </w:r>
+      <w:proofErr w:type="spellStart"/>
+      <w:r>
+        <w:rPr>
+          <w:sz w:val="28"/>
+        </w:rPr>
+        <w:t>vcrk</w:t>
+      </w:r>
+      <w:proofErr w:type="spellEnd"/>
+      <w:r>
+        <w:rPr>
+          <w:sz w:val="28"/>
+        </w:rPr>
+        <w:t xml:space="preserve"> </w:t>
+      </w:r>
+      <w:proofErr w:type="spellStart"/>
+      <w:r>
+        <w:rPr>
+          <w:sz w:val="28"/>
+        </w:rPr>
+        <w:t>numr</w:t>
+      </w:r>
+      <w:proofErr w:type="spellEnd"/>
+    </w:p>
+    <w:p>
+      <w:pPr>
+        <w:rPr>
+          <w:sz w:val="28"/>
+        </w:rPr>
+      </w:pPr>
+    </w:p>
+    <w:p>
+      <w:pPr>
+        <w:rPr>
+          <w:sz w:val="28"/>
+        </w:rPr>
+      </w:pPr>
+    </w:p>
+    <w:p>
+      <w:pPr>
+        <w:rPr>
+          <w:sz w:val="28"/>
+        </w:rPr>
+      </w:pPr>
+      <w:r>
+        <w:rPr>
+          <w:sz w:val="28"/>
+        </w:rPr>
+        <w:t>&lt;label class="block font-label-caps text-</w:t>
+      </w:r>
+      <w:proofErr w:type="spellStart"/>
+      <w:r>
+        <w:rPr>
+          <w:sz w:val="28"/>
+        </w:rPr>
+        <w:t>xs</w:t>
+      </w:r>
+      <w:proofErr w:type="spellEnd"/>
+      <w:r>
+        <w:rPr>
+          <w:sz w:val="28"/>
+        </w:rPr>
+        <w:t xml:space="preserve"> text-on-surface-variant uppercase trac</w:t>
+      </w:r>
+      <w:r>
+        <w:rPr>
+          <w:sz w:val="28"/>
+        </w:rPr>
+        <w:t>king-widest" for="role-select"&gt;</w:t>
+      </w:r>
+      <w:r>
+        <w:rPr>
+          <w:sz w:val="28"/>
+        </w:rPr>
+        <w:t>Target Role &lt;span class="text-error"&gt;*&lt;/span&gt;</w:t>
+      </w:r>
+      <w:bookmarkStart w:id="0" w:name="_GoBack"/>
+      <w:bookmarkEnd w:id="0"/>
+      <w:r>
+        <w:rPr>
+          <w:sz w:val="28"/>
+        </w:rPr>
+        <w:br/>
+      </w:r>
+      <w:r>
+        <w:rPr>
+          <w:sz w:val="28"/>
+        </w:rPr>
+        <w:br/>
+      </w:r>
+      <w:r>
+        <w:rPr>
+          <w:sz w:val="28"/>
+        </w:rPr>
+        <w:t>&lt;label class="block font-label-caps text-</w:t>
+      </w:r>
+      <w:proofErr w:type="spellStart"/>
+      <w:r>
+        <w:rPr>
+          <w:sz w:val="28"/>
+        </w:rPr>
+        <w:t>xs</w:t>
+      </w:r>
+      <w:proofErr w:type="spellEnd"/>
+      <w:r>
+        <w:rPr>
+          <w:sz w:val="28"/>
+        </w:rPr>
+        <w:t xml:space="preserve"> text-on-surface-variant uppercase tracking</w:t>
+      </w:r>
+      <w:r>
+        <w:rPr>
+          <w:sz w:val="28"/>
+        </w:rPr>
+        <w:t xml:space="preserve">-widest" for="job-description"&gt; </w:t>
+      </w:r>
+      <w:r>
+        <w:rPr>
+          <w:sz w:val="28"/>
+        </w:rPr>
+        <w:t>Job Description / Requirements &lt;span class="text-error"&gt;*&lt;/span&gt;</w:t>
+      </w:r>
+    </w:p>
+    <w:p>
+      <w:pPr>
+        <w:rPr>
+          <w:sz w:val="24"/>
+        </w:rPr>
+      </w:pPr>
+      <w:r>
+        <w:rPr>
+          <w:noProof/>
+          <w:sz w:val="24"/>
+          <w:lang w:eastAsia="en-IN"/>
+        </w:rPr>
+        <w:lastRenderedPageBreak/>
+        <w:drawing>
+          <wp:inline distT="0" distB="0" distL="0" distR="0" wp14:anchorId="57EDEEF1" wp14:editId="7D2B2585">
+            <wp:extent cx="5731510" cy="8137525"/>
+            <wp:effectExtent l="0" t="0" r="2540" b="0"/>
+            <wp:docPr id="5" name="Picture 5"/>
+            <wp:cNvGraphicFramePr>
+              <a:graphicFrameLocks xmlns:a="http://schemas.openxmlformats.org/drawingml/2006/main" noChangeAspect="1"/>
+            </wp:cNvGraphicFramePr>
+            <a:graphic xmlns:a="http://schemas.openxmlformats.org/drawingml/2006/main">
+              <a:graphicData uri="http://schemas.openxmlformats.org/drawingml/2006/picture">
+                <pic:pic xmlns:pic="http://schemas.openxmlformats.org/drawingml/2006/picture">
+                  <pic:nvPicPr>
+                    <pic:cNvPr id="1" name=""/>
+                    <pic:cNvPicPr/>
+                  </pic:nvPicPr>
+                  <pic:blipFill>
+                    <a:blip r:embed="rId10"/>
+                    <a:stretch>
+                      <a:fillRect/>
+                    </a:stretch>
+                  </pic:blipFill>
+                  <pic:spPr>
+                    <a:xfrm>
+                      <a:off x="0" y="0"/>
+                      <a:ext cx="5731510" cy="8137525"/>
+                    </a:xfrm>
+                    <a:prstGeom prst="rect">
+                      <a:avLst/>
+                    </a:prstGeom>
+                  </pic:spPr>
+                </pic:pic>
+              </a:graphicData>
+            </a:graphic>
+          </wp:inline>
+        </w:drawing>
+      </w:r>
+    </w:p>
     <w:sectPr>
       <w:pgSz w:w="11906" w:h="16838"/>
       <w:pgMar w:top="1440" w:right="1440" w:bottom="1440" w:left="1440" w:header="708" w:footer="708" w:gutter="0"/>
@@ -6699,6 +10303,17 @@
       <w:szCs w:val="24"/>
     </w:rPr>
   </w:style>
+  <w:style w:type="character" w:styleId="Hyperlink">
+    <w:name w:val="Hyperlink"/>
+    <w:basedOn w:val="DefaultParagraphFont"/>
+    <w:uiPriority w:val="99"/>
+    <w:unhideWhenUsed/>
+    <w:rsid w:val="00312ED1"/>
+    <w:rPr>
+      <w:color w:val="0563C1" w:themeColor="hyperlink"/>
+      <w:u w:val="single"/>
+    </w:rPr>
+  </w:style>
 </w:styles>
 </file>
 

</xml_diff>

<commit_message>
Modification in layouts,global css, Signin Page and routing
</commit_message>
<xml_diff>
--- a/PBL synopsis/Useful prompts.docx
+++ b/PBL synopsis/Useful prompts.docx
@@ -5316,41 +5316,1075 @@
       <w:pPr>
         <w:rPr>
           <w:sz w:val="24"/>
-          <w:szCs w:val="32"/>
-          <w:lang w:val="en-US"/>
-        </w:rPr>
-      </w:pPr>
-    </w:p>
-    <w:p>
-      <w:pPr>
-        <w:rPr>
-          <w:sz w:val="24"/>
-          <w:szCs w:val="32"/>
-          <w:lang w:val="en-US"/>
-        </w:rPr>
-      </w:pPr>
-    </w:p>
-    <w:p>
-      <w:pPr>
-        <w:rPr>
-          <w:sz w:val="24"/>
-          <w:szCs w:val="32"/>
-          <w:lang w:val="en-US"/>
-        </w:rPr>
-      </w:pPr>
-    </w:p>
-    <w:p>
-      <w:pPr>
+        </w:rPr>
+      </w:pPr>
+      <w:r>
         <w:rPr>
           <w:b/>
-          <w:sz w:val="24"/>
-          <w:szCs w:val="32"/>
-          <w:lang w:val="en-US"/>
-        </w:rPr>
-      </w:pPr>
+          <w:sz w:val="28"/>
+          <w:szCs w:val="24"/>
+        </w:rPr>
+        <w:lastRenderedPageBreak/>
+        <w:t>Prompt 20[</w:t>
+      </w:r>
+      <w:bookmarkStart w:id="0" w:name="_GoBack"/>
+      <w:bookmarkEnd w:id="0"/>
       <w:r>
         <w:rPr>
           <w:b/>
+          <w:sz w:val="28"/>
+          <w:szCs w:val="24"/>
+        </w:rPr>
+        <w:t>Database changes, Placeholder changes and Degree list embedded</w:t>
+      </w:r>
+      <w:proofErr w:type="gramStart"/>
+      <w:r>
+        <w:rPr>
+          <w:b/>
+          <w:sz w:val="28"/>
+          <w:szCs w:val="24"/>
+        </w:rPr>
+        <w:t>]</w:t>
+      </w:r>
+      <w:proofErr w:type="gramEnd"/>
+      <w:r>
+        <w:rPr>
+          <w:sz w:val="24"/>
+          <w:szCs w:val="24"/>
+        </w:rPr>
+        <w:br/>
+      </w:r>
+      <w:r>
+        <w:rPr>
+          <w:sz w:val="24"/>
+          <w:szCs w:val="24"/>
+        </w:rPr>
+        <w:t xml:space="preserve">There is still many issues in functionalities of </w:t>
+      </w:r>
+      <w:proofErr w:type="spellStart"/>
+      <w:r>
+        <w:rPr>
+          <w:sz w:val="24"/>
+          <w:szCs w:val="24"/>
+        </w:rPr>
+        <w:t>RegistrationFlow.jsx</w:t>
+      </w:r>
+      <w:proofErr w:type="spellEnd"/>
+      <w:r>
+        <w:rPr>
+          <w:sz w:val="24"/>
+          <w:szCs w:val="24"/>
+        </w:rPr>
+        <w:t xml:space="preserve"> file. I have listed down the problems</w:t>
+      </w:r>
+      <w:proofErr w:type="gramStart"/>
+      <w:r>
+        <w:rPr>
+          <w:sz w:val="24"/>
+          <w:szCs w:val="24"/>
+        </w:rPr>
+        <w:t>:</w:t>
+      </w:r>
+      <w:proofErr w:type="gramEnd"/>
+      <w:r>
+        <w:rPr>
+          <w:sz w:val="24"/>
+        </w:rPr>
+        <w:br/>
+      </w:r>
+      <w:r>
+        <w:rPr>
+          <w:sz w:val="24"/>
+        </w:rPr>
+        <w:br/>
+      </w:r>
+      <w:r>
+        <w:rPr>
+          <w:sz w:val="24"/>
+        </w:rPr>
+        <w:t>Problem</w:t>
+      </w:r>
+      <w:r>
+        <w:rPr>
+          <w:sz w:val="24"/>
+        </w:rPr>
+        <w:t xml:space="preserve"> 1</w:t>
+      </w:r>
+      <w:r>
+        <w:rPr>
+          <w:sz w:val="24"/>
+        </w:rPr>
+        <w:t>: The databa</w:t>
+      </w:r>
+      <w:r>
+        <w:rPr>
+          <w:sz w:val="24"/>
+        </w:rPr>
+        <w:t>se only stores few information such as:</w:t>
+      </w:r>
+    </w:p>
+    <w:p>
+      <w:pPr>
+        <w:rPr>
+          <w:sz w:val="24"/>
+        </w:rPr>
+      </w:pPr>
+      <w:proofErr w:type="spellStart"/>
+      <w:proofErr w:type="gramStart"/>
+      <w:r>
+        <w:rPr>
+          <w:sz w:val="24"/>
+        </w:rPr>
+        <w:t>firstName</w:t>
+      </w:r>
+      <w:proofErr w:type="spellEnd"/>
+      <w:proofErr w:type="gramEnd"/>
+    </w:p>
+    <w:p>
+      <w:pPr>
+        <w:rPr>
+          <w:sz w:val="24"/>
+        </w:rPr>
+      </w:pPr>
+      <w:proofErr w:type="spellStart"/>
+      <w:proofErr w:type="gramStart"/>
+      <w:r>
+        <w:rPr>
+          <w:sz w:val="24"/>
+        </w:rPr>
+        <w:t>lastName</w:t>
+      </w:r>
+      <w:proofErr w:type="spellEnd"/>
+      <w:proofErr w:type="gramEnd"/>
+    </w:p>
+    <w:p>
+      <w:pPr>
+        <w:rPr>
+          <w:sz w:val="24"/>
+        </w:rPr>
+      </w:pPr>
+      <w:proofErr w:type="gramStart"/>
+      <w:r>
+        <w:rPr>
+          <w:sz w:val="24"/>
+        </w:rPr>
+        <w:t>email</w:t>
+      </w:r>
+      <w:proofErr w:type="gramEnd"/>
+    </w:p>
+    <w:p>
+      <w:pPr>
+        <w:rPr>
+          <w:sz w:val="24"/>
+        </w:rPr>
+      </w:pPr>
+      <w:proofErr w:type="gramStart"/>
+      <w:r>
+        <w:rPr>
+          <w:sz w:val="24"/>
+        </w:rPr>
+        <w:t>phone</w:t>
+      </w:r>
+      <w:proofErr w:type="gramEnd"/>
+    </w:p>
+    <w:p>
+      <w:pPr>
+        <w:rPr>
+          <w:sz w:val="24"/>
+        </w:rPr>
+      </w:pPr>
+      <w:proofErr w:type="gramStart"/>
+      <w:r>
+        <w:rPr>
+          <w:sz w:val="24"/>
+        </w:rPr>
+        <w:t>and</w:t>
+      </w:r>
+      <w:proofErr w:type="gramEnd"/>
+      <w:r>
+        <w:rPr>
+          <w:sz w:val="24"/>
+        </w:rPr>
+        <w:t xml:space="preserve"> so on.</w:t>
+      </w:r>
+      <w:r>
+        <w:rPr>
+          <w:sz w:val="24"/>
+        </w:rPr>
+        <w:br/>
+      </w:r>
+    </w:p>
+    <w:p>
+      <w:pPr>
+        <w:rPr>
+          <w:sz w:val="24"/>
+        </w:rPr>
+      </w:pPr>
+      <w:r>
+        <w:rPr>
+          <w:sz w:val="24"/>
+        </w:rPr>
+        <w:t xml:space="preserve">But I want the all the user information from personal information and Education and Internship to be stored in the database. So </w:t>
+      </w:r>
+      <w:proofErr w:type="gramStart"/>
+      <w:r>
+        <w:rPr>
+          <w:sz w:val="24"/>
+        </w:rPr>
+        <w:t>Include</w:t>
+      </w:r>
+      <w:proofErr w:type="gramEnd"/>
+      <w:r>
+        <w:rPr>
+          <w:sz w:val="24"/>
+        </w:rPr>
+        <w:t xml:space="preserve"> all the fields in the database.</w:t>
+      </w:r>
+      <w:r>
+        <w:rPr>
+          <w:sz w:val="24"/>
+        </w:rPr>
+        <w:br/>
+      </w:r>
+      <w:r>
+        <w:rPr>
+          <w:sz w:val="24"/>
+        </w:rPr>
+        <w:br/>
+        <w:t>Code Reference:</w:t>
+      </w:r>
+      <w:r>
+        <w:rPr>
+          <w:sz w:val="24"/>
+        </w:rPr>
+        <w:br/>
+      </w:r>
+      <w:r>
+        <w:rPr>
+          <w:sz w:val="24"/>
+        </w:rPr>
+        <w:t xml:space="preserve">  {step === 1 &amp;&amp; (</w:t>
+      </w:r>
+    </w:p>
+    <w:p>
+      <w:pPr>
+        <w:rPr>
+          <w:sz w:val="24"/>
+        </w:rPr>
+      </w:pPr>
+      <w:r>
+        <w:rPr>
+          <w:sz w:val="24"/>
+        </w:rPr>
+        <w:t xml:space="preserve">        &lt;main </w:t>
+      </w:r>
+      <w:proofErr w:type="spellStart"/>
+      <w:r>
+        <w:rPr>
+          <w:sz w:val="24"/>
+        </w:rPr>
+        <w:t>className</w:t>
+      </w:r>
+      <w:proofErr w:type="spellEnd"/>
+      <w:r>
+        <w:rPr>
+          <w:sz w:val="24"/>
+        </w:rPr>
+        <w:t>="flex-grow mx-auto px-6 py-12 w-full max-w-7xl pt-16"&gt;</w:t>
+      </w:r>
+      <w:r>
+        <w:rPr>
+          <w:sz w:val="24"/>
+        </w:rPr>
+        <w:br/>
+        <w:t>…………………………………………………………………………</w:t>
+      </w:r>
+    </w:p>
+    <w:p>
+      <w:pPr>
+        <w:rPr>
+          <w:sz w:val="24"/>
+        </w:rPr>
+      </w:pPr>
+      <w:r>
+        <w:rPr>
+          <w:sz w:val="24"/>
+        </w:rPr>
+        <w:t xml:space="preserve">        &lt;/main&gt;</w:t>
+      </w:r>
+    </w:p>
+    <w:p>
+      <w:pPr>
+        <w:rPr>
+          <w:sz w:val="24"/>
+        </w:rPr>
+      </w:pPr>
+      <w:r>
+        <w:rPr>
+          <w:sz w:val="24"/>
+        </w:rPr>
+        <w:t xml:space="preserve">      </w:t>
+      </w:r>
+      <w:proofErr w:type="gramStart"/>
+      <w:r>
+        <w:rPr>
+          <w:sz w:val="24"/>
+        </w:rPr>
+        <w:t>)}</w:t>
+      </w:r>
+      <w:proofErr w:type="gramEnd"/>
+      <w:r>
+        <w:rPr>
+          <w:sz w:val="24"/>
+        </w:rPr>
+        <w:br/>
+      </w:r>
+      <w:r>
+        <w:rPr>
+          <w:sz w:val="24"/>
+        </w:rPr>
+        <w:br/>
+      </w:r>
+      <w:r>
+        <w:rPr>
+          <w:sz w:val="24"/>
+        </w:rPr>
+        <w:br/>
+      </w:r>
+      <w:r>
+        <w:rPr>
+          <w:sz w:val="24"/>
+        </w:rPr>
+        <w:br/>
+      </w:r>
+      <w:r>
+        <w:rPr>
+          <w:sz w:val="24"/>
+        </w:rPr>
+        <w:br/>
+      </w:r>
+      <w:r>
+        <w:rPr>
+          <w:sz w:val="24"/>
+        </w:rPr>
+        <w:t>{step === 2 &amp;&amp; (</w:t>
+      </w:r>
+    </w:p>
+    <w:p>
+      <w:pPr>
+        <w:rPr>
+          <w:sz w:val="24"/>
+        </w:rPr>
+      </w:pPr>
+      <w:r>
+        <w:rPr>
+          <w:sz w:val="24"/>
+        </w:rPr>
+        <w:t xml:space="preserve">        &lt;main </w:t>
+      </w:r>
+      <w:proofErr w:type="spellStart"/>
+      <w:r>
+        <w:rPr>
+          <w:sz w:val="24"/>
+        </w:rPr>
+        <w:t>className</w:t>
+      </w:r>
+      <w:proofErr w:type="spellEnd"/>
+      <w:r>
+        <w:rPr>
+          <w:sz w:val="24"/>
+        </w:rPr>
+        <w:t>="flex-grow py-12 px-4 md</w:t>
+      </w:r>
+      <w:proofErr w:type="gramStart"/>
+      <w:r>
+        <w:rPr>
+          <w:sz w:val="24"/>
+        </w:rPr>
+        <w:t>:px</w:t>
+      </w:r>
+      <w:proofErr w:type="gramEnd"/>
+      <w:r>
+        <w:rPr>
+          <w:sz w:val="24"/>
+        </w:rPr>
+        <w:t>-10 pt-16"&gt;</w:t>
+      </w:r>
+      <w:r>
+        <w:rPr>
+          <w:sz w:val="24"/>
+        </w:rPr>
+        <w:br/>
+        <w:t xml:space="preserve"> ………………………………………………</w:t>
+      </w:r>
+    </w:p>
+    <w:p>
+      <w:pPr>
+        <w:rPr>
+          <w:sz w:val="24"/>
+        </w:rPr>
+      </w:pPr>
+      <w:r>
+        <w:rPr>
+          <w:sz w:val="24"/>
+        </w:rPr>
+        <w:t xml:space="preserve"> </w:t>
+      </w:r>
+      <w:r>
+        <w:rPr>
+          <w:sz w:val="24"/>
+        </w:rPr>
+        <w:t xml:space="preserve">        &lt;/main&gt;</w:t>
+      </w:r>
+    </w:p>
+    <w:p>
+      <w:pPr>
+        <w:rPr>
+          <w:sz w:val="24"/>
+        </w:rPr>
+      </w:pPr>
+      <w:r>
+        <w:rPr>
+          <w:sz w:val="24"/>
+        </w:rPr>
+        <w:t xml:space="preserve">      </w:t>
+      </w:r>
+      <w:proofErr w:type="gramStart"/>
+      <w:r>
+        <w:rPr>
+          <w:sz w:val="24"/>
+        </w:rPr>
+        <w:t>)}</w:t>
+      </w:r>
+      <w:proofErr w:type="gramEnd"/>
+      <w:r>
+        <w:rPr>
+          <w:sz w:val="24"/>
+        </w:rPr>
+        <w:br/>
+      </w:r>
+      <w:r>
+        <w:rPr>
+          <w:sz w:val="24"/>
+        </w:rPr>
+        <w:br/>
+      </w:r>
+      <w:r>
+        <w:rPr>
+          <w:sz w:val="24"/>
+        </w:rPr>
+        <w:br/>
+      </w:r>
+      <w:r>
+        <w:rPr>
+          <w:sz w:val="24"/>
+        </w:rPr>
+        <w:br/>
+        <w:t>Problem 2: When filling the form in Personal Information, I noticed that some fields have placeholders with some random numbers.</w:t>
+      </w:r>
+    </w:p>
+    <w:p>
+      <w:pPr>
+        <w:rPr>
+          <w:sz w:val="24"/>
+        </w:rPr>
+      </w:pPr>
+      <w:r>
+        <w:rPr>
+          <w:sz w:val="24"/>
+        </w:rPr>
+        <w:t xml:space="preserve">Changes Required: Replace place holder values with some meaningful strings in place of current value. </w:t>
+      </w:r>
+      <w:r>
+        <w:rPr>
+          <w:sz w:val="24"/>
+        </w:rPr>
+        <w:br/>
+      </w:r>
+      <w:r>
+        <w:rPr>
+          <w:sz w:val="24"/>
+        </w:rPr>
+        <w:lastRenderedPageBreak/>
+        <w:t>Use something like.</w:t>
+      </w:r>
+      <w:r>
+        <w:rPr>
+          <w:sz w:val="24"/>
+        </w:rPr>
+        <w:br/>
+        <w:t>For phone numbers use “XXXXXXXXXX”</w:t>
+      </w:r>
+      <w:r>
+        <w:rPr>
+          <w:sz w:val="24"/>
+        </w:rPr>
+        <w:br/>
+        <w:t xml:space="preserve">For </w:t>
+      </w:r>
+      <w:proofErr w:type="spellStart"/>
+      <w:r>
+        <w:rPr>
+          <w:sz w:val="24"/>
+        </w:rPr>
+        <w:t>Pincode</w:t>
+      </w:r>
+      <w:proofErr w:type="spellEnd"/>
+      <w:r>
+        <w:rPr>
+          <w:sz w:val="24"/>
+        </w:rPr>
+        <w:t xml:space="preserve"> use “Enter </w:t>
+      </w:r>
+      <w:proofErr w:type="spellStart"/>
+      <w:r>
+        <w:rPr>
+          <w:sz w:val="24"/>
+        </w:rPr>
+        <w:t>Pincode</w:t>
+      </w:r>
+      <w:proofErr w:type="spellEnd"/>
+      <w:r>
+        <w:rPr>
+          <w:sz w:val="24"/>
+        </w:rPr>
+        <w:t>”</w:t>
+      </w:r>
+    </w:p>
+    <w:p>
+      <w:pPr>
+        <w:rPr>
+          <w:sz w:val="24"/>
+        </w:rPr>
+      </w:pPr>
+    </w:p>
+    <w:p>
+      <w:pPr>
+        <w:rPr>
+          <w:sz w:val="24"/>
+        </w:rPr>
+      </w:pPr>
+    </w:p>
+    <w:p>
+      <w:pPr>
+        <w:rPr>
+          <w:sz w:val="24"/>
+        </w:rPr>
+      </w:pPr>
+      <w:r>
+        <w:rPr>
+          <w:sz w:val="24"/>
+        </w:rPr>
+        <w:t>Problem 3: Resume Parsing is give more priority than the data inputted through create account section of the page.</w:t>
+      </w:r>
+      <w:r>
+        <w:rPr>
+          <w:sz w:val="24"/>
+        </w:rPr>
+        <w:br/>
+      </w:r>
+      <w:r>
+        <w:rPr>
+          <w:sz w:val="24"/>
+        </w:rPr>
+        <w:br/>
+        <w:t>Changes Required: Before parsing from resume, the data the user entered in the create account section of the page must be automatically filled in the respective form elements in the Personal information section. User can manually edit the field even though the field is automatically filled.</w:t>
+      </w:r>
+      <w:r>
+        <w:rPr>
+          <w:sz w:val="24"/>
+        </w:rPr>
+        <w:br/>
+        <w:t xml:space="preserve">In other words, the data he/she entered in the create account section of the page must be given more priority then what is parsed from resume (which is uploaded) and must automatically be filled in the form in Personal information section. </w:t>
+      </w:r>
+      <w:r>
+        <w:rPr>
+          <w:sz w:val="24"/>
+        </w:rPr>
+        <w:br/>
+        <w:t xml:space="preserve">For all other details asked in the user form in the personal information section of the </w:t>
+      </w:r>
+      <w:proofErr w:type="spellStart"/>
+      <w:r>
+        <w:rPr>
+          <w:sz w:val="24"/>
+          <w:szCs w:val="24"/>
+        </w:rPr>
+        <w:t>RegistrationFlow.jsx</w:t>
+      </w:r>
+      <w:proofErr w:type="spellEnd"/>
+      <w:r>
+        <w:rPr>
+          <w:sz w:val="24"/>
+          <w:szCs w:val="24"/>
+        </w:rPr>
+        <w:t xml:space="preserve">, </w:t>
+      </w:r>
+      <w:r>
+        <w:rPr>
+          <w:sz w:val="24"/>
+        </w:rPr>
+        <w:t xml:space="preserve">can be filled automatically through parsed data from resume or be manually filled by user. </w:t>
+      </w:r>
+    </w:p>
+    <w:p>
+      <w:pPr>
+        <w:rPr>
+          <w:sz w:val="24"/>
+        </w:rPr>
+      </w:pPr>
+    </w:p>
+    <w:p>
+      <w:pPr>
+        <w:rPr>
+          <w:sz w:val="24"/>
+        </w:rPr>
+      </w:pPr>
+      <w:r>
+        <w:rPr>
+          <w:sz w:val="24"/>
+        </w:rPr>
+        <w:t>Code Reference</w:t>
+      </w:r>
+      <w:proofErr w:type="gramStart"/>
+      <w:r>
+        <w:rPr>
+          <w:sz w:val="24"/>
+        </w:rPr>
+        <w:t>:</w:t>
+      </w:r>
+      <w:proofErr w:type="gramEnd"/>
+      <w:r>
+        <w:rPr>
+          <w:sz w:val="24"/>
+        </w:rPr>
+        <w:br/>
+      </w:r>
+      <w:r>
+        <w:rPr>
+          <w:sz w:val="24"/>
+        </w:rPr>
+        <w:br/>
+        <w:t>Create Account section:</w:t>
+      </w:r>
+      <w:r>
+        <w:rPr>
+          <w:sz w:val="24"/>
+        </w:rPr>
+        <w:br/>
+      </w:r>
+      <w:r>
+        <w:rPr>
+          <w:sz w:val="24"/>
+        </w:rPr>
+        <w:t>{step === 0 &amp;&amp; (</w:t>
+      </w:r>
+    </w:p>
+    <w:p>
+      <w:pPr>
+        <w:rPr>
+          <w:sz w:val="24"/>
+        </w:rPr>
+      </w:pPr>
+      <w:r>
+        <w:rPr>
+          <w:sz w:val="24"/>
+        </w:rPr>
+        <w:t xml:space="preserve">        &lt;main </w:t>
+      </w:r>
+      <w:proofErr w:type="spellStart"/>
+      <w:r>
+        <w:rPr>
+          <w:sz w:val="24"/>
+        </w:rPr>
+        <w:t>className</w:t>
+      </w:r>
+      <w:proofErr w:type="spellEnd"/>
+      <w:r>
+        <w:rPr>
+          <w:sz w:val="24"/>
+        </w:rPr>
+        <w:t xml:space="preserve">="flex-grow flex flex-col </w:t>
+      </w:r>
+      <w:proofErr w:type="spellStart"/>
+      <w:r>
+        <w:rPr>
+          <w:sz w:val="24"/>
+        </w:rPr>
+        <w:t>md</w:t>
+      </w:r>
+      <w:proofErr w:type="gramStart"/>
+      <w:r>
+        <w:rPr>
+          <w:sz w:val="24"/>
+        </w:rPr>
+        <w:t>:flex</w:t>
+      </w:r>
+      <w:proofErr w:type="gramEnd"/>
+      <w:r>
+        <w:rPr>
+          <w:sz w:val="24"/>
+        </w:rPr>
+        <w:t>-row</w:t>
+      </w:r>
+      <w:proofErr w:type="spellEnd"/>
+      <w:r>
+        <w:rPr>
+          <w:sz w:val="24"/>
+        </w:rPr>
+        <w:t xml:space="preserve"> max-w-7xl mx-auto w-full pt-8"&gt;</w:t>
+      </w:r>
+    </w:p>
+    <w:p>
+      <w:pPr>
+        <w:rPr>
+          <w:sz w:val="24"/>
+        </w:rPr>
+      </w:pPr>
+      <w:r>
+        <w:rPr>
+          <w:sz w:val="24"/>
+        </w:rPr>
+        <w:t>…………………………….</w:t>
+      </w:r>
+      <w:r>
+        <w:rPr>
+          <w:sz w:val="24"/>
+        </w:rPr>
+        <w:t xml:space="preserve">        </w:t>
+      </w:r>
+      <w:r>
+        <w:rPr>
+          <w:sz w:val="24"/>
+        </w:rPr>
+        <w:br/>
+      </w:r>
+      <w:r>
+        <w:rPr>
+          <w:sz w:val="24"/>
+        </w:rPr>
+        <w:t>&lt;/main&gt;</w:t>
+      </w:r>
+    </w:p>
+    <w:p>
+      <w:pPr>
+        <w:rPr>
+          <w:sz w:val="24"/>
+        </w:rPr>
+      </w:pPr>
+      <w:r>
+        <w:rPr>
+          <w:sz w:val="24"/>
+        </w:rPr>
+        <w:t xml:space="preserve">      )}</w:t>
+      </w:r>
+    </w:p>
+    <w:p>
+      <w:pPr>
+        <w:rPr>
+          <w:sz w:val="24"/>
+        </w:rPr>
+      </w:pPr>
+      <w:r>
+        <w:rPr>
+          <w:sz w:val="24"/>
+        </w:rPr>
+        <w:br/>
+        <w:t>Personal Information Section:</w:t>
+      </w:r>
+      <w:r>
+        <w:rPr>
+          <w:sz w:val="24"/>
+        </w:rPr>
+        <w:br/>
+      </w:r>
+      <w:r>
+        <w:rPr>
+          <w:sz w:val="24"/>
+        </w:rPr>
+        <w:br/>
+      </w:r>
+      <w:r>
+        <w:rPr>
+          <w:sz w:val="24"/>
+        </w:rPr>
+        <w:t xml:space="preserve">  {step === 1 &amp;&amp; (</w:t>
+      </w:r>
+    </w:p>
+    <w:p>
+      <w:pPr>
+        <w:rPr>
+          <w:sz w:val="24"/>
+        </w:rPr>
+      </w:pPr>
+      <w:r>
+        <w:rPr>
+          <w:sz w:val="24"/>
+        </w:rPr>
+        <w:t xml:space="preserve">        &lt;main </w:t>
+      </w:r>
+      <w:proofErr w:type="spellStart"/>
+      <w:r>
+        <w:rPr>
+          <w:sz w:val="24"/>
+        </w:rPr>
+        <w:t>className</w:t>
+      </w:r>
+      <w:proofErr w:type="spellEnd"/>
+      <w:r>
+        <w:rPr>
+          <w:sz w:val="24"/>
+        </w:rPr>
+        <w:t>="flex-grow mx-auto px-6 py-12 w-full max-w-7xl pt-16"&gt;</w:t>
+      </w:r>
+      <w:r>
+        <w:rPr>
+          <w:sz w:val="24"/>
+        </w:rPr>
+        <w:br/>
+        <w:t>…………………………………………………………………………</w:t>
+      </w:r>
+    </w:p>
+    <w:p>
+      <w:pPr>
+        <w:rPr>
+          <w:sz w:val="24"/>
+        </w:rPr>
+      </w:pPr>
+      <w:r>
+        <w:rPr>
+          <w:sz w:val="24"/>
+        </w:rPr>
+        <w:t xml:space="preserve">        &lt;/main&gt;</w:t>
+      </w:r>
+    </w:p>
+    <w:p>
+      <w:pPr>
+        <w:rPr>
+          <w:sz w:val="24"/>
+        </w:rPr>
+      </w:pPr>
+      <w:r>
+        <w:rPr>
+          <w:sz w:val="24"/>
+        </w:rPr>
+        <w:t xml:space="preserve">      )}</w:t>
+      </w:r>
+      <w:r>
+        <w:rPr>
+          <w:sz w:val="24"/>
+        </w:rPr>
+        <w:br/>
+      </w:r>
+    </w:p>
+    <w:p>
+      <w:pPr>
+        <w:rPr>
+          <w:sz w:val="24"/>
+        </w:rPr>
+      </w:pPr>
+      <w:r>
+        <w:rPr>
+          <w:sz w:val="24"/>
+        </w:rPr>
+        <w:lastRenderedPageBreak/>
+        <w:br/>
+        <w:t xml:space="preserve">Problem 4: In the </w:t>
+      </w:r>
+      <w:r>
+        <w:rPr>
+          <w:sz w:val="24"/>
+        </w:rPr>
+        <w:t>Education &amp; Internships</w:t>
+      </w:r>
+      <w:r>
+        <w:rPr>
+          <w:sz w:val="24"/>
+        </w:rPr>
+        <w:t xml:space="preserve"> part of the code, the input field types need </w:t>
+      </w:r>
+      <w:proofErr w:type="spellStart"/>
+      <w:r>
+        <w:rPr>
+          <w:sz w:val="24"/>
+        </w:rPr>
+        <w:t>tobe</w:t>
+      </w:r>
+      <w:proofErr w:type="spellEnd"/>
+      <w:r>
+        <w:rPr>
+          <w:sz w:val="24"/>
+        </w:rPr>
+        <w:t xml:space="preserve"> changed.</w:t>
+      </w:r>
+      <w:r>
+        <w:rPr>
+          <w:sz w:val="24"/>
+        </w:rPr>
+        <w:br/>
+      </w:r>
+      <w:r>
+        <w:rPr>
+          <w:sz w:val="24"/>
+        </w:rPr>
+        <w:br/>
+        <w:t>Changes Required: Under undergraduate degree for Degree / major, use drop down list with predefined list of degrees.</w:t>
+      </w:r>
+      <w:r>
+        <w:rPr>
+          <w:sz w:val="24"/>
+        </w:rPr>
+        <w:br/>
+        <w:t>It should include only bachelor degrees and it should be related to engineering, commerce or IT. It can also include any specialization degree as well. Minimum 6-7 list of degrees would be good.</w:t>
+      </w:r>
+      <w:r>
+        <w:rPr>
+          <w:sz w:val="24"/>
+        </w:rPr>
+        <w:br/>
+      </w:r>
+      <w:r>
+        <w:rPr>
+          <w:sz w:val="24"/>
+        </w:rPr>
+        <w:br/>
+        <w:t xml:space="preserve">For example: BCA, BBA, </w:t>
+      </w:r>
+      <w:proofErr w:type="spellStart"/>
+      <w:r>
+        <w:rPr>
+          <w:sz w:val="24"/>
+        </w:rPr>
+        <w:t>Btech</w:t>
+      </w:r>
+      <w:proofErr w:type="spellEnd"/>
+      <w:r>
+        <w:rPr>
+          <w:sz w:val="24"/>
+        </w:rPr>
+        <w:t xml:space="preserve">, BSc, </w:t>
+      </w:r>
+      <w:proofErr w:type="spellStart"/>
+      <w:r>
+        <w:rPr>
+          <w:sz w:val="24"/>
+        </w:rPr>
+        <w:t>Bcom</w:t>
+      </w:r>
+      <w:proofErr w:type="spellEnd"/>
+      <w:r>
+        <w:rPr>
+          <w:sz w:val="24"/>
+        </w:rPr>
+        <w:t xml:space="preserve"> etc.</w:t>
+      </w:r>
+      <w:r>
+        <w:rPr>
+          <w:sz w:val="24"/>
+        </w:rPr>
+        <w:br/>
+      </w:r>
+      <w:r>
+        <w:rPr>
+          <w:sz w:val="24"/>
+        </w:rPr>
+        <w:br/>
+      </w:r>
+      <w:r>
+        <w:rPr>
+          <w:sz w:val="24"/>
+        </w:rPr>
+        <w:br/>
+        <w:t>Under postgraduate degree also, for Degree / major, use drop down list with predefined list of degrees.</w:t>
+      </w:r>
+      <w:r>
+        <w:rPr>
+          <w:sz w:val="24"/>
+        </w:rPr>
+        <w:br/>
+        <w:t xml:space="preserve">It should include only </w:t>
+      </w:r>
+      <w:proofErr w:type="gramStart"/>
+      <w:r>
+        <w:rPr>
+          <w:sz w:val="24"/>
+        </w:rPr>
+        <w:t>masters</w:t>
+      </w:r>
+      <w:proofErr w:type="gramEnd"/>
+      <w:r>
+        <w:rPr>
+          <w:sz w:val="24"/>
+        </w:rPr>
+        <w:t xml:space="preserve"> degrees that are related to engineering, commerce or IT.</w:t>
+      </w:r>
+      <w:r>
+        <w:rPr>
+          <w:sz w:val="24"/>
+        </w:rPr>
+        <w:br/>
+      </w:r>
+      <w:r>
+        <w:rPr>
+          <w:sz w:val="24"/>
+        </w:rPr>
+        <w:br/>
+        <w:t xml:space="preserve">For example: MCA, </w:t>
+      </w:r>
+      <w:proofErr w:type="spellStart"/>
+      <w:r>
+        <w:rPr>
+          <w:sz w:val="24"/>
+        </w:rPr>
+        <w:t>Mtech</w:t>
+      </w:r>
+      <w:proofErr w:type="spellEnd"/>
+      <w:r>
+        <w:rPr>
+          <w:sz w:val="24"/>
+        </w:rPr>
+        <w:t>, MBA etc…</w:t>
+      </w:r>
+    </w:p>
+    <w:p>
+      <w:pPr>
+        <w:rPr>
+          <w:sz w:val="24"/>
+          <w:szCs w:val="32"/>
+          <w:lang w:val="en-US"/>
+        </w:rPr>
+      </w:pPr>
+    </w:p>
+    <w:p>
+      <w:pPr>
+        <w:rPr>
+          <w:sz w:val="24"/>
+          <w:szCs w:val="32"/>
+          <w:lang w:val="en-US"/>
+        </w:rPr>
+      </w:pPr>
+    </w:p>
+    <w:p>
+      <w:pPr>
+        <w:rPr>
+          <w:sz w:val="24"/>
+          <w:szCs w:val="32"/>
+          <w:lang w:val="en-US"/>
+        </w:rPr>
+      </w:pPr>
+    </w:p>
+    <w:p>
+      <w:pPr>
+        <w:rPr>
+          <w:b/>
+          <w:sz w:val="24"/>
+          <w:szCs w:val="32"/>
+          <w:lang w:val="en-US"/>
+        </w:rPr>
+      </w:pPr>
+      <w:r>
+        <w:rPr>
+          <w:b/>
           <w:sz w:val="24"/>
           <w:szCs w:val="32"/>
           <w:lang w:val="en-US"/>
@@ -5752,6 +6786,7 @@
           <w:szCs w:val="32"/>
           <w:lang w:val="en-US"/>
         </w:rPr>
+        <w:lastRenderedPageBreak/>
         <w:t>SkillBridge</w:t>
       </w:r>
       <w:proofErr w:type="spellEnd"/>
@@ -6135,7 +7170,6 @@
           <w:szCs w:val="32"/>
           <w:lang w:val="en-US"/>
         </w:rPr>
-        <w:lastRenderedPageBreak/>
         <w:br/>
       </w:r>
       <w:proofErr w:type="spellStart"/>
@@ -6694,19 +7728,8 @@
           <w:sz w:val="48"/>
           <w:szCs w:val="48"/>
         </w:rPr>
-        <w:lastRenderedPageBreak/>
-        <w:t>Prompt to be executed</w:t>
-      </w:r>
-      <w:proofErr w:type="gramStart"/>
-      <w:r>
-        <w:rPr>
-          <w:b/>
-          <w:sz w:val="48"/>
-          <w:szCs w:val="48"/>
-        </w:rPr>
-        <w:t>:</w:t>
-      </w:r>
-      <w:proofErr w:type="gramEnd"/>
+        <w:t>Prompt to be executed:</w:t>
+      </w:r>
       <w:r>
         <w:br/>
       </w:r>
@@ -6716,1227 +7739,6 @@
           <w:szCs w:val="24"/>
         </w:rPr>
         <w:br/>
-      </w:r>
-      <w:r>
-        <w:rPr>
-          <w:sz w:val="24"/>
-          <w:szCs w:val="24"/>
-        </w:rPr>
-        <w:br/>
-        <w:t xml:space="preserve">Prompt 20[ </w:t>
-      </w:r>
-      <w:r>
-        <w:rPr>
-          <w:sz w:val="24"/>
-          <w:szCs w:val="24"/>
-        </w:rPr>
-        <w:t>Database changes, Placeholder changes and Degree list embedded]</w:t>
-      </w:r>
-      <w:r>
-        <w:rPr>
-          <w:sz w:val="24"/>
-          <w:szCs w:val="24"/>
-        </w:rPr>
-        <w:br/>
-      </w:r>
-      <w:r>
-        <w:rPr>
-          <w:sz w:val="24"/>
-          <w:szCs w:val="24"/>
-        </w:rPr>
-        <w:t xml:space="preserve">There </w:t>
-      </w:r>
-      <w:r>
-        <w:rPr>
-          <w:sz w:val="24"/>
-          <w:szCs w:val="24"/>
-        </w:rPr>
-        <w:t xml:space="preserve">is still </w:t>
-      </w:r>
-      <w:r>
-        <w:rPr>
-          <w:sz w:val="24"/>
-          <w:szCs w:val="24"/>
-        </w:rPr>
-        <w:t xml:space="preserve">many issues </w:t>
-      </w:r>
-      <w:r>
-        <w:rPr>
-          <w:sz w:val="24"/>
-          <w:szCs w:val="24"/>
-        </w:rPr>
-        <w:t xml:space="preserve">in functionalities </w:t>
-      </w:r>
-      <w:r>
-        <w:rPr>
-          <w:sz w:val="24"/>
-          <w:szCs w:val="24"/>
-        </w:rPr>
-        <w:t xml:space="preserve">of </w:t>
-      </w:r>
-      <w:proofErr w:type="spellStart"/>
-      <w:r>
-        <w:rPr>
-          <w:sz w:val="24"/>
-          <w:szCs w:val="24"/>
-        </w:rPr>
-        <w:t>RegistrationFlow.jsx</w:t>
-      </w:r>
-      <w:proofErr w:type="spellEnd"/>
-      <w:r>
-        <w:rPr>
-          <w:sz w:val="24"/>
-          <w:szCs w:val="24"/>
-        </w:rPr>
-        <w:t xml:space="preserve"> file.</w:t>
-      </w:r>
-      <w:r>
-        <w:rPr>
-          <w:sz w:val="24"/>
-          <w:szCs w:val="24"/>
-        </w:rPr>
-        <w:t xml:space="preserve"> I have listed down the problems</w:t>
-      </w:r>
-      <w:proofErr w:type="gramStart"/>
-      <w:r>
-        <w:rPr>
-          <w:sz w:val="24"/>
-          <w:szCs w:val="24"/>
-        </w:rPr>
-        <w:t>:</w:t>
-      </w:r>
-      <w:proofErr w:type="gramEnd"/>
-      <w:r>
-        <w:rPr>
-          <w:sz w:val="24"/>
-        </w:rPr>
-        <w:br/>
-      </w:r>
-      <w:r>
-        <w:rPr>
-          <w:sz w:val="24"/>
-        </w:rPr>
-        <w:br/>
-      </w:r>
-      <w:r>
-        <w:rPr>
-          <w:sz w:val="24"/>
-        </w:rPr>
-        <w:t>Problem</w:t>
-      </w:r>
-      <w:r>
-        <w:rPr>
-          <w:sz w:val="24"/>
-        </w:rPr>
-        <w:t xml:space="preserve"> 1</w:t>
-      </w:r>
-      <w:r>
-        <w:rPr>
-          <w:sz w:val="24"/>
-        </w:rPr>
-        <w:t>: The databa</w:t>
-      </w:r>
-      <w:r>
-        <w:rPr>
-          <w:sz w:val="24"/>
-        </w:rPr>
-        <w:t xml:space="preserve">se only </w:t>
-      </w:r>
-      <w:r>
-        <w:rPr>
-          <w:sz w:val="24"/>
-        </w:rPr>
-        <w:t xml:space="preserve">stores </w:t>
-      </w:r>
-      <w:r>
-        <w:rPr>
-          <w:sz w:val="24"/>
-        </w:rPr>
-        <w:t>few information</w:t>
-      </w:r>
-      <w:r>
-        <w:rPr>
-          <w:sz w:val="24"/>
-        </w:rPr>
-        <w:t xml:space="preserve"> such as:</w:t>
-      </w:r>
-    </w:p>
-    <w:p>
-      <w:pPr>
-        <w:rPr>
-          <w:sz w:val="24"/>
-        </w:rPr>
-      </w:pPr>
-      <w:proofErr w:type="spellStart"/>
-      <w:proofErr w:type="gramStart"/>
-      <w:r>
-        <w:rPr>
-          <w:sz w:val="24"/>
-        </w:rPr>
-        <w:t>firstName</w:t>
-      </w:r>
-      <w:proofErr w:type="spellEnd"/>
-      <w:proofErr w:type="gramEnd"/>
-    </w:p>
-    <w:p>
-      <w:pPr>
-        <w:rPr>
-          <w:sz w:val="24"/>
-        </w:rPr>
-      </w:pPr>
-      <w:proofErr w:type="spellStart"/>
-      <w:proofErr w:type="gramStart"/>
-      <w:r>
-        <w:rPr>
-          <w:sz w:val="24"/>
-        </w:rPr>
-        <w:t>lastName</w:t>
-      </w:r>
-      <w:proofErr w:type="spellEnd"/>
-      <w:proofErr w:type="gramEnd"/>
-    </w:p>
-    <w:p>
-      <w:pPr>
-        <w:rPr>
-          <w:sz w:val="24"/>
-        </w:rPr>
-      </w:pPr>
-      <w:proofErr w:type="gramStart"/>
-      <w:r>
-        <w:rPr>
-          <w:sz w:val="24"/>
-        </w:rPr>
-        <w:t>email</w:t>
-      </w:r>
-      <w:proofErr w:type="gramEnd"/>
-    </w:p>
-    <w:p>
-      <w:pPr>
-        <w:rPr>
-          <w:sz w:val="24"/>
-        </w:rPr>
-      </w:pPr>
-      <w:proofErr w:type="gramStart"/>
-      <w:r>
-        <w:rPr>
-          <w:sz w:val="24"/>
-        </w:rPr>
-        <w:t>phone</w:t>
-      </w:r>
-      <w:proofErr w:type="gramEnd"/>
-    </w:p>
-    <w:p>
-      <w:pPr>
-        <w:rPr>
-          <w:sz w:val="24"/>
-        </w:rPr>
-      </w:pPr>
-      <w:proofErr w:type="gramStart"/>
-      <w:r>
-        <w:rPr>
-          <w:sz w:val="24"/>
-        </w:rPr>
-        <w:t>and</w:t>
-      </w:r>
-      <w:proofErr w:type="gramEnd"/>
-      <w:r>
-        <w:rPr>
-          <w:sz w:val="24"/>
-        </w:rPr>
-        <w:t xml:space="preserve"> so on.</w:t>
-      </w:r>
-      <w:r>
-        <w:rPr>
-          <w:sz w:val="24"/>
-        </w:rPr>
-        <w:br/>
-      </w:r>
-    </w:p>
-    <w:p>
-      <w:pPr>
-        <w:rPr>
-          <w:sz w:val="24"/>
-        </w:rPr>
-      </w:pPr>
-      <w:r>
-        <w:rPr>
-          <w:sz w:val="24"/>
-        </w:rPr>
-        <w:t xml:space="preserve">But I want the all the user information from personal information and Education and Internship to be stored in the database. </w:t>
-      </w:r>
-      <w:r>
-        <w:rPr>
-          <w:sz w:val="24"/>
-        </w:rPr>
-        <w:t xml:space="preserve">So </w:t>
-      </w:r>
-      <w:proofErr w:type="gramStart"/>
-      <w:r>
-        <w:rPr>
-          <w:sz w:val="24"/>
-        </w:rPr>
-        <w:t>Include</w:t>
-      </w:r>
-      <w:proofErr w:type="gramEnd"/>
-      <w:r>
-        <w:rPr>
-          <w:sz w:val="24"/>
-        </w:rPr>
-        <w:t xml:space="preserve"> all the fields in the database.</w:t>
-      </w:r>
-      <w:r>
-        <w:rPr>
-          <w:sz w:val="24"/>
-        </w:rPr>
-        <w:br/>
-      </w:r>
-      <w:r>
-        <w:rPr>
-          <w:sz w:val="24"/>
-        </w:rPr>
-        <w:br/>
-        <w:t>Code Reference:</w:t>
-      </w:r>
-      <w:r>
-        <w:rPr>
-          <w:sz w:val="24"/>
-        </w:rPr>
-        <w:br/>
-      </w:r>
-      <w:r>
-        <w:rPr>
-          <w:sz w:val="24"/>
-        </w:rPr>
-        <w:t xml:space="preserve">  {step === 1 &amp;&amp; (</w:t>
-      </w:r>
-    </w:p>
-    <w:p>
-      <w:pPr>
-        <w:rPr>
-          <w:sz w:val="24"/>
-        </w:rPr>
-      </w:pPr>
-      <w:r>
-        <w:rPr>
-          <w:sz w:val="24"/>
-        </w:rPr>
-        <w:t xml:space="preserve">        &lt;main </w:t>
-      </w:r>
-      <w:proofErr w:type="spellStart"/>
-      <w:r>
-        <w:rPr>
-          <w:sz w:val="24"/>
-        </w:rPr>
-        <w:t>className</w:t>
-      </w:r>
-      <w:proofErr w:type="spellEnd"/>
-      <w:r>
-        <w:rPr>
-          <w:sz w:val="24"/>
-        </w:rPr>
-        <w:t>="flex-grow mx-auto px-6 py-12 w-full max-w-7xl pt-16"&gt;</w:t>
-      </w:r>
-      <w:r>
-        <w:rPr>
-          <w:sz w:val="24"/>
-        </w:rPr>
-        <w:br/>
-        <w:t>…………………………………………………………………………</w:t>
-      </w:r>
-    </w:p>
-    <w:p>
-      <w:pPr>
-        <w:rPr>
-          <w:sz w:val="24"/>
-        </w:rPr>
-      </w:pPr>
-      <w:r>
-        <w:rPr>
-          <w:sz w:val="24"/>
-        </w:rPr>
-        <w:t xml:space="preserve">        &lt;/main&gt;</w:t>
-      </w:r>
-    </w:p>
-    <w:p>
-      <w:pPr>
-        <w:rPr>
-          <w:sz w:val="24"/>
-        </w:rPr>
-      </w:pPr>
-      <w:r>
-        <w:rPr>
-          <w:sz w:val="24"/>
-        </w:rPr>
-        <w:t xml:space="preserve">      </w:t>
-      </w:r>
-      <w:proofErr w:type="gramStart"/>
-      <w:r>
-        <w:rPr>
-          <w:sz w:val="24"/>
-        </w:rPr>
-        <w:t>)}</w:t>
-      </w:r>
-      <w:proofErr w:type="gramEnd"/>
-      <w:r>
-        <w:rPr>
-          <w:sz w:val="24"/>
-        </w:rPr>
-        <w:br/>
-      </w:r>
-      <w:r>
-        <w:rPr>
-          <w:sz w:val="24"/>
-        </w:rPr>
-        <w:br/>
-      </w:r>
-      <w:r>
-        <w:rPr>
-          <w:sz w:val="24"/>
-        </w:rPr>
-        <w:br/>
-      </w:r>
-      <w:r>
-        <w:rPr>
-          <w:sz w:val="24"/>
-        </w:rPr>
-        <w:br/>
-      </w:r>
-      <w:r>
-        <w:rPr>
-          <w:sz w:val="24"/>
-        </w:rPr>
-        <w:br/>
-      </w:r>
-      <w:r>
-        <w:rPr>
-          <w:sz w:val="24"/>
-        </w:rPr>
-        <w:t>{step === 2 &amp;&amp; (</w:t>
-      </w:r>
-    </w:p>
-    <w:p>
-      <w:pPr>
-        <w:rPr>
-          <w:sz w:val="24"/>
-        </w:rPr>
-      </w:pPr>
-      <w:r>
-        <w:rPr>
-          <w:sz w:val="24"/>
-        </w:rPr>
-        <w:t xml:space="preserve">        &lt;main </w:t>
-      </w:r>
-      <w:proofErr w:type="spellStart"/>
-      <w:r>
-        <w:rPr>
-          <w:sz w:val="24"/>
-        </w:rPr>
-        <w:t>className</w:t>
-      </w:r>
-      <w:proofErr w:type="spellEnd"/>
-      <w:r>
-        <w:rPr>
-          <w:sz w:val="24"/>
-        </w:rPr>
-        <w:t>="flex-grow py-12 px-4 md</w:t>
-      </w:r>
-      <w:proofErr w:type="gramStart"/>
-      <w:r>
-        <w:rPr>
-          <w:sz w:val="24"/>
-        </w:rPr>
-        <w:t>:px</w:t>
-      </w:r>
-      <w:proofErr w:type="gramEnd"/>
-      <w:r>
-        <w:rPr>
-          <w:sz w:val="24"/>
-        </w:rPr>
-        <w:t>-10 pt-16"&gt;</w:t>
-      </w:r>
-      <w:r>
-        <w:rPr>
-          <w:sz w:val="24"/>
-        </w:rPr>
-        <w:br/>
-        <w:t xml:space="preserve"> ………………………………………………</w:t>
-      </w:r>
-    </w:p>
-    <w:p>
-      <w:pPr>
-        <w:rPr>
-          <w:sz w:val="24"/>
-        </w:rPr>
-      </w:pPr>
-      <w:r>
-        <w:rPr>
-          <w:sz w:val="24"/>
-        </w:rPr>
-        <w:t xml:space="preserve"> </w:t>
-      </w:r>
-      <w:r>
-        <w:rPr>
-          <w:sz w:val="24"/>
-        </w:rPr>
-        <w:t xml:space="preserve">        &lt;/main&gt;</w:t>
-      </w:r>
-    </w:p>
-    <w:p>
-      <w:pPr>
-        <w:rPr>
-          <w:sz w:val="24"/>
-        </w:rPr>
-      </w:pPr>
-      <w:r>
-        <w:rPr>
-          <w:sz w:val="24"/>
-        </w:rPr>
-        <w:t xml:space="preserve">      </w:t>
-      </w:r>
-      <w:proofErr w:type="gramStart"/>
-      <w:r>
-        <w:rPr>
-          <w:sz w:val="24"/>
-        </w:rPr>
-        <w:t>)}</w:t>
-      </w:r>
-      <w:proofErr w:type="gramEnd"/>
-      <w:r>
-        <w:rPr>
-          <w:sz w:val="24"/>
-        </w:rPr>
-        <w:br/>
-      </w:r>
-      <w:r>
-        <w:rPr>
-          <w:sz w:val="24"/>
-        </w:rPr>
-        <w:br/>
-      </w:r>
-      <w:r>
-        <w:rPr>
-          <w:sz w:val="24"/>
-        </w:rPr>
-        <w:br/>
-      </w:r>
-      <w:r>
-        <w:rPr>
-          <w:sz w:val="24"/>
-        </w:rPr>
-        <w:br/>
-        <w:t>Problem 2: When filling the form in Personal Information, I noticed that some fields have placeholders with some random numbers.</w:t>
-      </w:r>
-    </w:p>
-    <w:p>
-      <w:pPr>
-        <w:rPr>
-          <w:sz w:val="24"/>
-        </w:rPr>
-      </w:pPr>
-      <w:r>
-        <w:rPr>
-          <w:sz w:val="24"/>
-        </w:rPr>
-        <w:lastRenderedPageBreak/>
-        <w:t xml:space="preserve">Changes Required: Replace place holder values with some meaningful strings in place of current value. </w:t>
-      </w:r>
-      <w:r>
-        <w:rPr>
-          <w:sz w:val="24"/>
-        </w:rPr>
-        <w:br/>
-        <w:t>Use something like.</w:t>
-      </w:r>
-      <w:r>
-        <w:rPr>
-          <w:sz w:val="24"/>
-        </w:rPr>
-        <w:br/>
-        <w:t>For phone numbers use “XXXXXXXXXX”</w:t>
-      </w:r>
-      <w:r>
-        <w:rPr>
-          <w:sz w:val="24"/>
-        </w:rPr>
-        <w:br/>
-        <w:t xml:space="preserve">For </w:t>
-      </w:r>
-      <w:proofErr w:type="spellStart"/>
-      <w:r>
-        <w:rPr>
-          <w:sz w:val="24"/>
-        </w:rPr>
-        <w:t>Pincode</w:t>
-      </w:r>
-      <w:proofErr w:type="spellEnd"/>
-      <w:r>
-        <w:rPr>
-          <w:sz w:val="24"/>
-        </w:rPr>
-        <w:t xml:space="preserve"> use “Enter </w:t>
-      </w:r>
-      <w:proofErr w:type="spellStart"/>
-      <w:r>
-        <w:rPr>
-          <w:sz w:val="24"/>
-        </w:rPr>
-        <w:t>Pincode</w:t>
-      </w:r>
-      <w:proofErr w:type="spellEnd"/>
-      <w:r>
-        <w:rPr>
-          <w:sz w:val="24"/>
-        </w:rPr>
-        <w:t>”</w:t>
-      </w:r>
-    </w:p>
-    <w:p>
-      <w:pPr>
-        <w:rPr>
-          <w:sz w:val="24"/>
-        </w:rPr>
-      </w:pPr>
-    </w:p>
-    <w:p>
-      <w:pPr>
-        <w:rPr>
-          <w:sz w:val="24"/>
-        </w:rPr>
-      </w:pPr>
-    </w:p>
-    <w:p>
-      <w:pPr>
-        <w:rPr>
-          <w:sz w:val="24"/>
-        </w:rPr>
-      </w:pPr>
-      <w:r>
-        <w:rPr>
-          <w:sz w:val="24"/>
-        </w:rPr>
-        <w:t>P</w:t>
-      </w:r>
-      <w:r>
-        <w:rPr>
-          <w:sz w:val="24"/>
-        </w:rPr>
-        <w:t xml:space="preserve">roblem 3: </w:t>
-      </w:r>
-      <w:r>
-        <w:rPr>
-          <w:sz w:val="24"/>
-        </w:rPr>
-        <w:t>Resume Parsing is give more priority than the data inputted through create account section of the page.</w:t>
-      </w:r>
-      <w:r>
-        <w:rPr>
-          <w:sz w:val="24"/>
-        </w:rPr>
-        <w:br/>
-      </w:r>
-      <w:r>
-        <w:rPr>
-          <w:sz w:val="24"/>
-        </w:rPr>
-        <w:br/>
-        <w:t xml:space="preserve">Changes Required: </w:t>
-      </w:r>
-      <w:r>
-        <w:rPr>
-          <w:sz w:val="24"/>
-        </w:rPr>
-        <w:t xml:space="preserve">Before parsing from resume, the data </w:t>
-      </w:r>
-      <w:r>
-        <w:rPr>
-          <w:sz w:val="24"/>
-        </w:rPr>
-        <w:t xml:space="preserve">the user </w:t>
-      </w:r>
-      <w:r>
-        <w:rPr>
-          <w:sz w:val="24"/>
-        </w:rPr>
-        <w:t xml:space="preserve">entered in the create account section of the page must be automatically filled in the respective form elements in the Personal information section. </w:t>
-      </w:r>
-      <w:r>
-        <w:rPr>
-          <w:sz w:val="24"/>
-        </w:rPr>
-        <w:t>User can manually edit the field even though the field is automatically filled.</w:t>
-      </w:r>
-      <w:r>
-        <w:rPr>
-          <w:sz w:val="24"/>
-        </w:rPr>
-        <w:br/>
-      </w:r>
-      <w:r>
-        <w:rPr>
-          <w:sz w:val="24"/>
-        </w:rPr>
-        <w:t>In other words, the data he</w:t>
-      </w:r>
-      <w:r>
-        <w:rPr>
-          <w:sz w:val="24"/>
-        </w:rPr>
-        <w:t>/she</w:t>
-      </w:r>
-      <w:r>
-        <w:rPr>
-          <w:sz w:val="24"/>
-        </w:rPr>
-        <w:t xml:space="preserve"> entered </w:t>
-      </w:r>
-      <w:r>
-        <w:rPr>
-          <w:sz w:val="24"/>
-        </w:rPr>
-        <w:t>in the create account section</w:t>
-      </w:r>
-      <w:r>
-        <w:rPr>
-          <w:sz w:val="24"/>
-        </w:rPr>
-        <w:t xml:space="preserve"> of the page must be given more priority then what is parsed from resume </w:t>
-      </w:r>
-      <w:r>
-        <w:rPr>
-          <w:sz w:val="24"/>
-        </w:rPr>
-        <w:t>(</w:t>
-      </w:r>
-      <w:r>
-        <w:rPr>
-          <w:sz w:val="24"/>
-        </w:rPr>
-        <w:t>which is up</w:t>
-      </w:r>
-      <w:r>
-        <w:rPr>
-          <w:sz w:val="24"/>
-        </w:rPr>
-        <w:t xml:space="preserve">loaded) and must automatically be filled in the form in </w:t>
-      </w:r>
-      <w:r>
-        <w:rPr>
-          <w:sz w:val="24"/>
-        </w:rPr>
-        <w:t xml:space="preserve">Personal information </w:t>
-      </w:r>
-      <w:r>
-        <w:rPr>
-          <w:sz w:val="24"/>
-        </w:rPr>
-        <w:t xml:space="preserve">section. </w:t>
-      </w:r>
-      <w:r>
-        <w:rPr>
-          <w:sz w:val="24"/>
-        </w:rPr>
-        <w:br/>
-        <w:t xml:space="preserve">For all other details asked in the user form in the personal information section of the </w:t>
-      </w:r>
-      <w:proofErr w:type="spellStart"/>
-      <w:r>
-        <w:rPr>
-          <w:sz w:val="24"/>
-          <w:szCs w:val="24"/>
-        </w:rPr>
-        <w:t>RegistrationFlow.jsx</w:t>
-      </w:r>
-      <w:proofErr w:type="spellEnd"/>
-      <w:r>
-        <w:rPr>
-          <w:sz w:val="24"/>
-          <w:szCs w:val="24"/>
-        </w:rPr>
-        <w:t>,</w:t>
-      </w:r>
-      <w:r>
-        <w:rPr>
-          <w:sz w:val="24"/>
-          <w:szCs w:val="24"/>
-        </w:rPr>
-        <w:t xml:space="preserve"> </w:t>
-      </w:r>
-      <w:r>
-        <w:rPr>
-          <w:sz w:val="24"/>
-        </w:rPr>
-        <w:t>can be filled automatically through parsed data from resume or be manually filled by user.</w:t>
-      </w:r>
-      <w:r>
-        <w:rPr>
-          <w:sz w:val="24"/>
-        </w:rPr>
-        <w:t xml:space="preserve"> </w:t>
-      </w:r>
-    </w:p>
-    <w:p>
-      <w:pPr>
-        <w:rPr>
-          <w:sz w:val="24"/>
-        </w:rPr>
-      </w:pPr>
-    </w:p>
-    <w:p>
-      <w:pPr>
-        <w:rPr>
-          <w:sz w:val="24"/>
-        </w:rPr>
-      </w:pPr>
-      <w:r>
-        <w:rPr>
-          <w:sz w:val="24"/>
-        </w:rPr>
-        <w:t>Code Reference</w:t>
-      </w:r>
-      <w:proofErr w:type="gramStart"/>
-      <w:r>
-        <w:rPr>
-          <w:sz w:val="24"/>
-        </w:rPr>
-        <w:t>:</w:t>
-      </w:r>
-      <w:proofErr w:type="gramEnd"/>
-      <w:r>
-        <w:rPr>
-          <w:sz w:val="24"/>
-        </w:rPr>
-        <w:br/>
-      </w:r>
-      <w:r>
-        <w:rPr>
-          <w:sz w:val="24"/>
-        </w:rPr>
-        <w:br/>
-        <w:t>Create Account section:</w:t>
-      </w:r>
-      <w:r>
-        <w:rPr>
-          <w:sz w:val="24"/>
-        </w:rPr>
-        <w:br/>
-      </w:r>
-      <w:r>
-        <w:rPr>
-          <w:sz w:val="24"/>
-        </w:rPr>
-        <w:t>{step === 0 &amp;&amp; (</w:t>
-      </w:r>
-    </w:p>
-    <w:p>
-      <w:pPr>
-        <w:rPr>
-          <w:sz w:val="24"/>
-        </w:rPr>
-      </w:pPr>
-      <w:r>
-        <w:rPr>
-          <w:sz w:val="24"/>
-        </w:rPr>
-        <w:t xml:space="preserve">        &lt;main </w:t>
-      </w:r>
-      <w:proofErr w:type="spellStart"/>
-      <w:r>
-        <w:rPr>
-          <w:sz w:val="24"/>
-        </w:rPr>
-        <w:t>className</w:t>
-      </w:r>
-      <w:proofErr w:type="spellEnd"/>
-      <w:r>
-        <w:rPr>
-          <w:sz w:val="24"/>
-        </w:rPr>
-        <w:t xml:space="preserve">="flex-grow flex flex-col </w:t>
-      </w:r>
-      <w:proofErr w:type="spellStart"/>
-      <w:r>
-        <w:rPr>
-          <w:sz w:val="24"/>
-        </w:rPr>
-        <w:t>md</w:t>
-      </w:r>
-      <w:proofErr w:type="gramStart"/>
-      <w:r>
-        <w:rPr>
-          <w:sz w:val="24"/>
-        </w:rPr>
-        <w:t>:flex</w:t>
-      </w:r>
-      <w:proofErr w:type="gramEnd"/>
-      <w:r>
-        <w:rPr>
-          <w:sz w:val="24"/>
-        </w:rPr>
-        <w:t>-row</w:t>
-      </w:r>
-      <w:proofErr w:type="spellEnd"/>
-      <w:r>
-        <w:rPr>
-          <w:sz w:val="24"/>
-        </w:rPr>
-        <w:t xml:space="preserve"> max-w-7xl mx-auto w-full pt-8"&gt;</w:t>
-      </w:r>
-    </w:p>
-    <w:p>
-      <w:pPr>
-        <w:rPr>
-          <w:sz w:val="24"/>
-        </w:rPr>
-      </w:pPr>
-      <w:r>
-        <w:rPr>
-          <w:sz w:val="24"/>
-        </w:rPr>
-        <w:t>…………………………….</w:t>
-      </w:r>
-      <w:r>
-        <w:rPr>
-          <w:sz w:val="24"/>
-        </w:rPr>
-        <w:t xml:space="preserve">        </w:t>
-      </w:r>
-      <w:r>
-        <w:rPr>
-          <w:sz w:val="24"/>
-        </w:rPr>
-        <w:br/>
-      </w:r>
-      <w:r>
-        <w:rPr>
-          <w:sz w:val="24"/>
-        </w:rPr>
-        <w:t>&lt;/main&gt;</w:t>
-      </w:r>
-    </w:p>
-    <w:p>
-      <w:pPr>
-        <w:rPr>
-          <w:sz w:val="24"/>
-        </w:rPr>
-      </w:pPr>
-      <w:r>
-        <w:rPr>
-          <w:sz w:val="24"/>
-        </w:rPr>
-        <w:t xml:space="preserve">      )}</w:t>
-      </w:r>
-    </w:p>
-    <w:p>
-      <w:pPr>
-        <w:rPr>
-          <w:sz w:val="24"/>
-        </w:rPr>
-      </w:pPr>
-      <w:r>
-        <w:rPr>
-          <w:sz w:val="24"/>
-        </w:rPr>
-        <w:br/>
-        <w:t>Personal Information Section:</w:t>
-      </w:r>
-      <w:r>
-        <w:rPr>
-          <w:sz w:val="24"/>
-        </w:rPr>
-        <w:br/>
-      </w:r>
-      <w:r>
-        <w:rPr>
-          <w:sz w:val="24"/>
-        </w:rPr>
-        <w:br/>
-      </w:r>
-      <w:r>
-        <w:rPr>
-          <w:sz w:val="24"/>
-        </w:rPr>
-        <w:t xml:space="preserve">  {step === 1 &amp;&amp; (</w:t>
-      </w:r>
-    </w:p>
-    <w:p>
-      <w:pPr>
-        <w:rPr>
-          <w:sz w:val="24"/>
-        </w:rPr>
-      </w:pPr>
-      <w:r>
-        <w:rPr>
-          <w:sz w:val="24"/>
-        </w:rPr>
-        <w:t xml:space="preserve">        &lt;main </w:t>
-      </w:r>
-      <w:proofErr w:type="spellStart"/>
-      <w:r>
-        <w:rPr>
-          <w:sz w:val="24"/>
-        </w:rPr>
-        <w:t>className</w:t>
-      </w:r>
-      <w:proofErr w:type="spellEnd"/>
-      <w:r>
-        <w:rPr>
-          <w:sz w:val="24"/>
-        </w:rPr>
-        <w:t>="flex-grow mx-auto px-6 py-12 w-full max-w-7xl pt-16"&gt;</w:t>
-      </w:r>
-      <w:r>
-        <w:rPr>
-          <w:sz w:val="24"/>
-        </w:rPr>
-        <w:br/>
-        <w:t>…………………………………………………………………………</w:t>
-      </w:r>
-    </w:p>
-    <w:p>
-      <w:pPr>
-        <w:rPr>
-          <w:sz w:val="24"/>
-        </w:rPr>
-      </w:pPr>
-      <w:r>
-        <w:rPr>
-          <w:sz w:val="24"/>
-        </w:rPr>
-        <w:t xml:space="preserve">        &lt;/main&gt;</w:t>
-      </w:r>
-    </w:p>
-    <w:p>
-      <w:pPr>
-        <w:rPr>
-          <w:sz w:val="24"/>
-        </w:rPr>
-      </w:pPr>
-      <w:r>
-        <w:rPr>
-          <w:sz w:val="24"/>
-        </w:rPr>
-        <w:t xml:space="preserve">      )}</w:t>
-      </w:r>
-      <w:r>
-        <w:rPr>
-          <w:sz w:val="24"/>
-        </w:rPr>
-        <w:br/>
-      </w:r>
-    </w:p>
-    <w:p>
-      <w:pPr>
-        <w:rPr>
-          <w:sz w:val="24"/>
-        </w:rPr>
-      </w:pPr>
-      <w:r>
-        <w:rPr>
-          <w:sz w:val="24"/>
-        </w:rPr>
-        <w:lastRenderedPageBreak/>
-        <w:br/>
-      </w:r>
-      <w:r>
-        <w:rPr>
-          <w:sz w:val="24"/>
-        </w:rPr>
-        <w:t xml:space="preserve">Problem 4: In the </w:t>
-      </w:r>
-      <w:r>
-        <w:rPr>
-          <w:sz w:val="24"/>
-        </w:rPr>
-        <w:t>Education &amp; Internships</w:t>
-      </w:r>
-      <w:r>
-        <w:rPr>
-          <w:sz w:val="24"/>
-        </w:rPr>
-        <w:t xml:space="preserve"> part of the code, the input field types need </w:t>
-      </w:r>
-      <w:proofErr w:type="spellStart"/>
-      <w:r>
-        <w:rPr>
-          <w:sz w:val="24"/>
-        </w:rPr>
-        <w:t>tobe</w:t>
-      </w:r>
-      <w:proofErr w:type="spellEnd"/>
-      <w:r>
-        <w:rPr>
-          <w:sz w:val="24"/>
-        </w:rPr>
-        <w:t xml:space="preserve"> changed.</w:t>
-      </w:r>
-      <w:r>
-        <w:rPr>
-          <w:sz w:val="24"/>
-        </w:rPr>
-        <w:br/>
-      </w:r>
-      <w:r>
-        <w:rPr>
-          <w:sz w:val="24"/>
-        </w:rPr>
-        <w:br/>
-        <w:t>Changes Required: Under undergraduate degree for Degree / major, use drop down list with predefined list of degrees.</w:t>
-      </w:r>
-      <w:r>
-        <w:rPr>
-          <w:sz w:val="24"/>
-        </w:rPr>
-        <w:br/>
-        <w:t>It should include only bachelor degrees and it should be related to engineering, commerce or IT. It can also include any specialization degree as well. Minimum 6-7 list of degrees would be good.</w:t>
-      </w:r>
-      <w:r>
-        <w:rPr>
-          <w:sz w:val="24"/>
-        </w:rPr>
-        <w:br/>
-      </w:r>
-      <w:r>
-        <w:rPr>
-          <w:sz w:val="24"/>
-        </w:rPr>
-        <w:br/>
-        <w:t xml:space="preserve">For example: BCA, BBA, </w:t>
-      </w:r>
-      <w:proofErr w:type="spellStart"/>
-      <w:r>
-        <w:rPr>
-          <w:sz w:val="24"/>
-        </w:rPr>
-        <w:t>Btech</w:t>
-      </w:r>
-      <w:proofErr w:type="spellEnd"/>
-      <w:r>
-        <w:rPr>
-          <w:sz w:val="24"/>
-        </w:rPr>
-        <w:t xml:space="preserve">, BSc, </w:t>
-      </w:r>
-      <w:proofErr w:type="spellStart"/>
-      <w:r>
-        <w:rPr>
-          <w:sz w:val="24"/>
-        </w:rPr>
-        <w:t>Bcom</w:t>
-      </w:r>
-      <w:proofErr w:type="spellEnd"/>
-      <w:r>
-        <w:rPr>
-          <w:sz w:val="24"/>
-        </w:rPr>
-        <w:t xml:space="preserve"> etc.</w:t>
-      </w:r>
-      <w:r>
-        <w:rPr>
-          <w:sz w:val="24"/>
-        </w:rPr>
-        <w:br/>
-      </w:r>
-      <w:r>
-        <w:rPr>
-          <w:sz w:val="24"/>
-        </w:rPr>
-        <w:br/>
-      </w:r>
-      <w:r>
-        <w:rPr>
-          <w:sz w:val="24"/>
-        </w:rPr>
-        <w:br/>
-      </w:r>
-      <w:r>
-        <w:rPr>
-          <w:sz w:val="24"/>
-        </w:rPr>
-        <w:t xml:space="preserve">Under </w:t>
-      </w:r>
-      <w:r>
-        <w:rPr>
-          <w:sz w:val="24"/>
-        </w:rPr>
-        <w:t xml:space="preserve">postgraduate degree also, </w:t>
-      </w:r>
-      <w:r>
-        <w:rPr>
-          <w:sz w:val="24"/>
-        </w:rPr>
-        <w:t>for Degree / major, use drop down list with predefined list of degrees.</w:t>
-      </w:r>
-      <w:r>
-        <w:rPr>
-          <w:sz w:val="24"/>
-        </w:rPr>
-        <w:br/>
-        <w:t xml:space="preserve">It should include only </w:t>
-      </w:r>
-      <w:proofErr w:type="gramStart"/>
-      <w:r>
-        <w:rPr>
-          <w:sz w:val="24"/>
-        </w:rPr>
-        <w:t>masters</w:t>
-      </w:r>
-      <w:proofErr w:type="gramEnd"/>
-      <w:r>
-        <w:rPr>
-          <w:sz w:val="24"/>
-        </w:rPr>
-        <w:t xml:space="preserve"> </w:t>
-      </w:r>
-      <w:r>
-        <w:rPr>
-          <w:sz w:val="24"/>
-        </w:rPr>
-        <w:t>degrees</w:t>
-      </w:r>
-      <w:r>
-        <w:rPr>
-          <w:sz w:val="24"/>
-        </w:rPr>
-        <w:t xml:space="preserve"> that are </w:t>
-      </w:r>
-      <w:r>
-        <w:rPr>
-          <w:sz w:val="24"/>
-        </w:rPr>
-        <w:t>related to engineering, commerce or IT</w:t>
-      </w:r>
-      <w:r>
-        <w:rPr>
-          <w:sz w:val="24"/>
-        </w:rPr>
-        <w:t>.</w:t>
-      </w:r>
-      <w:r>
-        <w:rPr>
-          <w:sz w:val="24"/>
-        </w:rPr>
-        <w:br/>
-      </w:r>
-      <w:r>
-        <w:rPr>
-          <w:sz w:val="24"/>
-        </w:rPr>
-        <w:br/>
-        <w:t xml:space="preserve">For example: MCA, </w:t>
-      </w:r>
-      <w:proofErr w:type="spellStart"/>
-      <w:r>
-        <w:rPr>
-          <w:sz w:val="24"/>
-        </w:rPr>
-        <w:t>Mtech</w:t>
-      </w:r>
-      <w:proofErr w:type="spellEnd"/>
-      <w:r>
-        <w:rPr>
-          <w:sz w:val="24"/>
-        </w:rPr>
-        <w:t>, MBA etc…</w:t>
       </w:r>
     </w:p>
     <w:p>
@@ -8501,6 +8303,7 @@
         <w:rPr>
           <w:sz w:val="24"/>
         </w:rPr>
+        <w:lastRenderedPageBreak/>
         <w:t xml:space="preserve"> </w:t>
       </w:r>
       <w:r>
@@ -8520,7 +8323,6 @@
         <w:rPr>
           <w:sz w:val="24"/>
         </w:rPr>
-        <w:lastRenderedPageBreak/>
         <w:t xml:space="preserve">      </w:t>
       </w:r>
       <w:proofErr w:type="gramStart"/>
@@ -9012,6 +8814,7 @@
           <w:b/>
           <w:sz w:val="28"/>
         </w:rPr>
+        <w:lastRenderedPageBreak/>
         <w:t>School</w:t>
       </w:r>
     </w:p>
@@ -9026,7 +8829,6 @@
         <w:rPr>
           <w:sz w:val="28"/>
         </w:rPr>
-        <w:lastRenderedPageBreak/>
         <w:t>Kendriya</w:t>
       </w:r>
       <w:proofErr w:type="spellEnd"/>
@@ -9247,8 +9049,6 @@
         </w:rPr>
         <w:t>Target Role &lt;span class="text-error"&gt;*&lt;/span&gt;</w:t>
       </w:r>
-      <w:bookmarkStart w:id="0" w:name="_GoBack"/>
-      <w:bookmarkEnd w:id="0"/>
       <w:r>
         <w:rPr>
           <w:sz w:val="28"/>

</xml_diff>

<commit_message>
Modified files - dashboard and assessment setup (18th June)
</commit_message>
<xml_diff>
--- a/PBL synopsis/Useful prompts.docx
+++ b/PBL synopsis/Useful prompts.docx
@@ -5327,8 +5327,6 @@
         <w:lastRenderedPageBreak/>
         <w:t>Prompt 20[</w:t>
       </w:r>
-      <w:bookmarkStart w:id="0" w:name="_GoBack"/>
-      <w:bookmarkEnd w:id="0"/>
       <w:r>
         <w:rPr>
           <w:b/>
@@ -7747,111 +7745,674 @@
           <w:sz w:val="24"/>
         </w:rPr>
       </w:pPr>
-    </w:p>
-    <w:p>
-      <w:pPr>
-        <w:rPr>
-          <w:sz w:val="24"/>
-        </w:rPr>
-      </w:pPr>
-    </w:p>
-    <w:p>
-      <w:pPr>
-        <w:rPr>
-          <w:sz w:val="24"/>
-        </w:rPr>
-      </w:pPr>
-    </w:p>
-    <w:p>
-      <w:pPr>
-        <w:rPr>
-          <w:sz w:val="24"/>
-        </w:rPr>
-      </w:pPr>
-    </w:p>
-    <w:p>
-      <w:pPr>
-        <w:rPr>
-          <w:sz w:val="24"/>
-        </w:rPr>
-      </w:pPr>
-    </w:p>
-    <w:p>
-      <w:pPr>
-        <w:rPr>
-          <w:sz w:val="24"/>
-        </w:rPr>
-      </w:pPr>
-    </w:p>
-    <w:p>
-      <w:pPr>
-        <w:rPr>
-          <w:sz w:val="24"/>
-        </w:rPr>
-      </w:pPr>
-    </w:p>
-    <w:p>
-      <w:pPr>
-        <w:rPr>
-          <w:sz w:val="24"/>
-        </w:rPr>
-      </w:pPr>
-    </w:p>
-    <w:p>
-      <w:pPr>
-        <w:rPr>
-          <w:sz w:val="24"/>
-        </w:rPr>
-      </w:pPr>
-    </w:p>
-    <w:p>
-      <w:pPr>
-        <w:rPr>
-          <w:sz w:val="24"/>
-        </w:rPr>
-      </w:pPr>
-    </w:p>
-    <w:p>
-      <w:pPr>
-        <w:rPr>
-          <w:sz w:val="24"/>
-        </w:rPr>
-      </w:pPr>
-    </w:p>
-    <w:p>
-      <w:pPr>
-        <w:rPr>
-          <w:sz w:val="24"/>
-        </w:rPr>
-      </w:pPr>
-    </w:p>
-    <w:p>
-      <w:pPr>
-        <w:rPr>
-          <w:sz w:val="24"/>
-        </w:rPr>
-      </w:pPr>
-    </w:p>
-    <w:p>
-      <w:pPr>
-        <w:rPr>
-          <w:sz w:val="24"/>
-        </w:rPr>
-      </w:pPr>
-    </w:p>
-    <w:p>
-      <w:pPr>
-        <w:rPr>
-          <w:sz w:val="24"/>
-        </w:rPr>
-      </w:pPr>
-    </w:p>
-    <w:p>
-      <w:pPr>
-        <w:rPr>
-          <w:sz w:val="24"/>
-        </w:rPr>
-      </w:pPr>
+      <w:r>
+        <w:rPr>
+          <w:sz w:val="24"/>
+        </w:rPr>
+        <w:t>For logged in user or existing user, I have noticed few design and functionalities issues in this project:</w:t>
+      </w:r>
+      <w:r>
+        <w:rPr>
+          <w:sz w:val="24"/>
+        </w:rPr>
+        <w:br/>
+      </w:r>
+    </w:p>
+    <w:p>
+      <w:pPr>
+        <w:rPr>
+          <w:sz w:val="24"/>
+        </w:rPr>
+      </w:pPr>
+      <w:r>
+        <w:rPr>
+          <w:sz w:val="24"/>
+        </w:rPr>
+        <w:t xml:space="preserve">Filename: </w:t>
+      </w:r>
+      <w:proofErr w:type="spellStart"/>
+      <w:r>
+        <w:rPr>
+          <w:sz w:val="24"/>
+        </w:rPr>
+        <w:t>DashboardPage.jsx</w:t>
+      </w:r>
+      <w:proofErr w:type="spellEnd"/>
+      <w:r>
+        <w:rPr>
+          <w:sz w:val="24"/>
+        </w:rPr>
+        <w:t xml:space="preserve"> </w:t>
+      </w:r>
+    </w:p>
+    <w:p>
+      <w:pPr>
+        <w:rPr>
+          <w:sz w:val="24"/>
+        </w:rPr>
+      </w:pPr>
+      <w:bookmarkStart w:id="0" w:name="_GoBack"/>
+      <w:r>
+        <w:rPr>
+          <w:sz w:val="24"/>
+        </w:rPr>
+        <w:t xml:space="preserve">Problem 1: I clicked on “Assessments” hyperlink in the header in Dashboard page and got redirected to </w:t>
+      </w:r>
+      <w:hyperlink r:id="rId9" w:history="1">
+        <w:r>
+          <w:rPr>
+            <w:rStyle w:val="Hyperlink"/>
+            <w:sz w:val="24"/>
+          </w:rPr>
+          <w:t>http://localhost:5173/assessments/setup</w:t>
+        </w:r>
+      </w:hyperlink>
+      <w:r>
+        <w:rPr>
+          <w:sz w:val="24"/>
+        </w:rPr>
+        <w:t xml:space="preserve">. When choosing the target role in </w:t>
+      </w:r>
+      <w:proofErr w:type="spellStart"/>
+      <w:proofErr w:type="gramStart"/>
+      <w:r>
+        <w:rPr>
+          <w:sz w:val="24"/>
+        </w:rPr>
+        <w:t>AssessmentSetupPage.jsx</w:t>
+      </w:r>
+      <w:proofErr w:type="spellEnd"/>
+      <w:r>
+        <w:rPr>
+          <w:sz w:val="24"/>
+        </w:rPr>
+        <w:t xml:space="preserve">  and</w:t>
+      </w:r>
+      <w:proofErr w:type="gramEnd"/>
+      <w:r>
+        <w:rPr>
+          <w:sz w:val="24"/>
+        </w:rPr>
+        <w:t xml:space="preserve"> clicking on “Take me to the Assessment button” it says Authentication required error.</w:t>
+      </w:r>
+      <w:r>
+        <w:rPr>
+          <w:sz w:val="24"/>
+        </w:rPr>
+        <w:br/>
+      </w:r>
+      <w:r>
+        <w:rPr>
+          <w:sz w:val="24"/>
+        </w:rPr>
+        <w:br/>
+        <w:t>Please resolve this problem.</w:t>
+      </w:r>
+    </w:p>
+    <w:bookmarkEnd w:id="0"/>
+    <w:p>
+      <w:pPr>
+        <w:rPr>
+          <w:sz w:val="24"/>
+        </w:rPr>
+      </w:pPr>
+      <w:r>
+        <w:rPr>
+          <w:sz w:val="24"/>
+        </w:rPr>
+        <w:t xml:space="preserve"> Problem 4: On hover, the navigation link doesn’t change colour.</w:t>
+      </w:r>
+    </w:p>
+    <w:p>
+      <w:pPr>
+        <w:rPr>
+          <w:sz w:val="24"/>
+        </w:rPr>
+      </w:pPr>
+      <w:r>
+        <w:rPr>
+          <w:sz w:val="24"/>
+        </w:rPr>
+        <w:t xml:space="preserve">Changes required: </w:t>
+      </w:r>
+      <w:r>
+        <w:rPr>
+          <w:sz w:val="24"/>
+        </w:rPr>
+        <w:t xml:space="preserve">On hover, the hyperlinks to change the </w:t>
+      </w:r>
+      <w:proofErr w:type="spellStart"/>
+      <w:r>
+        <w:rPr>
+          <w:sz w:val="24"/>
+        </w:rPr>
+        <w:t>color</w:t>
+      </w:r>
+      <w:proofErr w:type="spellEnd"/>
+      <w:r>
+        <w:rPr>
+          <w:sz w:val="24"/>
+        </w:rPr>
+        <w:t xml:space="preserve"> blue matching the web page theme.</w:t>
+      </w:r>
+    </w:p>
+    <w:p>
+      <w:pPr>
+        <w:rPr>
+          <w:sz w:val="24"/>
+        </w:rPr>
+      </w:pPr>
+      <w:r>
+        <w:rPr>
+          <w:sz w:val="24"/>
+        </w:rPr>
+        <w:t xml:space="preserve">Code reference: </w:t>
+      </w:r>
+      <w:r>
+        <w:rPr>
+          <w:sz w:val="24"/>
+        </w:rPr>
+        <w:br/>
+      </w:r>
+      <w:r>
+        <w:rPr>
+          <w:sz w:val="24"/>
+        </w:rPr>
+        <w:t>&lt;header class="</w:t>
+      </w:r>
+      <w:proofErr w:type="spellStart"/>
+      <w:r>
+        <w:rPr>
+          <w:sz w:val="24"/>
+        </w:rPr>
+        <w:t>bg</w:t>
+      </w:r>
+      <w:proofErr w:type="spellEnd"/>
+      <w:r>
+        <w:rPr>
+          <w:sz w:val="24"/>
+        </w:rPr>
+        <w:t>-white border-b border-gray-100 py-6 px-8 md:px-12 lg:px-24 flex justify-between items-</w:t>
+      </w:r>
+      <w:proofErr w:type="spellStart"/>
+      <w:r>
+        <w:rPr>
+          <w:sz w:val="24"/>
+        </w:rPr>
+        <w:t>center</w:t>
+      </w:r>
+      <w:proofErr w:type="spellEnd"/>
+      <w:r>
+        <w:rPr>
+          <w:sz w:val="24"/>
+        </w:rPr>
+        <w:t xml:space="preserve"> fixed top-0 w-full z-50 mb-12" data-purpose="main-header"&gt;&lt;div class="flex items-</w:t>
+      </w:r>
+      <w:proofErr w:type="spellStart"/>
+      <w:r>
+        <w:rPr>
+          <w:sz w:val="24"/>
+        </w:rPr>
+        <w:t>center</w:t>
+      </w:r>
+      <w:proofErr w:type="spellEnd"/>
+      <w:r>
+        <w:rPr>
+          <w:sz w:val="24"/>
+        </w:rPr>
+        <w:t xml:space="preserve"> gap-2"&gt;&lt;a class="no-underline" </w:t>
+      </w:r>
+      <w:proofErr w:type="spellStart"/>
+      <w:r>
+        <w:rPr>
+          <w:sz w:val="24"/>
+        </w:rPr>
+        <w:t>href</w:t>
+      </w:r>
+      <w:proofErr w:type="spellEnd"/>
+      <w:r>
+        <w:rPr>
+          <w:sz w:val="24"/>
+        </w:rPr>
+        <w:t>="/dashboard" data-discover="true"&gt;&lt;span class="text-3xl font-bold tracking-tight text-[#1a1a1a]"&gt;Skill&lt;span class="text-[#0052FF]"&gt;Bridge&lt;/span&gt;&lt;/span&gt;&lt;/a&gt;&lt;/div&gt;&lt;</w:t>
+      </w:r>
+      <w:proofErr w:type="spellStart"/>
+      <w:r>
+        <w:rPr>
+          <w:sz w:val="24"/>
+        </w:rPr>
+        <w:t>nav</w:t>
+      </w:r>
+      <w:proofErr w:type="spellEnd"/>
+      <w:r>
+        <w:rPr>
+          <w:sz w:val="24"/>
+        </w:rPr>
+        <w:t xml:space="preserve"> class="hidden </w:t>
+      </w:r>
+      <w:proofErr w:type="spellStart"/>
+      <w:r>
+        <w:rPr>
+          <w:sz w:val="24"/>
+        </w:rPr>
+        <w:t>md:flex</w:t>
+      </w:r>
+      <w:proofErr w:type="spellEnd"/>
+      <w:r>
+        <w:rPr>
+          <w:sz w:val="24"/>
+        </w:rPr>
+        <w:t xml:space="preserve"> items-</w:t>
+      </w:r>
+      <w:proofErr w:type="spellStart"/>
+      <w:r>
+        <w:rPr>
+          <w:sz w:val="24"/>
+        </w:rPr>
+        <w:t>center</w:t>
+      </w:r>
+      <w:proofErr w:type="spellEnd"/>
+      <w:r>
+        <w:rPr>
+          <w:sz w:val="24"/>
+        </w:rPr>
+        <w:t xml:space="preserve"> gap-10 text-</w:t>
+      </w:r>
+      <w:proofErr w:type="spellStart"/>
+      <w:r>
+        <w:rPr>
+          <w:sz w:val="24"/>
+        </w:rPr>
+        <w:t>lg</w:t>
+      </w:r>
+      <w:proofErr w:type="spellEnd"/>
+      <w:r>
+        <w:rPr>
+          <w:sz w:val="24"/>
+        </w:rPr>
+        <w:t xml:space="preserve"> font-medium text-gray-600"&gt;&lt;a class="transition-</w:t>
+      </w:r>
+      <w:proofErr w:type="spellStart"/>
+      <w:r>
+        <w:rPr>
+          <w:sz w:val="24"/>
+        </w:rPr>
+        <w:t>colors</w:t>
+      </w:r>
+      <w:proofErr w:type="spellEnd"/>
+      <w:r>
+        <w:rPr>
+          <w:sz w:val="24"/>
+        </w:rPr>
+        <w:t xml:space="preserve"> text-</w:t>
+      </w:r>
+      <w:proofErr w:type="spellStart"/>
+      <w:r>
+        <w:rPr>
+          <w:sz w:val="24"/>
+        </w:rPr>
+        <w:t>lg</w:t>
+      </w:r>
+      <w:proofErr w:type="spellEnd"/>
+      <w:r>
+        <w:rPr>
+          <w:sz w:val="24"/>
+        </w:rPr>
+        <w:t xml:space="preserve"> text-</w:t>
+      </w:r>
+      <w:proofErr w:type="spellStart"/>
+      <w:r>
+        <w:rPr>
+          <w:sz w:val="24"/>
+        </w:rPr>
+        <w:lastRenderedPageBreak/>
+        <w:t>skillblue</w:t>
+      </w:r>
+      <w:proofErr w:type="spellEnd"/>
+      <w:r>
+        <w:rPr>
+          <w:sz w:val="24"/>
+        </w:rPr>
+        <w:t xml:space="preserve">" </w:t>
+      </w:r>
+      <w:proofErr w:type="spellStart"/>
+      <w:r>
+        <w:rPr>
+          <w:sz w:val="24"/>
+        </w:rPr>
+        <w:t>href</w:t>
+      </w:r>
+      <w:proofErr w:type="spellEnd"/>
+      <w:r>
+        <w:rPr>
+          <w:sz w:val="24"/>
+        </w:rPr>
+        <w:t>="/dashboard" data-discover="true"&gt;Dashboard&lt;/a&gt;&lt;a class="transition-</w:t>
+      </w:r>
+      <w:proofErr w:type="spellStart"/>
+      <w:r>
+        <w:rPr>
+          <w:sz w:val="24"/>
+        </w:rPr>
+        <w:t>colors</w:t>
+      </w:r>
+      <w:proofErr w:type="spellEnd"/>
+      <w:r>
+        <w:rPr>
+          <w:sz w:val="24"/>
+        </w:rPr>
+        <w:t xml:space="preserve"> text-</w:t>
+      </w:r>
+      <w:proofErr w:type="spellStart"/>
+      <w:r>
+        <w:rPr>
+          <w:sz w:val="24"/>
+        </w:rPr>
+        <w:t>lg</w:t>
+      </w:r>
+      <w:proofErr w:type="spellEnd"/>
+      <w:r>
+        <w:rPr>
+          <w:sz w:val="24"/>
+        </w:rPr>
+        <w:t xml:space="preserve"> text-gray-600 </w:t>
+      </w:r>
+      <w:proofErr w:type="spellStart"/>
+      <w:r>
+        <w:rPr>
+          <w:sz w:val="24"/>
+        </w:rPr>
+        <w:t>hover:text-skillblue</w:t>
+      </w:r>
+      <w:proofErr w:type="spellEnd"/>
+      <w:r>
+        <w:rPr>
+          <w:sz w:val="24"/>
+        </w:rPr>
+        <w:t xml:space="preserve">" </w:t>
+      </w:r>
+      <w:proofErr w:type="spellStart"/>
+      <w:r>
+        <w:rPr>
+          <w:sz w:val="24"/>
+        </w:rPr>
+        <w:t>href</w:t>
+      </w:r>
+      <w:proofErr w:type="spellEnd"/>
+      <w:r>
+        <w:rPr>
+          <w:sz w:val="24"/>
+        </w:rPr>
+        <w:t>="/assessments/setup" data-discover="true"&gt;Assessments&lt;/a&gt;&lt;a class="transition-</w:t>
+      </w:r>
+      <w:proofErr w:type="spellStart"/>
+      <w:r>
+        <w:rPr>
+          <w:sz w:val="24"/>
+        </w:rPr>
+        <w:t>colors</w:t>
+      </w:r>
+      <w:proofErr w:type="spellEnd"/>
+      <w:r>
+        <w:rPr>
+          <w:sz w:val="24"/>
+        </w:rPr>
+        <w:t xml:space="preserve"> text-</w:t>
+      </w:r>
+      <w:proofErr w:type="spellStart"/>
+      <w:r>
+        <w:rPr>
+          <w:sz w:val="24"/>
+        </w:rPr>
+        <w:t>lg</w:t>
+      </w:r>
+      <w:proofErr w:type="spellEnd"/>
+      <w:r>
+        <w:rPr>
+          <w:sz w:val="24"/>
+        </w:rPr>
+        <w:t xml:space="preserve"> text-gray-600 </w:t>
+      </w:r>
+      <w:proofErr w:type="spellStart"/>
+      <w:r>
+        <w:rPr>
+          <w:sz w:val="24"/>
+        </w:rPr>
+        <w:t>hover:text-skillblue</w:t>
+      </w:r>
+      <w:proofErr w:type="spellEnd"/>
+      <w:r>
+        <w:rPr>
+          <w:sz w:val="24"/>
+        </w:rPr>
+        <w:t xml:space="preserve">" </w:t>
+      </w:r>
+      <w:proofErr w:type="spellStart"/>
+      <w:r>
+        <w:rPr>
+          <w:sz w:val="24"/>
+        </w:rPr>
+        <w:t>href</w:t>
+      </w:r>
+      <w:proofErr w:type="spellEnd"/>
+      <w:r>
+        <w:rPr>
+          <w:sz w:val="24"/>
+        </w:rPr>
+        <w:t>="/skill-gap" data-discover="true"&gt;Skill Gap&lt;/a&gt;&lt;div class="relative"&gt;&lt;button class="flex items-</w:t>
+      </w:r>
+      <w:proofErr w:type="spellStart"/>
+      <w:r>
+        <w:rPr>
+          <w:sz w:val="24"/>
+        </w:rPr>
+        <w:t>center</w:t>
+      </w:r>
+      <w:proofErr w:type="spellEnd"/>
+      <w:r>
+        <w:rPr>
+          <w:sz w:val="24"/>
+        </w:rPr>
+        <w:t xml:space="preserve"> </w:t>
+      </w:r>
+      <w:proofErr w:type="spellStart"/>
+      <w:r>
+        <w:rPr>
+          <w:sz w:val="24"/>
+        </w:rPr>
+        <w:t>bg</w:t>
+      </w:r>
+      <w:proofErr w:type="spellEnd"/>
+      <w:r>
+        <w:rPr>
+          <w:sz w:val="24"/>
+        </w:rPr>
+        <w:t>-transparent border-none cursor-pointer p-0"&gt;&lt;div class="w-10 h-10 rounded-full bg-gray-200 flex items-</w:t>
+      </w:r>
+      <w:proofErr w:type="spellStart"/>
+      <w:r>
+        <w:rPr>
+          <w:sz w:val="24"/>
+        </w:rPr>
+        <w:t>center</w:t>
+      </w:r>
+      <w:proofErr w:type="spellEnd"/>
+      <w:r>
+        <w:rPr>
+          <w:sz w:val="24"/>
+        </w:rPr>
+        <w:t xml:space="preserve"> justify-</w:t>
+      </w:r>
+      <w:proofErr w:type="spellStart"/>
+      <w:r>
+        <w:rPr>
+          <w:sz w:val="24"/>
+        </w:rPr>
+        <w:t>center</w:t>
+      </w:r>
+      <w:proofErr w:type="spellEnd"/>
+      <w:r>
+        <w:rPr>
+          <w:sz w:val="24"/>
+        </w:rPr>
+        <w:t xml:space="preserve"> overflow-hidden"&gt;&lt;</w:t>
+      </w:r>
+      <w:proofErr w:type="spellStart"/>
+      <w:r>
+        <w:rPr>
+          <w:sz w:val="24"/>
+        </w:rPr>
+        <w:t>svg</w:t>
+      </w:r>
+      <w:proofErr w:type="spellEnd"/>
+      <w:r>
+        <w:rPr>
+          <w:sz w:val="24"/>
+        </w:rPr>
+        <w:t xml:space="preserve"> width="24" height="24" fill="none" stroke="#6b7280" </w:t>
+      </w:r>
+      <w:proofErr w:type="spellStart"/>
+      <w:r>
+        <w:rPr>
+          <w:sz w:val="24"/>
+        </w:rPr>
+        <w:t>viewBox</w:t>
+      </w:r>
+      <w:proofErr w:type="spellEnd"/>
+      <w:r>
+        <w:rPr>
+          <w:sz w:val="24"/>
+        </w:rPr>
+        <w:t>="0 0 24 24"&gt;&lt;path stroke-</w:t>
+      </w:r>
+      <w:proofErr w:type="spellStart"/>
+      <w:r>
+        <w:rPr>
+          <w:sz w:val="24"/>
+        </w:rPr>
+        <w:t>linecap</w:t>
+      </w:r>
+      <w:proofErr w:type="spellEnd"/>
+      <w:r>
+        <w:rPr>
+          <w:sz w:val="24"/>
+        </w:rPr>
+        <w:t>="round" stroke-</w:t>
+      </w:r>
+      <w:proofErr w:type="spellStart"/>
+      <w:r>
+        <w:rPr>
+          <w:sz w:val="24"/>
+        </w:rPr>
+        <w:t>linejoin</w:t>
+      </w:r>
+      <w:proofErr w:type="spellEnd"/>
+      <w:r>
+        <w:rPr>
+          <w:sz w:val="24"/>
+        </w:rPr>
+        <w:t>="round" stroke-width="1.5" d="M16 7a4 4 0 11-8 0 4 4 0 018 0zM12 14a7 7 0 00-7 7h14a7 7 0 00-7-7z"&gt;&lt;/path&gt;&lt;/</w:t>
+      </w:r>
+      <w:proofErr w:type="spellStart"/>
+      <w:r>
+        <w:rPr>
+          <w:sz w:val="24"/>
+        </w:rPr>
+        <w:t>svg</w:t>
+      </w:r>
+      <w:proofErr w:type="spellEnd"/>
+      <w:r>
+        <w:rPr>
+          <w:sz w:val="24"/>
+        </w:rPr>
+        <w:t>&gt;&lt;/div&gt;&lt;/button&gt;&lt;/div&gt;&lt;/</w:t>
+      </w:r>
+      <w:proofErr w:type="spellStart"/>
+      <w:r>
+        <w:rPr>
+          <w:sz w:val="24"/>
+        </w:rPr>
+        <w:t>nav</w:t>
+      </w:r>
+      <w:proofErr w:type="spellEnd"/>
+      <w:r>
+        <w:rPr>
+          <w:sz w:val="24"/>
+        </w:rPr>
+        <w:t>&gt;&lt;/header&gt;</w:t>
+      </w:r>
+    </w:p>
+    <w:p>
+      <w:pPr>
+        <w:rPr>
+          <w:sz w:val="24"/>
+        </w:rPr>
+      </w:pPr>
+    </w:p>
+    <w:p>
+      <w:pPr>
+        <w:rPr>
+          <w:sz w:val="24"/>
+        </w:rPr>
+      </w:pPr>
+    </w:p>
+    <w:p>
+      <w:pPr>
+        <w:rPr>
+          <w:sz w:val="24"/>
+        </w:rPr>
+      </w:pPr>
+    </w:p>
+    <w:p>
+      <w:pPr>
+        <w:rPr>
+          <w:sz w:val="24"/>
+        </w:rPr>
+      </w:pPr>
+    </w:p>
+    <w:p>
+      <w:pPr>
+        <w:rPr>
+          <w:sz w:val="24"/>
+        </w:rPr>
+      </w:pPr>
+    </w:p>
+    <w:p>
+      <w:pPr>
+        <w:rPr>
+          <w:sz w:val="24"/>
+        </w:rPr>
+      </w:pPr>
+      <w:r>
+        <w:rPr>
+          <w:sz w:val="24"/>
+        </w:rPr>
+        <w:t>&lt;div class="dashboard-grid-container grid grid-cols-1 md:grid-cols-4 lg:grid-cols-12" data-purpose="dashboard-metrics-grid" style="opacity: 1;"&gt;&lt;div class="grid-item lg:col-span-5 p-8 flex flex-col justify-between min-h-card" style="opacity: 1; transform: none;"&gt;&lt;div&gt;&lt;p class="mono-label pb-2 mb</w:t>
+      </w:r>
+      <w:r>
+        <w:rPr>
+          <w:sz w:val="24"/>
+        </w:rPr>
+        <w:t>-4 uppercase"&gt;Job Readiness&lt;/p&gt;</w:t>
+      </w:r>
+      <w:r>
+        <w:rPr>
+          <w:sz w:val="24"/>
+        </w:rPr>
+        <w:t xml:space="preserve"> </w:t>
+      </w:r>
+      <w:r>
+        <w:rPr>
+          <w:sz w:val="24"/>
+        </w:rPr>
+        <w:t>………………………………………………………………………</w:t>
+      </w:r>
+      <w:r>
+        <w:rPr>
+          <w:sz w:val="24"/>
+        </w:rPr>
+        <w:t>&lt;/p&gt;&lt;/div&gt;&lt;/div&gt;&lt;/div&gt;</w:t>
+      </w:r>
     </w:p>
     <w:p>
       <w:pPr>
@@ -8013,6 +8574,7 @@
         <w:rPr>
           <w:sz w:val="24"/>
         </w:rPr>
+        <w:lastRenderedPageBreak/>
         <w:t xml:space="preserve">        &lt;main </w:t>
       </w:r>
       <w:proofErr w:type="spellStart"/>
@@ -8303,257 +8865,257 @@
         <w:rPr>
           <w:sz w:val="24"/>
         </w:rPr>
+        <w:t xml:space="preserve"> </w:t>
+      </w:r>
+      <w:r>
+        <w:rPr>
+          <w:sz w:val="24"/>
+        </w:rPr>
+        <w:t xml:space="preserve">        &lt;/main&gt;</w:t>
+      </w:r>
+    </w:p>
+    <w:p>
+      <w:pPr>
+        <w:rPr>
+          <w:sz w:val="24"/>
+        </w:rPr>
+      </w:pPr>
+      <w:r>
+        <w:rPr>
+          <w:sz w:val="24"/>
+        </w:rPr>
+        <w:t xml:space="preserve">      </w:t>
+      </w:r>
+      <w:proofErr w:type="gramStart"/>
+      <w:r>
+        <w:rPr>
+          <w:sz w:val="24"/>
+        </w:rPr>
+        <w:t>)}</w:t>
+      </w:r>
+      <w:proofErr w:type="gramEnd"/>
+      <w:r>
+        <w:rPr>
+          <w:sz w:val="24"/>
+        </w:rPr>
+        <w:br/>
+      </w:r>
+      <w:r>
+        <w:rPr>
+          <w:sz w:val="24"/>
+        </w:rPr>
+        <w:br/>
+      </w:r>
+      <w:r>
+        <w:rPr>
+          <w:sz w:val="24"/>
+        </w:rPr>
+        <w:br/>
+      </w:r>
+      <w:r>
+        <w:rPr>
+          <w:sz w:val="24"/>
+        </w:rPr>
+        <w:t>{step === 3 &amp;&amp; (</w:t>
+      </w:r>
+    </w:p>
+    <w:p>
+      <w:pPr>
+        <w:rPr>
+          <w:sz w:val="24"/>
+        </w:rPr>
+      </w:pPr>
+      <w:r>
+        <w:rPr>
+          <w:sz w:val="24"/>
+        </w:rPr>
+        <w:t xml:space="preserve">        &lt;main </w:t>
+      </w:r>
+      <w:proofErr w:type="spellStart"/>
+      <w:r>
+        <w:rPr>
+          <w:sz w:val="24"/>
+        </w:rPr>
+        <w:t>className</w:t>
+      </w:r>
+      <w:proofErr w:type="spellEnd"/>
+      <w:r>
+        <w:rPr>
+          <w:sz w:val="24"/>
+        </w:rPr>
+        <w:t>="flex-grow pt-32 pb-20 flex items-</w:t>
+      </w:r>
+      <w:proofErr w:type="spellStart"/>
+      <w:r>
+        <w:rPr>
+          <w:sz w:val="24"/>
+        </w:rPr>
+        <w:t>center</w:t>
+      </w:r>
+      <w:proofErr w:type="spellEnd"/>
+      <w:r>
+        <w:rPr>
+          <w:sz w:val="24"/>
+        </w:rPr>
+        <w:t xml:space="preserve"> justify-</w:t>
+      </w:r>
+      <w:proofErr w:type="spellStart"/>
+      <w:r>
+        <w:rPr>
+          <w:sz w:val="24"/>
+        </w:rPr>
+        <w:t>center</w:t>
+      </w:r>
+      <w:proofErr w:type="spellEnd"/>
+      <w:r>
+        <w:rPr>
+          <w:sz w:val="24"/>
+        </w:rPr>
+        <w:t xml:space="preserve"> px-4"&gt;</w:t>
+      </w:r>
+    </w:p>
+    <w:p>
+      <w:pPr>
+        <w:rPr>
+          <w:sz w:val="24"/>
+        </w:rPr>
+      </w:pPr>
+      <w:r>
+        <w:rPr>
+          <w:sz w:val="24"/>
+        </w:rPr>
+        <w:t xml:space="preserve">  </w:t>
+      </w:r>
+      <w:r>
+        <w:rPr>
+          <w:sz w:val="24"/>
+        </w:rPr>
+        <w:t>………………………………………..</w:t>
+      </w:r>
+    </w:p>
+    <w:p>
+      <w:pPr>
+        <w:rPr>
+          <w:sz w:val="24"/>
+        </w:rPr>
+      </w:pPr>
+      <w:r>
+        <w:rPr>
+          <w:sz w:val="24"/>
+        </w:rPr>
+        <w:t xml:space="preserve">        &lt;/main&gt;</w:t>
+      </w:r>
+    </w:p>
+    <w:p>
+      <w:pPr>
+        <w:rPr>
+          <w:sz w:val="24"/>
+        </w:rPr>
+      </w:pPr>
+      <w:r>
+        <w:rPr>
+          <w:sz w:val="24"/>
+        </w:rPr>
+        <w:t xml:space="preserve">      )}</w:t>
+      </w:r>
+      <w:r>
+        <w:rPr>
+          <w:sz w:val="24"/>
+        </w:rPr>
+        <w:br/>
+      </w:r>
+    </w:p>
+    <w:p>
+      <w:pPr>
+        <w:rPr>
+          <w:sz w:val="24"/>
+        </w:rPr>
+      </w:pPr>
+      <w:r>
+        <w:rPr>
+          <w:sz w:val="24"/>
+        </w:rPr>
+        <w:br/>
+      </w:r>
+      <w:r>
+        <w:rPr>
+          <w:sz w:val="24"/>
+        </w:rPr>
+        <w:t>Prompt 22 [Email OTP solution</w:t>
+      </w:r>
+      <w:proofErr w:type="gramStart"/>
+      <w:r>
+        <w:rPr>
+          <w:sz w:val="24"/>
+        </w:rPr>
+        <w:t>]</w:t>
+      </w:r>
+      <w:proofErr w:type="gramEnd"/>
+      <w:r>
+        <w:rPr>
+          <w:sz w:val="24"/>
+        </w:rPr>
+        <w:br/>
+      </w:r>
+      <w:r>
+        <w:rPr>
+          <w:sz w:val="24"/>
+        </w:rPr>
+        <w:br/>
+        <w:t xml:space="preserve">Problem: The email OTP is not being sent to user’s email. No code </w:t>
+      </w:r>
+      <w:proofErr w:type="gramStart"/>
+      <w:r>
+        <w:rPr>
+          <w:sz w:val="24"/>
+        </w:rPr>
+        <w:t>Is</w:t>
+      </w:r>
+      <w:proofErr w:type="gramEnd"/>
+      <w:r>
+        <w:rPr>
+          <w:sz w:val="24"/>
+        </w:rPr>
+        <w:t xml:space="preserve"> received in their mail.</w:t>
+      </w:r>
+      <w:r>
+        <w:rPr>
+          <w:sz w:val="24"/>
+        </w:rPr>
+        <w:br/>
+      </w:r>
+      <w:r>
+        <w:rPr>
+          <w:sz w:val="24"/>
+        </w:rPr>
+        <w:br/>
+        <w:t>Changes required: Make the Email OTP work properly and send code to the user’s email.</w:t>
+      </w:r>
+      <w:r>
+        <w:rPr>
+          <w:sz w:val="24"/>
+        </w:rPr>
+        <w:br/>
+      </w:r>
+      <w:r>
+        <w:rPr>
+          <w:sz w:val="24"/>
+        </w:rPr>
+        <w:br/>
+        <w:t>Code reference:</w:t>
+      </w:r>
+    </w:p>
+    <w:p>
+      <w:pPr>
+        <w:rPr>
+          <w:sz w:val="24"/>
+        </w:rPr>
+      </w:pPr>
+      <w:r>
+        <w:rPr>
+          <w:sz w:val="24"/>
+        </w:rPr>
         <w:lastRenderedPageBreak/>
-        <w:t xml:space="preserve"> </w:t>
-      </w:r>
-      <w:r>
-        <w:rPr>
-          <w:sz w:val="24"/>
-        </w:rPr>
-        <w:t xml:space="preserve">        &lt;/main&gt;</w:t>
-      </w:r>
-    </w:p>
-    <w:p>
-      <w:pPr>
-        <w:rPr>
-          <w:sz w:val="24"/>
-        </w:rPr>
-      </w:pPr>
-      <w:r>
-        <w:rPr>
-          <w:sz w:val="24"/>
-        </w:rPr>
-        <w:t xml:space="preserve">      </w:t>
-      </w:r>
-      <w:proofErr w:type="gramStart"/>
-      <w:r>
-        <w:rPr>
-          <w:sz w:val="24"/>
-        </w:rPr>
-        <w:t>)}</w:t>
-      </w:r>
-      <w:proofErr w:type="gramEnd"/>
-      <w:r>
-        <w:rPr>
-          <w:sz w:val="24"/>
-        </w:rPr>
-        <w:br/>
-      </w:r>
-      <w:r>
-        <w:rPr>
-          <w:sz w:val="24"/>
-        </w:rPr>
-        <w:br/>
-      </w:r>
-      <w:r>
-        <w:rPr>
-          <w:sz w:val="24"/>
-        </w:rPr>
-        <w:br/>
-      </w:r>
-      <w:r>
-        <w:rPr>
-          <w:sz w:val="24"/>
-        </w:rPr>
-        <w:t>{step === 3 &amp;&amp; (</w:t>
-      </w:r>
-    </w:p>
-    <w:p>
-      <w:pPr>
-        <w:rPr>
-          <w:sz w:val="24"/>
-        </w:rPr>
-      </w:pPr>
-      <w:r>
-        <w:rPr>
-          <w:sz w:val="24"/>
-        </w:rPr>
-        <w:t xml:space="preserve">        &lt;main </w:t>
-      </w:r>
-      <w:proofErr w:type="spellStart"/>
-      <w:r>
-        <w:rPr>
-          <w:sz w:val="24"/>
-        </w:rPr>
-        <w:t>className</w:t>
-      </w:r>
-      <w:proofErr w:type="spellEnd"/>
-      <w:r>
-        <w:rPr>
-          <w:sz w:val="24"/>
-        </w:rPr>
-        <w:t>="flex-grow pt-32 pb-20 flex items-</w:t>
-      </w:r>
-      <w:proofErr w:type="spellStart"/>
-      <w:r>
-        <w:rPr>
-          <w:sz w:val="24"/>
-        </w:rPr>
-        <w:t>center</w:t>
-      </w:r>
-      <w:proofErr w:type="spellEnd"/>
-      <w:r>
-        <w:rPr>
-          <w:sz w:val="24"/>
-        </w:rPr>
-        <w:t xml:space="preserve"> justify-</w:t>
-      </w:r>
-      <w:proofErr w:type="spellStart"/>
-      <w:r>
-        <w:rPr>
-          <w:sz w:val="24"/>
-        </w:rPr>
-        <w:t>center</w:t>
-      </w:r>
-      <w:proofErr w:type="spellEnd"/>
-      <w:r>
-        <w:rPr>
-          <w:sz w:val="24"/>
-        </w:rPr>
-        <w:t xml:space="preserve"> px-4"&gt;</w:t>
-      </w:r>
-    </w:p>
-    <w:p>
-      <w:pPr>
-        <w:rPr>
-          <w:sz w:val="24"/>
-        </w:rPr>
-      </w:pPr>
-      <w:r>
-        <w:rPr>
-          <w:sz w:val="24"/>
-        </w:rPr>
-        <w:t xml:space="preserve">  </w:t>
-      </w:r>
-      <w:r>
-        <w:rPr>
-          <w:sz w:val="24"/>
-        </w:rPr>
-        <w:t>………………………………………..</w:t>
-      </w:r>
-    </w:p>
-    <w:p>
-      <w:pPr>
-        <w:rPr>
-          <w:sz w:val="24"/>
-        </w:rPr>
-      </w:pPr>
-      <w:r>
-        <w:rPr>
-          <w:sz w:val="24"/>
-        </w:rPr>
-        <w:t xml:space="preserve">        &lt;/main&gt;</w:t>
-      </w:r>
-    </w:p>
-    <w:p>
-      <w:pPr>
-        <w:rPr>
-          <w:sz w:val="24"/>
-        </w:rPr>
-      </w:pPr>
-      <w:r>
-        <w:rPr>
-          <w:sz w:val="24"/>
-        </w:rPr>
-        <w:t xml:space="preserve">      )}</w:t>
-      </w:r>
-      <w:r>
-        <w:rPr>
-          <w:sz w:val="24"/>
-        </w:rPr>
-        <w:br/>
-      </w:r>
-    </w:p>
-    <w:p>
-      <w:pPr>
-        <w:rPr>
-          <w:sz w:val="24"/>
-        </w:rPr>
-      </w:pPr>
-      <w:r>
-        <w:rPr>
-          <w:sz w:val="24"/>
-        </w:rPr>
-        <w:br/>
-      </w:r>
-      <w:r>
-        <w:rPr>
-          <w:sz w:val="24"/>
-        </w:rPr>
-        <w:t>Prompt 22 [Email OTP solution</w:t>
-      </w:r>
-      <w:proofErr w:type="gramStart"/>
-      <w:r>
-        <w:rPr>
-          <w:sz w:val="24"/>
-        </w:rPr>
-        <w:t>]</w:t>
-      </w:r>
-      <w:proofErr w:type="gramEnd"/>
-      <w:r>
-        <w:rPr>
-          <w:sz w:val="24"/>
-        </w:rPr>
-        <w:br/>
-      </w:r>
-      <w:r>
-        <w:rPr>
-          <w:sz w:val="24"/>
-        </w:rPr>
-        <w:br/>
-        <w:t xml:space="preserve">Problem: The email OTP is not being sent to user’s email. No code </w:t>
-      </w:r>
-      <w:proofErr w:type="gramStart"/>
-      <w:r>
-        <w:rPr>
-          <w:sz w:val="24"/>
-        </w:rPr>
-        <w:t>Is</w:t>
-      </w:r>
-      <w:proofErr w:type="gramEnd"/>
-      <w:r>
-        <w:rPr>
-          <w:sz w:val="24"/>
-        </w:rPr>
-        <w:t xml:space="preserve"> received in their mail.</w:t>
-      </w:r>
-      <w:r>
-        <w:rPr>
-          <w:sz w:val="24"/>
-        </w:rPr>
-        <w:br/>
-      </w:r>
-      <w:r>
-        <w:rPr>
-          <w:sz w:val="24"/>
-        </w:rPr>
-        <w:br/>
-        <w:t>Changes required: Make the Email OTP work properly and send code to the user’s email.</w:t>
-      </w:r>
-      <w:r>
-        <w:rPr>
-          <w:sz w:val="24"/>
-        </w:rPr>
-        <w:br/>
-      </w:r>
-      <w:r>
-        <w:rPr>
-          <w:sz w:val="24"/>
-        </w:rPr>
-        <w:br/>
-        <w:t>Code reference:</w:t>
-      </w:r>
-    </w:p>
-    <w:p>
-      <w:pPr>
-        <w:rPr>
-          <w:sz w:val="24"/>
-        </w:rPr>
-      </w:pPr>
-      <w:r>
-        <w:rPr>
-          <w:sz w:val="24"/>
-        </w:rPr>
         <w:t>{</w:t>
       </w:r>
       <w:proofErr w:type="gramStart"/>
@@ -8745,7 +9307,7 @@
         </w:rPr>
         <w:br/>
       </w:r>
-      <w:hyperlink r:id="rId9" w:history="1">
+      <w:hyperlink r:id="rId10" w:history="1">
         <w:r>
           <w:rPr>
             <w:rStyle w:val="Hyperlink"/>
@@ -8814,7 +9376,6 @@
           <w:b/>
           <w:sz w:val="28"/>
         </w:rPr>
-        <w:lastRenderedPageBreak/>
         <w:t>School</w:t>
       </w:r>
     </w:p>
@@ -9021,6 +9582,7 @@
         <w:rPr>
           <w:sz w:val="28"/>
         </w:rPr>
+        <w:lastRenderedPageBreak/>
         <w:t>&lt;label class="block font-label-caps text-</w:t>
       </w:r>
       <w:proofErr w:type="spellStart"/>
@@ -9123,7 +9685,7 @@
                     <pic:cNvPicPr/>
                   </pic:nvPicPr>
                   <pic:blipFill>
-                    <a:blip r:embed="rId10"/>
+                    <a:blip r:embed="rId11"/>
                     <a:stretch>
                       <a:fillRect/>
                     </a:stretch>

</xml_diff>

<commit_message>
Modified Assessment setup and educational registration part
</commit_message>
<xml_diff>
--- a/PBL synopsis/Useful prompts.docx
+++ b/PBL synopsis/Useful prompts.docx
@@ -7721,14 +7721,6 @@
         </w:rPr>
       </w:pPr>
       <w:r>
-        <w:rPr>
-          <w:b/>
-          <w:sz w:val="48"/>
-          <w:szCs w:val="48"/>
-        </w:rPr>
-        <w:t>Prompt to be executed:</w:t>
-      </w:r>
-      <w:r>
         <w:br/>
       </w:r>
       <w:r>
@@ -7791,7 +7783,6 @@
           <w:sz w:val="24"/>
         </w:rPr>
       </w:pPr>
-      <w:bookmarkStart w:id="0" w:name="_GoBack"/>
       <w:r>
         <w:rPr>
           <w:sz w:val="24"/>
@@ -7849,18 +7840,17 @@
         <w:t>Please resolve this problem.</w:t>
       </w:r>
     </w:p>
-    <w:bookmarkEnd w:id="0"/>
-    <w:p>
-      <w:pPr>
-        <w:rPr>
-          <w:sz w:val="24"/>
-        </w:rPr>
-      </w:pPr>
-      <w:r>
-        <w:rPr>
-          <w:sz w:val="24"/>
-        </w:rPr>
-        <w:t xml:space="preserve"> Problem 4: On hover, the navigation link doesn’t change colour.</w:t>
+    <w:p>
+      <w:pPr>
+        <w:rPr>
+          <w:sz w:val="24"/>
+        </w:rPr>
+      </w:pPr>
+      <w:r>
+        <w:rPr>
+          <w:sz w:val="24"/>
+        </w:rPr>
+        <w:t>Problem 4: On hover, the navigation link doesn’t change colour.</w:t>
       </w:r>
     </w:p>
     <w:p>
@@ -8065,35 +8055,35 @@
         <w:rPr>
           <w:sz w:val="24"/>
         </w:rPr>
+        <w:t>skillblue</w:t>
+      </w:r>
+      <w:proofErr w:type="spellEnd"/>
+      <w:r>
+        <w:rPr>
+          <w:sz w:val="24"/>
+        </w:rPr>
+        <w:t xml:space="preserve">" </w:t>
+      </w:r>
+      <w:proofErr w:type="spellStart"/>
+      <w:r>
+        <w:rPr>
+          <w:sz w:val="24"/>
+        </w:rPr>
+        <w:t>href</w:t>
+      </w:r>
+      <w:proofErr w:type="spellEnd"/>
+      <w:r>
+        <w:rPr>
+          <w:sz w:val="24"/>
+        </w:rPr>
+        <w:t>="/dashboard" data-discover="true"&gt;Dashboard&lt;/a&gt;&lt;a class="transition-</w:t>
+      </w:r>
+      <w:proofErr w:type="spellStart"/>
+      <w:r>
+        <w:rPr>
+          <w:sz w:val="24"/>
+        </w:rPr>
         <w:lastRenderedPageBreak/>
-        <w:t>skillblue</w:t>
-      </w:r>
-      <w:proofErr w:type="spellEnd"/>
-      <w:r>
-        <w:rPr>
-          <w:sz w:val="24"/>
-        </w:rPr>
-        <w:t xml:space="preserve">" </w:t>
-      </w:r>
-      <w:proofErr w:type="spellStart"/>
-      <w:r>
-        <w:rPr>
-          <w:sz w:val="24"/>
-        </w:rPr>
-        <w:t>href</w:t>
-      </w:r>
-      <w:proofErr w:type="spellEnd"/>
-      <w:r>
-        <w:rPr>
-          <w:sz w:val="24"/>
-        </w:rPr>
-        <w:t>="/dashboard" data-discover="true"&gt;Dashboard&lt;/a&gt;&lt;a class="transition-</w:t>
-      </w:r>
-      <w:proofErr w:type="spellStart"/>
-      <w:r>
-        <w:rPr>
-          <w:sz w:val="24"/>
-        </w:rPr>
         <w:t>colors</w:t>
       </w:r>
       <w:proofErr w:type="spellEnd"/>
@@ -8574,7 +8564,145 @@
         <w:rPr>
           <w:sz w:val="24"/>
         </w:rPr>
+        <w:t xml:space="preserve">        &lt;main </w:t>
+      </w:r>
+      <w:proofErr w:type="spellStart"/>
+      <w:r>
+        <w:rPr>
+          <w:sz w:val="24"/>
+        </w:rPr>
+        <w:t>className</w:t>
+      </w:r>
+      <w:proofErr w:type="spellEnd"/>
+      <w:r>
+        <w:rPr>
+          <w:sz w:val="24"/>
+        </w:rPr>
+        <w:t xml:space="preserve">="flex-grow flex flex-col </w:t>
+      </w:r>
+      <w:proofErr w:type="spellStart"/>
+      <w:r>
+        <w:rPr>
+          <w:sz w:val="24"/>
+        </w:rPr>
+        <w:t>md</w:t>
+      </w:r>
+      <w:proofErr w:type="gramStart"/>
+      <w:r>
+        <w:rPr>
+          <w:sz w:val="24"/>
+        </w:rPr>
+        <w:t>:flex</w:t>
+      </w:r>
+      <w:proofErr w:type="gramEnd"/>
+      <w:r>
+        <w:rPr>
+          <w:sz w:val="24"/>
+        </w:rPr>
+        <w:t>-row</w:t>
+      </w:r>
+      <w:proofErr w:type="spellEnd"/>
+      <w:r>
+        <w:rPr>
+          <w:sz w:val="24"/>
+        </w:rPr>
+        <w:t xml:space="preserve"> max-w-7xl mx-auto w-full pt-8"&gt;</w:t>
+      </w:r>
+    </w:p>
+    <w:p>
+      <w:pPr>
+        <w:rPr>
+          <w:sz w:val="24"/>
+        </w:rPr>
+      </w:pPr>
+      <w:r>
+        <w:rPr>
+          <w:sz w:val="24"/>
+        </w:rPr>
         <w:lastRenderedPageBreak/>
+        <w:t>…………………………….</w:t>
+      </w:r>
+      <w:r>
+        <w:rPr>
+          <w:sz w:val="24"/>
+        </w:rPr>
+        <w:t xml:space="preserve">        </w:t>
+      </w:r>
+      <w:r>
+        <w:rPr>
+          <w:sz w:val="24"/>
+        </w:rPr>
+        <w:br/>
+      </w:r>
+      <w:r>
+        <w:rPr>
+          <w:sz w:val="24"/>
+        </w:rPr>
+        <w:t>&lt;/main&gt;</w:t>
+      </w:r>
+    </w:p>
+    <w:p>
+      <w:pPr>
+        <w:rPr>
+          <w:sz w:val="24"/>
+        </w:rPr>
+      </w:pPr>
+      <w:r>
+        <w:rPr>
+          <w:sz w:val="24"/>
+        </w:rPr>
+        <w:t xml:space="preserve">      )}</w:t>
+      </w:r>
+    </w:p>
+    <w:p>
+      <w:pPr>
+        <w:rPr>
+          <w:sz w:val="24"/>
+        </w:rPr>
+      </w:pPr>
+      <w:r>
+        <w:rPr>
+          <w:sz w:val="24"/>
+        </w:rPr>
+        <w:br/>
+      </w:r>
+      <w:r>
+        <w:rPr>
+          <w:sz w:val="24"/>
+        </w:rPr>
+        <w:br/>
+      </w:r>
+      <w:r>
+        <w:rPr>
+          <w:sz w:val="24"/>
+        </w:rPr>
+        <w:t xml:space="preserve">  {</w:t>
+      </w:r>
+      <w:proofErr w:type="gramStart"/>
+      <w:r>
+        <w:rPr>
+          <w:sz w:val="24"/>
+        </w:rPr>
+        <w:t>step</w:t>
+      </w:r>
+      <w:proofErr w:type="gramEnd"/>
+      <w:r>
+        <w:rPr>
+          <w:sz w:val="24"/>
+        </w:rPr>
+        <w:t xml:space="preserve"> === 1 &amp;&amp; (</w:t>
+      </w:r>
+    </w:p>
+    <w:p>
+      <w:pPr>
+        <w:rPr>
+          <w:sz w:val="24"/>
+        </w:rPr>
+      </w:pPr>
+      <w:r>
+        <w:rPr>
+          <w:sz w:val="24"/>
+        </w:rPr>
         <w:t xml:space="preserve">        &lt;main </w:t>
       </w:r>
       <w:proofErr w:type="spellStart"/>
@@ -8589,66 +8717,283 @@
         <w:rPr>
           <w:sz w:val="24"/>
         </w:rPr>
-        <w:t xml:space="preserve">="flex-grow flex flex-col </w:t>
-      </w:r>
-      <w:proofErr w:type="spellStart"/>
-      <w:r>
-        <w:rPr>
-          <w:sz w:val="24"/>
-        </w:rPr>
-        <w:t>md</w:t>
+        <w:t>="flex-grow mx-auto px-6 py-12 w-full max-w-7xl pt-16"&gt;</w:t>
+      </w:r>
+      <w:r>
+        <w:rPr>
+          <w:sz w:val="24"/>
+        </w:rPr>
+        <w:br/>
+        <w:t>…………………………………………………………………………</w:t>
+      </w:r>
+    </w:p>
+    <w:p>
+      <w:pPr>
+        <w:rPr>
+          <w:sz w:val="24"/>
+        </w:rPr>
+      </w:pPr>
+      <w:r>
+        <w:rPr>
+          <w:sz w:val="24"/>
+        </w:rPr>
+        <w:t xml:space="preserve">        &lt;/main&gt;</w:t>
+      </w:r>
+    </w:p>
+    <w:p>
+      <w:pPr>
+        <w:rPr>
+          <w:sz w:val="24"/>
+        </w:rPr>
+      </w:pPr>
+      <w:r>
+        <w:rPr>
+          <w:sz w:val="24"/>
+        </w:rPr>
+        <w:t xml:space="preserve">      </w:t>
       </w:r>
       <w:proofErr w:type="gramStart"/>
       <w:r>
         <w:rPr>
           <w:sz w:val="24"/>
         </w:rPr>
-        <w:t>:flex</w:t>
+        <w:t>)}</w:t>
       </w:r>
       <w:proofErr w:type="gramEnd"/>
       <w:r>
         <w:rPr>
           <w:sz w:val="24"/>
         </w:rPr>
-        <w:t>-row</w:t>
-      </w:r>
-      <w:proofErr w:type="spellEnd"/>
-      <w:r>
-        <w:rPr>
-          <w:sz w:val="24"/>
-        </w:rPr>
-        <w:t xml:space="preserve"> max-w-7xl mx-auto w-full pt-8"&gt;</w:t>
-      </w:r>
-    </w:p>
-    <w:p>
-      <w:pPr>
-        <w:rPr>
-          <w:sz w:val="24"/>
-        </w:rPr>
-      </w:pPr>
-      <w:r>
-        <w:rPr>
-          <w:sz w:val="24"/>
-        </w:rPr>
-        <w:t>…………………………….</w:t>
-      </w:r>
-      <w:r>
-        <w:rPr>
-          <w:sz w:val="24"/>
-        </w:rPr>
-        <w:t xml:space="preserve">        </w:t>
-      </w:r>
-      <w:r>
-        <w:rPr>
-          <w:sz w:val="24"/>
-        </w:rPr>
-        <w:br/>
-      </w:r>
-      <w:r>
-        <w:rPr>
-          <w:sz w:val="24"/>
-        </w:rPr>
-        <w:t>&lt;/main&gt;</w:t>
+        <w:br/>
+      </w:r>
+      <w:r>
+        <w:rPr>
+          <w:sz w:val="24"/>
+        </w:rPr>
+        <w:br/>
+      </w:r>
+      <w:r>
+        <w:rPr>
+          <w:sz w:val="24"/>
+        </w:rPr>
+        <w:br/>
+      </w:r>
+      <w:r>
+        <w:rPr>
+          <w:sz w:val="24"/>
+        </w:rPr>
+        <w:br/>
+      </w:r>
+      <w:r>
+        <w:rPr>
+          <w:sz w:val="24"/>
+        </w:rPr>
+        <w:br/>
+      </w:r>
+      <w:r>
+        <w:rPr>
+          <w:sz w:val="24"/>
+        </w:rPr>
+        <w:t>{step === 2 &amp;&amp; (</w:t>
+      </w:r>
+    </w:p>
+    <w:p>
+      <w:pPr>
+        <w:rPr>
+          <w:sz w:val="24"/>
+        </w:rPr>
+      </w:pPr>
+      <w:r>
+        <w:rPr>
+          <w:sz w:val="24"/>
+        </w:rPr>
+        <w:t xml:space="preserve">        &lt;main </w:t>
+      </w:r>
+      <w:proofErr w:type="spellStart"/>
+      <w:r>
+        <w:rPr>
+          <w:sz w:val="24"/>
+        </w:rPr>
+        <w:t>className</w:t>
+      </w:r>
+      <w:proofErr w:type="spellEnd"/>
+      <w:r>
+        <w:rPr>
+          <w:sz w:val="24"/>
+        </w:rPr>
+        <w:t>="flex-grow py-12 px-4 md</w:t>
+      </w:r>
+      <w:proofErr w:type="gramStart"/>
+      <w:r>
+        <w:rPr>
+          <w:sz w:val="24"/>
+        </w:rPr>
+        <w:t>:px</w:t>
+      </w:r>
+      <w:proofErr w:type="gramEnd"/>
+      <w:r>
+        <w:rPr>
+          <w:sz w:val="24"/>
+        </w:rPr>
+        <w:t>-10 pt-16"&gt;</w:t>
+      </w:r>
+      <w:r>
+        <w:rPr>
+          <w:sz w:val="24"/>
+        </w:rPr>
+        <w:br/>
+        <w:t xml:space="preserve"> ………………………………………………</w:t>
+      </w:r>
+    </w:p>
+    <w:p>
+      <w:pPr>
+        <w:rPr>
+          <w:sz w:val="24"/>
+        </w:rPr>
+      </w:pPr>
+      <w:r>
+        <w:rPr>
+          <w:sz w:val="24"/>
+        </w:rPr>
+        <w:t xml:space="preserve"> </w:t>
+      </w:r>
+      <w:r>
+        <w:rPr>
+          <w:sz w:val="24"/>
+        </w:rPr>
+        <w:t xml:space="preserve">        &lt;/main&gt;</w:t>
+      </w:r>
+    </w:p>
+    <w:p>
+      <w:pPr>
+        <w:rPr>
+          <w:sz w:val="24"/>
+        </w:rPr>
+      </w:pPr>
+      <w:r>
+        <w:rPr>
+          <w:sz w:val="24"/>
+        </w:rPr>
+        <w:t xml:space="preserve">      </w:t>
+      </w:r>
+      <w:proofErr w:type="gramStart"/>
+      <w:r>
+        <w:rPr>
+          <w:sz w:val="24"/>
+        </w:rPr>
+        <w:t>)}</w:t>
+      </w:r>
+      <w:proofErr w:type="gramEnd"/>
+      <w:r>
+        <w:rPr>
+          <w:sz w:val="24"/>
+        </w:rPr>
+        <w:br/>
+      </w:r>
+      <w:r>
+        <w:rPr>
+          <w:sz w:val="24"/>
+        </w:rPr>
+        <w:br/>
+      </w:r>
+      <w:r>
+        <w:rPr>
+          <w:sz w:val="24"/>
+        </w:rPr>
+        <w:br/>
+      </w:r>
+      <w:r>
+        <w:rPr>
+          <w:sz w:val="24"/>
+        </w:rPr>
+        <w:t>{step === 3 &amp;&amp; (</w:t>
+      </w:r>
+    </w:p>
+    <w:p>
+      <w:pPr>
+        <w:rPr>
+          <w:sz w:val="24"/>
+        </w:rPr>
+      </w:pPr>
+      <w:r>
+        <w:rPr>
+          <w:sz w:val="24"/>
+        </w:rPr>
+        <w:t xml:space="preserve">        &lt;main </w:t>
+      </w:r>
+      <w:proofErr w:type="spellStart"/>
+      <w:r>
+        <w:rPr>
+          <w:sz w:val="24"/>
+        </w:rPr>
+        <w:t>className</w:t>
+      </w:r>
+      <w:proofErr w:type="spellEnd"/>
+      <w:r>
+        <w:rPr>
+          <w:sz w:val="24"/>
+        </w:rPr>
+        <w:t>="flex-grow pt-32 pb-20 flex items-</w:t>
+      </w:r>
+      <w:proofErr w:type="spellStart"/>
+      <w:r>
+        <w:rPr>
+          <w:sz w:val="24"/>
+        </w:rPr>
+        <w:t>center</w:t>
+      </w:r>
+      <w:proofErr w:type="spellEnd"/>
+      <w:r>
+        <w:rPr>
+          <w:sz w:val="24"/>
+        </w:rPr>
+        <w:t xml:space="preserve"> justify-</w:t>
+      </w:r>
+      <w:proofErr w:type="spellStart"/>
+      <w:r>
+        <w:rPr>
+          <w:sz w:val="24"/>
+        </w:rPr>
+        <w:t>center</w:t>
+      </w:r>
+      <w:proofErr w:type="spellEnd"/>
+      <w:r>
+        <w:rPr>
+          <w:sz w:val="24"/>
+        </w:rPr>
+        <w:t xml:space="preserve"> px-4"&gt;</w:t>
+      </w:r>
+    </w:p>
+    <w:p>
+      <w:pPr>
+        <w:rPr>
+          <w:sz w:val="24"/>
+        </w:rPr>
+      </w:pPr>
+      <w:r>
+        <w:rPr>
+          <w:sz w:val="24"/>
+        </w:rPr>
+        <w:t xml:space="preserve">  </w:t>
+      </w:r>
+      <w:r>
+        <w:rPr>
+          <w:sz w:val="24"/>
+        </w:rPr>
+        <w:t>………………………………………..</w:t>
+      </w:r>
+    </w:p>
+    <w:p>
+      <w:pPr>
+        <w:rPr>
+          <w:sz w:val="24"/>
+        </w:rPr>
+      </w:pPr>
+      <w:r>
+        <w:rPr>
+          <w:sz w:val="24"/>
+        </w:rPr>
+        <w:t xml:space="preserve">        &lt;/main&gt;</w:t>
       </w:r>
     </w:p>
     <w:p>
@@ -8663,287 +9008,403 @@
         </w:rPr>
         <w:t xml:space="preserve">      )}</w:t>
       </w:r>
-    </w:p>
-    <w:p>
-      <w:pPr>
-        <w:rPr>
-          <w:sz w:val="24"/>
-        </w:rPr>
-      </w:pPr>
-      <w:r>
-        <w:rPr>
-          <w:sz w:val="24"/>
-        </w:rPr>
-        <w:br/>
-      </w:r>
-      <w:r>
-        <w:rPr>
-          <w:sz w:val="24"/>
-        </w:rPr>
-        <w:br/>
-      </w:r>
-      <w:r>
-        <w:rPr>
-          <w:sz w:val="24"/>
-        </w:rPr>
-        <w:t xml:space="preserve">  {</w:t>
-      </w:r>
-      <w:proofErr w:type="gramStart"/>
-      <w:r>
-        <w:rPr>
-          <w:sz w:val="24"/>
-        </w:rPr>
-        <w:t>step</w:t>
-      </w:r>
-      <w:proofErr w:type="gramEnd"/>
-      <w:r>
-        <w:rPr>
-          <w:sz w:val="24"/>
-        </w:rPr>
-        <w:t xml:space="preserve"> === 1 &amp;&amp; (</w:t>
-      </w:r>
-    </w:p>
-    <w:p>
-      <w:pPr>
-        <w:rPr>
-          <w:sz w:val="24"/>
-        </w:rPr>
-      </w:pPr>
-      <w:r>
-        <w:rPr>
-          <w:sz w:val="24"/>
-        </w:rPr>
-        <w:t xml:space="preserve">        &lt;main </w:t>
-      </w:r>
-      <w:proofErr w:type="spellStart"/>
-      <w:r>
-        <w:rPr>
-          <w:sz w:val="24"/>
-        </w:rPr>
-        <w:t>className</w:t>
-      </w:r>
-      <w:proofErr w:type="spellEnd"/>
-      <w:r>
-        <w:rPr>
-          <w:sz w:val="24"/>
-        </w:rPr>
-        <w:t>="flex-grow mx-auto px-6 py-12 w-full max-w-7xl pt-16"&gt;</w:t>
-      </w:r>
-      <w:r>
-        <w:rPr>
-          <w:sz w:val="24"/>
-        </w:rPr>
-        <w:br/>
-        <w:t>…………………………………………………………………………</w:t>
-      </w:r>
-    </w:p>
-    <w:p>
-      <w:pPr>
-        <w:rPr>
-          <w:sz w:val="24"/>
-        </w:rPr>
-      </w:pPr>
-      <w:r>
-        <w:rPr>
-          <w:sz w:val="24"/>
-        </w:rPr>
-        <w:t xml:space="preserve">        &lt;/main&gt;</w:t>
-      </w:r>
-    </w:p>
-    <w:p>
-      <w:pPr>
-        <w:rPr>
-          <w:sz w:val="24"/>
-        </w:rPr>
-      </w:pPr>
-      <w:r>
-        <w:rPr>
-          <w:sz w:val="24"/>
-        </w:rPr>
-        <w:t xml:space="preserve">      </w:t>
-      </w:r>
-      <w:proofErr w:type="gramStart"/>
-      <w:r>
-        <w:rPr>
-          <w:sz w:val="24"/>
-        </w:rPr>
-        <w:t>)}</w:t>
-      </w:r>
-      <w:proofErr w:type="gramEnd"/>
-      <w:r>
-        <w:rPr>
-          <w:sz w:val="24"/>
-        </w:rPr>
-        <w:br/>
-      </w:r>
-      <w:r>
-        <w:rPr>
-          <w:sz w:val="24"/>
-        </w:rPr>
-        <w:br/>
-      </w:r>
-      <w:r>
-        <w:rPr>
-          <w:sz w:val="24"/>
-        </w:rPr>
-        <w:br/>
-      </w:r>
-      <w:r>
-        <w:rPr>
-          <w:sz w:val="24"/>
-        </w:rPr>
-        <w:br/>
-      </w:r>
-      <w:r>
-        <w:rPr>
-          <w:sz w:val="24"/>
-        </w:rPr>
-        <w:br/>
-      </w:r>
-      <w:r>
-        <w:rPr>
-          <w:sz w:val="24"/>
-        </w:rPr>
-        <w:t>{step === 2 &amp;&amp; (</w:t>
-      </w:r>
-    </w:p>
-    <w:p>
-      <w:pPr>
-        <w:rPr>
-          <w:sz w:val="24"/>
-        </w:rPr>
-      </w:pPr>
-      <w:r>
-        <w:rPr>
-          <w:sz w:val="24"/>
-        </w:rPr>
-        <w:t xml:space="preserve">        &lt;main </w:t>
-      </w:r>
-      <w:proofErr w:type="spellStart"/>
-      <w:r>
-        <w:rPr>
-          <w:sz w:val="24"/>
-        </w:rPr>
-        <w:t>className</w:t>
-      </w:r>
-      <w:proofErr w:type="spellEnd"/>
-      <w:r>
-        <w:rPr>
-          <w:sz w:val="24"/>
-        </w:rPr>
-        <w:t>="flex-grow py-12 px-4 md</w:t>
-      </w:r>
-      <w:proofErr w:type="gramStart"/>
-      <w:r>
-        <w:rPr>
-          <w:sz w:val="24"/>
-        </w:rPr>
-        <w:t>:px</w:t>
-      </w:r>
-      <w:proofErr w:type="gramEnd"/>
-      <w:r>
-        <w:rPr>
-          <w:sz w:val="24"/>
-        </w:rPr>
-        <w:t>-10 pt-16"&gt;</w:t>
-      </w:r>
-      <w:r>
-        <w:rPr>
-          <w:sz w:val="24"/>
-        </w:rPr>
-        <w:br/>
-        <w:t xml:space="preserve"> ………………………………………………</w:t>
-      </w:r>
-    </w:p>
-    <w:p>
-      <w:pPr>
-        <w:rPr>
-          <w:sz w:val="24"/>
-        </w:rPr>
-      </w:pPr>
+      <w:r>
+        <w:rPr>
+          <w:sz w:val="24"/>
+        </w:rPr>
+        <w:br/>
+      </w:r>
+    </w:p>
+    <w:p>
+      <w:pPr>
+        <w:rPr>
+          <w:sz w:val="24"/>
+        </w:rPr>
+      </w:pPr>
+      <w:r>
+        <w:rPr>
+          <w:sz w:val="24"/>
+        </w:rPr>
+        <w:br/>
+      </w:r>
+      <w:r>
+        <w:rPr>
+          <w:b/>
+          <w:sz w:val="48"/>
+          <w:szCs w:val="48"/>
+        </w:rPr>
+        <w:t>Prompt to be executed:</w:t>
+      </w:r>
+    </w:p>
+    <w:p>
+      <w:pPr>
+        <w:rPr>
+          <w:sz w:val="24"/>
+        </w:rPr>
+      </w:pPr>
+      <w:bookmarkStart w:id="0" w:name="_GoBack"/>
+      <w:r>
+        <w:rPr>
+          <w:sz w:val="24"/>
+        </w:rPr>
+        <w:t xml:space="preserve">Filename: </w:t>
+      </w:r>
+      <w:proofErr w:type="spellStart"/>
+      <w:r>
+        <w:rPr>
+          <w:sz w:val="24"/>
+        </w:rPr>
+        <w:t>AssessmentReviewPage.jsx</w:t>
+      </w:r>
+      <w:proofErr w:type="spellEnd"/>
+      <w:r>
+        <w:rPr>
+          <w:sz w:val="24"/>
+        </w:rPr>
+        <w:br/>
+      </w:r>
+      <w:r>
+        <w:rPr>
+          <w:sz w:val="24"/>
+        </w:rPr>
+        <w:br/>
+        <w:t xml:space="preserve">Problem 1: In the </w:t>
+      </w:r>
+      <w:proofErr w:type="spellStart"/>
+      <w:r>
+        <w:rPr>
+          <w:sz w:val="24"/>
+        </w:rPr>
+        <w:t>AssessmentReviewPage.jsx</w:t>
+      </w:r>
+      <w:proofErr w:type="spellEnd"/>
+      <w:r>
+        <w:rPr>
+          <w:sz w:val="24"/>
+        </w:rPr>
+        <w:t>, there is too much white space in the outer div element.</w:t>
+      </w:r>
+      <w:r>
+        <w:rPr>
+          <w:sz w:val="24"/>
+        </w:rPr>
+        <w:br/>
+      </w:r>
+      <w:r>
+        <w:rPr>
+          <w:sz w:val="24"/>
+        </w:rPr>
+        <w:br/>
+        <w:t>Changes required: Remove the pad</w:t>
+      </w:r>
+      <w:r>
+        <w:rPr>
+          <w:sz w:val="24"/>
+        </w:rPr>
+        <w:t>ding-top from the below element:</w:t>
+      </w:r>
+    </w:p>
+    <w:p>
+      <w:pPr>
+        <w:rPr>
+          <w:sz w:val="24"/>
+        </w:rPr>
+      </w:pPr>
+      <w:r>
+        <w:rPr>
+          <w:sz w:val="24"/>
+        </w:rPr>
+        <w:lastRenderedPageBreak/>
+        <w:br/>
+        <w:t>Element:</w:t>
+      </w:r>
+      <w:r>
+        <w:rPr>
+          <w:sz w:val="24"/>
+        </w:rPr>
+        <w:br/>
+      </w:r>
+      <w:r>
+        <w:rPr>
+          <w:sz w:val="24"/>
+        </w:rPr>
+        <w:t>&lt;div class="</w:t>
+      </w:r>
+      <w:proofErr w:type="spellStart"/>
+      <w:r>
+        <w:rPr>
+          <w:sz w:val="24"/>
+        </w:rPr>
+        <w:t>bg</w:t>
+      </w:r>
+      <w:proofErr w:type="spellEnd"/>
+      <w:r>
+        <w:rPr>
+          <w:sz w:val="24"/>
+        </w:rPr>
+        <w:t xml:space="preserve">-[#f9f9f8] text-[#1a1c1c] font-sans </w:t>
+      </w:r>
+      <w:proofErr w:type="spellStart"/>
+      <w:r>
+        <w:rPr>
+          <w:sz w:val="24"/>
+        </w:rPr>
+        <w:t>antialiased</w:t>
+      </w:r>
+      <w:proofErr w:type="spellEnd"/>
+      <w:r>
+        <w:rPr>
+          <w:sz w:val="24"/>
+        </w:rPr>
+        <w:t xml:space="preserve"> min-h-screen flex flex-col pt-16"&gt;&lt;main class="flex-grow w-full max-w-[1280px] mx-auto px-4 md:px-10 py-12 md:py-20 flex f</w:t>
+      </w:r>
+      <w:r>
+        <w:rPr>
+          <w:sz w:val="24"/>
+        </w:rPr>
+        <w:t>lex-col gap-12 overflow-hidden"&gt;………………………………………..</w:t>
+      </w:r>
+      <w:r>
+        <w:rPr>
+          <w:sz w:val="24"/>
+        </w:rPr>
+        <w:t>&lt;/main&gt;&lt;/div&gt;</w:t>
+      </w:r>
+    </w:p>
+    <w:p>
+      <w:pPr>
+        <w:rPr>
+          <w:sz w:val="24"/>
+        </w:rPr>
+      </w:pPr>
+    </w:p>
+    <w:p>
+      <w:pPr>
+        <w:rPr>
+          <w:sz w:val="24"/>
+        </w:rPr>
+      </w:pPr>
+      <w:r>
+        <w:rPr>
+          <w:sz w:val="24"/>
+        </w:rPr>
+        <w:t>Problem</w:t>
+      </w:r>
+      <w:r>
+        <w:rPr>
+          <w:sz w:val="24"/>
+        </w:rPr>
+        <w:t xml:space="preserve"> 2</w:t>
+      </w:r>
+      <w:r>
+        <w:rPr>
+          <w:sz w:val="24"/>
+        </w:rPr>
+        <w:t>: The extracted core skills part of the</w:t>
+      </w:r>
+      <w:r>
+        <w:rPr>
+          <w:sz w:val="24"/>
+        </w:rPr>
+        <w:t xml:space="preserve"> page is not working properly.</w:t>
+      </w:r>
+      <w:r>
+        <w:rPr>
+          <w:sz w:val="24"/>
+        </w:rPr>
+        <w:br/>
+      </w:r>
+      <w:r>
+        <w:rPr>
+          <w:sz w:val="24"/>
+        </w:rPr>
+        <w:br/>
+        <w:t>Implementation: I want this part of the “</w:t>
+      </w:r>
+      <w:proofErr w:type="spellStart"/>
+      <w:r>
+        <w:rPr>
+          <w:sz w:val="24"/>
+        </w:rPr>
+        <w:t>AssessmentSetupPage.jsx</w:t>
+      </w:r>
+      <w:proofErr w:type="spellEnd"/>
+      <w:r>
+        <w:rPr>
+          <w:sz w:val="24"/>
+        </w:rPr>
+        <w:t xml:space="preserve">” page to display all the core skills identified through the job description from </w:t>
+      </w:r>
+      <w:proofErr w:type="spellStart"/>
+      <w:r>
+        <w:rPr>
+          <w:sz w:val="24"/>
+        </w:rPr>
+        <w:t>AssessmentSetupPage.jsx</w:t>
+      </w:r>
+      <w:proofErr w:type="spellEnd"/>
+      <w:r>
+        <w:rPr>
+          <w:sz w:val="24"/>
+        </w:rPr>
+        <w:t>.</w:t>
+      </w:r>
+      <w:r>
+        <w:rPr>
+          <w:sz w:val="24"/>
+        </w:rPr>
+        <w:br/>
+        <w:t xml:space="preserve"> I want the page to parse the job description content and identify the core skills (for example: React </w:t>
+      </w:r>
+      <w:proofErr w:type="spellStart"/>
+      <w:r>
+        <w:rPr>
+          <w:sz w:val="24"/>
+        </w:rPr>
+        <w:t>Js</w:t>
+      </w:r>
+      <w:proofErr w:type="spellEnd"/>
+      <w:r>
+        <w:rPr>
+          <w:sz w:val="24"/>
+        </w:rPr>
+        <w:t xml:space="preserve">, Next </w:t>
+      </w:r>
+      <w:proofErr w:type="spellStart"/>
+      <w:r>
+        <w:rPr>
+          <w:sz w:val="24"/>
+        </w:rPr>
+        <w:t>Js</w:t>
+      </w:r>
+      <w:proofErr w:type="spellEnd"/>
+      <w:r>
+        <w:rPr>
+          <w:sz w:val="24"/>
+        </w:rPr>
+        <w:t xml:space="preserve">, Node </w:t>
+      </w:r>
+      <w:proofErr w:type="spellStart"/>
+      <w:r>
+        <w:rPr>
+          <w:sz w:val="24"/>
+        </w:rPr>
+        <w:t>Js</w:t>
+      </w:r>
+      <w:proofErr w:type="spellEnd"/>
+      <w:r>
+        <w:rPr>
+          <w:sz w:val="24"/>
+        </w:rPr>
+        <w:t xml:space="preserve">, Django, MongoDB, etc. which is provided in the job description that is either system generated or user-entered </w:t>
+      </w:r>
+      <w:proofErr w:type="spellStart"/>
+      <w:r>
+        <w:rPr>
+          <w:sz w:val="24"/>
+        </w:rPr>
+        <w:t>AssessmentSetupPage.jsx</w:t>
+      </w:r>
+      <w:proofErr w:type="spellEnd"/>
+      <w:r>
+        <w:rPr>
+          <w:sz w:val="24"/>
+        </w:rPr>
+        <w:t>)</w:t>
+      </w:r>
+    </w:p>
+    <w:p>
+      <w:pPr>
+        <w:rPr>
+          <w:sz w:val="24"/>
+        </w:rPr>
+      </w:pPr>
+      <w:r>
+        <w:rPr>
+          <w:sz w:val="24"/>
+        </w:rPr>
+        <w:t>Element</w:t>
+      </w:r>
+      <w:r>
+        <w:rPr>
+          <w:sz w:val="24"/>
+        </w:rPr>
+        <w:t xml:space="preserve"> reference</w:t>
+      </w:r>
+      <w:r>
+        <w:rPr>
+          <w:sz w:val="24"/>
+        </w:rPr>
+        <w:t>:</w:t>
+      </w:r>
+    </w:p>
+    <w:p>
+      <w:pPr>
+        <w:rPr>
+          <w:sz w:val="24"/>
+        </w:rPr>
+      </w:pPr>
+      <w:r>
+        <w:rPr>
+          <w:sz w:val="24"/>
+        </w:rPr>
+        <w:t>&lt;div class="</w:t>
+      </w:r>
+      <w:proofErr w:type="spellStart"/>
+      <w:r>
+        <w:rPr>
+          <w:sz w:val="24"/>
+        </w:rPr>
+        <w:t>bg</w:t>
+      </w:r>
+      <w:proofErr w:type="spellEnd"/>
+      <w:r>
+        <w:rPr>
+          <w:sz w:val="24"/>
+        </w:rPr>
+        <w:t>-white border border-[#c3c5d9] p-8 flex flex-col rounded-</w:t>
+      </w:r>
+      <w:proofErr w:type="spellStart"/>
+      <w:r>
+        <w:rPr>
+          <w:sz w:val="24"/>
+        </w:rPr>
+        <w:t>sm</w:t>
+      </w:r>
+      <w:proofErr w:type="spellEnd"/>
+      <w:r>
+        <w:rPr>
+          <w:sz w:val="24"/>
+        </w:rPr>
+        <w:t xml:space="preserve"> shadow-</w:t>
+      </w:r>
+      <w:proofErr w:type="spellStart"/>
+      <w:r>
+        <w:rPr>
+          <w:sz w:val="24"/>
+        </w:rPr>
+        <w:t>sm</w:t>
+      </w:r>
+      <w:proofErr w:type="spellEnd"/>
       <w:r>
         <w:rPr>
           <w:sz w:val="24"/>
         </w:rPr>
         <w:t xml:space="preserve"> </w:t>
       </w:r>
-      <w:r>
-        <w:rPr>
-          <w:sz w:val="24"/>
-        </w:rPr>
-        <w:t xml:space="preserve">        &lt;/main&gt;</w:t>
-      </w:r>
-    </w:p>
-    <w:p>
-      <w:pPr>
-        <w:rPr>
-          <w:sz w:val="24"/>
-        </w:rPr>
-      </w:pPr>
-      <w:r>
-        <w:rPr>
-          <w:sz w:val="24"/>
-        </w:rPr>
-        <w:t xml:space="preserve">      </w:t>
-      </w:r>
-      <w:proofErr w:type="gramStart"/>
-      <w:r>
-        <w:rPr>
-          <w:sz w:val="24"/>
-        </w:rPr>
-        <w:t>)}</w:t>
-      </w:r>
-      <w:proofErr w:type="gramEnd"/>
-      <w:r>
-        <w:rPr>
-          <w:sz w:val="24"/>
-        </w:rPr>
-        <w:br/>
-      </w:r>
-      <w:r>
-        <w:rPr>
-          <w:sz w:val="24"/>
-        </w:rPr>
-        <w:br/>
-      </w:r>
-      <w:r>
-        <w:rPr>
-          <w:sz w:val="24"/>
-        </w:rPr>
-        <w:br/>
-      </w:r>
-      <w:r>
-        <w:rPr>
-          <w:sz w:val="24"/>
-        </w:rPr>
-        <w:t>{step === 3 &amp;&amp; (</w:t>
-      </w:r>
-    </w:p>
-    <w:p>
-      <w:pPr>
-        <w:rPr>
-          <w:sz w:val="24"/>
-        </w:rPr>
-      </w:pPr>
-      <w:r>
-        <w:rPr>
-          <w:sz w:val="24"/>
-        </w:rPr>
-        <w:t xml:space="preserve">        &lt;main </w:t>
-      </w:r>
-      <w:proofErr w:type="spellStart"/>
-      <w:r>
-        <w:rPr>
-          <w:sz w:val="24"/>
-        </w:rPr>
-        <w:t>className</w:t>
-      </w:r>
-      <w:proofErr w:type="spellEnd"/>
-      <w:r>
-        <w:rPr>
-          <w:sz w:val="24"/>
-        </w:rPr>
-        <w:t>="flex-grow pt-32 pb-20 flex items-</w:t>
+      <w:proofErr w:type="spellStart"/>
+      <w:r>
+        <w:rPr>
+          <w:sz w:val="24"/>
+        </w:rPr>
+        <w:t>hover:shadow-md</w:t>
+      </w:r>
+      <w:proofErr w:type="spellEnd"/>
+      <w:r>
+        <w:rPr>
+          <w:sz w:val="24"/>
+        </w:rPr>
+        <w:t xml:space="preserve"> transition-shadow"&gt;&lt;div class="flex items-</w:t>
       </w:r>
       <w:proofErr w:type="spellStart"/>
       <w:r>
@@ -8957,268 +9418,130 @@
         <w:rPr>
           <w:sz w:val="24"/>
         </w:rPr>
-        <w:t xml:space="preserve"> justify-</w:t>
-      </w:r>
-      <w:proofErr w:type="spellStart"/>
-      <w:r>
-        <w:rPr>
-          <w:sz w:val="24"/>
-        </w:rPr>
-        <w:t>center</w:t>
-      </w:r>
-      <w:proofErr w:type="spellEnd"/>
-      <w:r>
-        <w:rPr>
-          <w:sz w:val="24"/>
-        </w:rPr>
-        <w:t xml:space="preserve"> px-4"&gt;</w:t>
-      </w:r>
-    </w:p>
-    <w:p>
-      <w:pPr>
-        <w:rPr>
-          <w:sz w:val="24"/>
-        </w:rPr>
-      </w:pPr>
-      <w:r>
-        <w:rPr>
-          <w:sz w:val="24"/>
-        </w:rPr>
-        <w:t xml:space="preserve">  </w:t>
-      </w:r>
-      <w:r>
-        <w:rPr>
-          <w:sz w:val="24"/>
-        </w:rPr>
-        <w:t>………………………………………..</w:t>
-      </w:r>
-    </w:p>
-    <w:p>
-      <w:pPr>
-        <w:rPr>
-          <w:sz w:val="24"/>
-        </w:rPr>
-      </w:pPr>
-      <w:r>
-        <w:rPr>
-          <w:sz w:val="24"/>
-        </w:rPr>
-        <w:t xml:space="preserve">        &lt;/main&gt;</w:t>
-      </w:r>
-    </w:p>
-    <w:p>
-      <w:pPr>
-        <w:rPr>
-          <w:sz w:val="24"/>
-        </w:rPr>
-      </w:pPr>
-      <w:r>
-        <w:rPr>
-          <w:sz w:val="24"/>
-        </w:rPr>
-        <w:t xml:space="preserve">      )}</w:t>
-      </w:r>
-      <w:r>
-        <w:rPr>
-          <w:sz w:val="24"/>
-        </w:rPr>
-        <w:br/>
-      </w:r>
-    </w:p>
-    <w:p>
-      <w:pPr>
-        <w:rPr>
-          <w:sz w:val="24"/>
-        </w:rPr>
-      </w:pPr>
-      <w:r>
-        <w:rPr>
-          <w:sz w:val="24"/>
-        </w:rPr>
-        <w:br/>
-      </w:r>
-      <w:r>
-        <w:rPr>
-          <w:sz w:val="24"/>
-        </w:rPr>
-        <w:t>Prompt 22 [Email OTP solution</w:t>
-      </w:r>
-      <w:proofErr w:type="gramStart"/>
-      <w:r>
-        <w:rPr>
-          <w:sz w:val="24"/>
-        </w:rPr>
-        <w:t>]</w:t>
-      </w:r>
-      <w:proofErr w:type="gramEnd"/>
-      <w:r>
-        <w:rPr>
-          <w:sz w:val="24"/>
-        </w:rPr>
-        <w:br/>
-      </w:r>
-      <w:r>
-        <w:rPr>
-          <w:sz w:val="24"/>
-        </w:rPr>
-        <w:br/>
-        <w:t xml:space="preserve">Problem: The email OTP is not being sent to user’s email. No code </w:t>
-      </w:r>
-      <w:proofErr w:type="gramStart"/>
-      <w:r>
-        <w:rPr>
-          <w:sz w:val="24"/>
-        </w:rPr>
-        <w:t>Is</w:t>
-      </w:r>
-      <w:proofErr w:type="gramEnd"/>
-      <w:r>
-        <w:rPr>
-          <w:sz w:val="24"/>
-        </w:rPr>
-        <w:t xml:space="preserve"> received in their mail.</w:t>
-      </w:r>
-      <w:r>
-        <w:rPr>
-          <w:sz w:val="24"/>
-        </w:rPr>
-        <w:br/>
-      </w:r>
-      <w:r>
-        <w:rPr>
-          <w:sz w:val="24"/>
-        </w:rPr>
-        <w:br/>
-        <w:t>Changes required: Make the Email OTP work properly and send code to the user’s email.</w:t>
-      </w:r>
-      <w:r>
-        <w:rPr>
-          <w:sz w:val="24"/>
-        </w:rPr>
-        <w:br/>
-      </w:r>
-      <w:r>
-        <w:rPr>
-          <w:sz w:val="24"/>
-        </w:rPr>
-        <w:br/>
-        <w:t>Code reference:</w:t>
-      </w:r>
-    </w:p>
-    <w:p>
-      <w:pPr>
-        <w:rPr>
-          <w:sz w:val="24"/>
-        </w:rPr>
-      </w:pPr>
-      <w:r>
-        <w:rPr>
-          <w:sz w:val="24"/>
-        </w:rPr>
-        <w:lastRenderedPageBreak/>
-        <w:t>{</w:t>
-      </w:r>
-      <w:proofErr w:type="gramStart"/>
-      <w:r>
-        <w:rPr>
-          <w:sz w:val="24"/>
-        </w:rPr>
-        <w:t>step</w:t>
-      </w:r>
-      <w:proofErr w:type="gramEnd"/>
-      <w:r>
-        <w:rPr>
-          <w:sz w:val="24"/>
-        </w:rPr>
-        <w:t xml:space="preserve"> === 3 &amp;&amp; (</w:t>
-      </w:r>
-    </w:p>
-    <w:p>
-      <w:pPr>
-        <w:rPr>
-          <w:sz w:val="24"/>
-        </w:rPr>
-      </w:pPr>
-      <w:r>
-        <w:rPr>
-          <w:sz w:val="24"/>
-        </w:rPr>
-        <w:t xml:space="preserve">        &lt;main </w:t>
-      </w:r>
-      <w:proofErr w:type="spellStart"/>
-      <w:r>
-        <w:rPr>
-          <w:sz w:val="24"/>
-        </w:rPr>
-        <w:t>className</w:t>
-      </w:r>
-      <w:proofErr w:type="spellEnd"/>
-      <w:r>
-        <w:rPr>
-          <w:sz w:val="24"/>
-        </w:rPr>
-        <w:t>="flex-grow pt-32 pb-20 flex items-</w:t>
-      </w:r>
-      <w:proofErr w:type="spellStart"/>
-      <w:r>
-        <w:rPr>
-          <w:sz w:val="24"/>
-        </w:rPr>
-        <w:t>center</w:t>
-      </w:r>
-      <w:proofErr w:type="spellEnd"/>
-      <w:r>
-        <w:rPr>
-          <w:sz w:val="24"/>
-        </w:rPr>
-        <w:t xml:space="preserve"> justify-</w:t>
-      </w:r>
-      <w:proofErr w:type="spellStart"/>
-      <w:r>
-        <w:rPr>
-          <w:sz w:val="24"/>
-        </w:rPr>
-        <w:t>center</w:t>
-      </w:r>
-      <w:proofErr w:type="spellEnd"/>
-      <w:r>
-        <w:rPr>
-          <w:sz w:val="24"/>
-        </w:rPr>
-        <w:t xml:space="preserve"> px-4"&gt;</w:t>
-      </w:r>
-    </w:p>
-    <w:p>
-      <w:pPr>
-        <w:rPr>
-          <w:sz w:val="24"/>
-        </w:rPr>
-      </w:pPr>
-      <w:r>
-        <w:rPr>
-          <w:sz w:val="24"/>
-        </w:rPr>
-        <w:t xml:space="preserve">  </w:t>
-      </w:r>
-      <w:r>
-        <w:rPr>
-          <w:sz w:val="24"/>
-        </w:rPr>
-        <w:t>………………………………………..</w:t>
-      </w:r>
-    </w:p>
-    <w:p>
-      <w:pPr>
-        <w:rPr>
-          <w:sz w:val="24"/>
-        </w:rPr>
-      </w:pPr>
-      <w:r>
-        <w:rPr>
-          <w:sz w:val="24"/>
-        </w:rPr>
-        <w:t xml:space="preserve">        &lt;/main&gt;</w:t>
-      </w:r>
+        <w:t xml:space="preserve"> justify-between border-b border-[#c3c5d9] pb-4 mb-6"&gt;</w:t>
+      </w:r>
+      <w:r>
+        <w:rPr>
+          <w:sz w:val="24"/>
+        </w:rPr>
+        <w:t>…………………………………………………………………</w:t>
+      </w:r>
+      <w:r>
+        <w:rPr>
+          <w:sz w:val="24"/>
+        </w:rPr>
+        <w:t>&lt;/div&gt;&lt;/div&gt;</w:t>
+      </w:r>
+    </w:p>
+    <w:p>
+      <w:pPr>
+        <w:rPr>
+          <w:sz w:val="24"/>
+        </w:rPr>
+      </w:pPr>
+      <w:r>
+        <w:rPr>
+          <w:sz w:val="24"/>
+        </w:rPr>
+        <w:br/>
+      </w:r>
+    </w:p>
+    <w:p>
+      <w:pPr>
+        <w:rPr>
+          <w:sz w:val="24"/>
+        </w:rPr>
+      </w:pPr>
+      <w:r>
+        <w:rPr>
+          <w:sz w:val="24"/>
+        </w:rPr>
+        <w:t>Problem 3: There is no back button in “</w:t>
+      </w:r>
+      <w:proofErr w:type="spellStart"/>
+      <w:r>
+        <w:rPr>
+          <w:sz w:val="24"/>
+        </w:rPr>
+        <w:t>AssessmentSetupPage.jsx</w:t>
+      </w:r>
+      <w:proofErr w:type="spellEnd"/>
+      <w:r>
+        <w:rPr>
+          <w:sz w:val="24"/>
+        </w:rPr>
+        <w:t xml:space="preserve">” page to navigate back to </w:t>
+      </w:r>
+      <w:proofErr w:type="spellStart"/>
+      <w:r>
+        <w:rPr>
+          <w:sz w:val="24"/>
+        </w:rPr>
+        <w:t>AssessmentSetupPage.jsx</w:t>
+      </w:r>
+      <w:proofErr w:type="spellEnd"/>
+      <w:r>
+        <w:rPr>
+          <w:sz w:val="24"/>
+        </w:rPr>
+        <w:br/>
+      </w:r>
+      <w:r>
+        <w:rPr>
+          <w:sz w:val="24"/>
+        </w:rPr>
+        <w:br/>
+        <w:t xml:space="preserve">Implementation: </w:t>
+      </w:r>
+      <w:r>
+        <w:rPr>
+          <w:sz w:val="24"/>
+        </w:rPr>
+        <w:t xml:space="preserve">I want you to add a back button to navigate back to </w:t>
+      </w:r>
+      <w:proofErr w:type="spellStart"/>
+      <w:r>
+        <w:rPr>
+          <w:sz w:val="24"/>
+        </w:rPr>
+        <w:t>AssessmentSetupPage.jsx</w:t>
+      </w:r>
+      <w:proofErr w:type="spellEnd"/>
+      <w:r>
+        <w:rPr>
+          <w:sz w:val="24"/>
+        </w:rPr>
+        <w:t xml:space="preserve">. Place the button at </w:t>
+      </w:r>
+      <w:proofErr w:type="spellStart"/>
+      <w:r>
+        <w:rPr>
+          <w:sz w:val="24"/>
+        </w:rPr>
+        <w:t>appropriateposition</w:t>
+      </w:r>
+      <w:proofErr w:type="spellEnd"/>
+      <w:r>
+        <w:rPr>
+          <w:sz w:val="24"/>
+        </w:rPr>
+        <w:t xml:space="preserve"> that doesn’t put any bad impact to the user experience.</w:t>
+      </w:r>
+    </w:p>
+    <w:bookmarkEnd w:id="0"/>
+    <w:p>
+      <w:pPr>
+        <w:rPr>
+          <w:sz w:val="24"/>
+        </w:rPr>
+      </w:pPr>
+    </w:p>
+    <w:p>
+      <w:pPr>
+        <w:rPr>
+          <w:sz w:val="24"/>
+        </w:rPr>
+      </w:pPr>
     </w:p>
     <w:p>
       <w:pPr>
@@ -9227,32 +9550,6 @@
           <w:sz w:val="32"/>
         </w:rPr>
       </w:pPr>
-      <w:r>
-        <w:rPr>
-          <w:sz w:val="24"/>
-        </w:rPr>
-        <w:t xml:space="preserve">      </w:t>
-      </w:r>
-      <w:proofErr w:type="gramStart"/>
-      <w:r>
-        <w:rPr>
-          <w:sz w:val="24"/>
-        </w:rPr>
-        <w:t>)}</w:t>
-      </w:r>
-      <w:proofErr w:type="gramEnd"/>
-      <w:r>
-        <w:rPr>
-          <w:sz w:val="24"/>
-        </w:rPr>
-        <w:br/>
-      </w:r>
-      <w:r>
-        <w:rPr>
-          <w:sz w:val="24"/>
-        </w:rPr>
-        <w:br/>
-      </w:r>
       <w:r>
         <w:rPr>
           <w:sz w:val="24"/>
@@ -9582,7 +9879,6 @@
         <w:rPr>
           <w:sz w:val="28"/>
         </w:rPr>
-        <w:lastRenderedPageBreak/>
         <w:t>&lt;label class="block font-label-caps text-</w:t>
       </w:r>
       <w:proofErr w:type="spellStart"/>

</xml_diff>